<commit_message>
recent lab changes: 2025-05-28 01:32:36
</commit_message>
<xml_diff>
--- a/Курс 2/Основы Data Science/Лабораторные/05. Изучение связей между переменными/Отчёт5.docx
+++ b/Курс 2/Основы Data Science/Лабораторные/05. Изучение связей между переменными/Отчёт5.docx
@@ -9,7 +9,7 @@
           <w:rFonts w:eastAsia="Times New Roman" w:cs="Times New Roman"/>
           <w:kern w:val="0"/>
           <w:sz w:val="24"/>
-          <w:lang w:val="ru-RU" w:eastAsia="ru-RU"/>
+          <w:lang w:eastAsia="ru-RU"/>
           <w14:ligatures w14:val="none"/>
         </w:rPr>
       </w:pPr>
@@ -1145,6 +1145,7 @@
       <w:pPr>
         <w:rPr>
           <w:rFonts w:eastAsiaTheme="minorEastAsia"/>
+          <w:lang w:val="ru-RU"/>
         </w:rPr>
       </w:pPr>
       <w:r>
@@ -1174,19 +1175,24 @@
         <w:t xml:space="preserve">рассчитывается следующим образом: значения выбранных переменных разбиваются на ранги по возрастанию. Одинаковые значения помещаются в среднее значения ранга. Затем </w:t>
       </w:r>
       <w:r>
-        <w:t>t</w:t>
-      </w:r>
-      <w:r>
-        <w:rPr>
-          <w:lang w:val="ru-RU"/>
-        </w:rPr>
-        <w:t>-</w:t>
-      </w:r>
-      <w:r>
-        <w:rPr>
-          <w:lang w:val="ru-RU"/>
-        </w:rPr>
-        <w:t xml:space="preserve">значение вычисляется по формуле </w:t>
+        <w:rPr>
+          <w:lang w:val="ru-RU"/>
+        </w:rPr>
+        <w:t xml:space="preserve">коэффициент </w:t>
+      </w:r>
+      <w:proofErr w:type="spellStart"/>
+      <w:r>
+        <w:rPr>
+          <w:lang w:val="ru-RU"/>
+        </w:rPr>
+        <w:t>Спирмена</w:t>
+      </w:r>
+      <w:proofErr w:type="spellEnd"/>
+      <w:r>
+        <w:rPr>
+          <w:lang w:val="ru-RU"/>
+        </w:rPr>
+        <w:t xml:space="preserve"> вычисляется по формуле </w:t>
       </w:r>
       <m:oMath>
         <m:sSub>
@@ -1223,14 +1229,7 @@
             <w:rFonts w:ascii="Cambria Math" w:hAnsi="Cambria Math"/>
             <w:lang w:val="ru-RU"/>
           </w:rPr>
-          <m:t>=</m:t>
-        </m:r>
-        <m:r>
-          <w:rPr>
-            <w:rFonts w:ascii="Cambria Math" w:hAnsi="Cambria Math"/>
-            <w:lang w:val="ru-RU"/>
-          </w:rPr>
-          <m:t>1-</m:t>
+          <m:t>=1-</m:t>
         </m:r>
         <m:f>
           <m:fPr>
@@ -1439,11 +1438,18 @@
           <w:rFonts w:eastAsiaTheme="minorEastAsia"/>
           <w:lang w:val="ru-RU"/>
         </w:rPr>
-        <w:t xml:space="preserve">- количество наблюдений. Статистическая значимость проверялась при помощи сравнения с </w:t>
+        <w:t xml:space="preserve">- количество наблюдений. Статистическая значимость проверялась при помощи </w:t>
       </w:r>
       <w:r>
         <w:rPr>
           <w:rFonts w:eastAsiaTheme="minorEastAsia"/>
+          <w:lang w:val="ru-RU"/>
+        </w:rPr>
+        <w:t xml:space="preserve">вычисления </w:t>
+      </w:r>
+      <w:r>
+        <w:rPr>
+          <w:rFonts w:eastAsiaTheme="minorEastAsia"/>
         </w:rPr>
         <w:t>t</w:t>
       </w:r>
@@ -1459,7 +1465,21 @@
           <w:rFonts w:eastAsiaTheme="minorEastAsia"/>
           <w:lang w:val="ru-RU"/>
         </w:rPr>
-        <w:t>критерием Стьюдента</w:t>
+        <w:t>критери</w:t>
+      </w:r>
+      <w:r>
+        <w:rPr>
+          <w:rFonts w:eastAsiaTheme="minorEastAsia"/>
+          <w:lang w:val="ru-RU"/>
+        </w:rPr>
+        <w:t>я</w:t>
+      </w:r>
+      <w:r>
+        <w:rPr>
+          <w:rFonts w:eastAsiaTheme="minorEastAsia"/>
+          <w:lang w:val="ru-RU"/>
+        </w:rPr>
+        <w:t xml:space="preserve"> Стьюдента</w:t>
       </w:r>
       <w:r>
         <w:rPr>
@@ -1474,14 +1494,7 @@
             <w:rFonts w:ascii="Cambria Math" w:eastAsiaTheme="minorEastAsia" w:hAnsi="Cambria Math"/>
             <w:lang w:val="ru-RU"/>
           </w:rPr>
-          <m:t>t</m:t>
-        </m:r>
-        <m:r>
-          <w:rPr>
-            <w:rFonts w:ascii="Cambria Math" w:eastAsiaTheme="minorEastAsia" w:hAnsi="Cambria Math"/>
-            <w:lang w:val="ru-RU"/>
-          </w:rPr>
-          <m:t>=</m:t>
+          <m:t>t=</m:t>
         </m:r>
         <m:f>
           <m:fPr>
@@ -1646,13 +1659,208 @@
         </w:rPr>
         <w:t>.</w:t>
       </w:r>
+      <w:r>
+        <w:rPr>
+          <w:rFonts w:eastAsiaTheme="minorEastAsia"/>
+          <w:lang w:val="ru-RU"/>
+        </w:rPr>
+        <w:t xml:space="preserve"> </w:t>
+      </w:r>
+      <w:r>
+        <w:rPr>
+          <w:rFonts w:eastAsiaTheme="minorEastAsia"/>
+        </w:rPr>
+        <w:t>t</w:t>
+      </w:r>
+      <w:r>
+        <w:rPr>
+          <w:rFonts w:eastAsiaTheme="minorEastAsia"/>
+          <w:lang w:val="ru-RU"/>
+        </w:rPr>
+        <w:t>-</w:t>
+      </w:r>
+      <w:r>
+        <w:rPr>
+          <w:rFonts w:eastAsiaTheme="minorEastAsia"/>
+          <w:lang w:val="ru-RU"/>
+        </w:rPr>
+        <w:t xml:space="preserve">коэффициент </w:t>
+      </w:r>
+      <w:proofErr w:type="gramStart"/>
+      <w:r>
+        <w:rPr>
+          <w:rFonts w:eastAsiaTheme="minorEastAsia"/>
+          <w:lang w:val="ru-RU"/>
+        </w:rPr>
+        <w:t>показывает</w:t>
+      </w:r>
+      <w:proofErr w:type="gramEnd"/>
+      <w:r>
+        <w:rPr>
+          <w:rFonts w:eastAsiaTheme="minorEastAsia"/>
+          <w:lang w:val="ru-RU"/>
+        </w:rPr>
+        <w:t xml:space="preserve"> насколько сильно наблюдаемая корреляция отличается от нулевой (отсутствия связи). </w:t>
+      </w:r>
+      <w:r>
+        <w:rPr>
+          <w:rFonts w:eastAsiaTheme="minorEastAsia"/>
+        </w:rPr>
+        <w:t>t</w:t>
+      </w:r>
+      <w:r>
+        <w:rPr>
+          <w:rFonts w:eastAsiaTheme="minorEastAsia"/>
+          <w:lang w:val="ru-RU"/>
+        </w:rPr>
+        <w:t>-</w:t>
+      </w:r>
+      <w:r>
+        <w:rPr>
+          <w:rFonts w:eastAsiaTheme="minorEastAsia"/>
+          <w:lang w:val="ru-RU"/>
+        </w:rPr>
+        <w:t xml:space="preserve">критерий сравнивается с </w:t>
+      </w:r>
+      <w:r>
+        <w:rPr>
+          <w:rFonts w:eastAsiaTheme="minorEastAsia"/>
+        </w:rPr>
+        <w:t>t</w:t>
+      </w:r>
+      <w:r>
+        <w:rPr>
+          <w:rFonts w:eastAsiaTheme="minorEastAsia"/>
+          <w:lang w:val="ru-RU"/>
+        </w:rPr>
+        <w:t>-</w:t>
+      </w:r>
+      <w:r>
+        <w:rPr>
+          <w:rFonts w:eastAsiaTheme="minorEastAsia"/>
+          <w:lang w:val="ru-RU"/>
+        </w:rPr>
+        <w:t xml:space="preserve">критическим двухсторонним, которое вычисляется по формуле </w:t>
+      </w:r>
+      <m:oMath>
+        <m:r>
+          <w:rPr>
+            <w:rFonts w:ascii="Cambria Math" w:eastAsiaTheme="minorEastAsia" w:hAnsi="Cambria Math"/>
+            <w:lang w:val="ru-RU"/>
+          </w:rPr>
+          <m:t>=СТЬЮДЕНТ.ОБР.2Х(0.05;</m:t>
+        </m:r>
+        <m:r>
+          <w:rPr>
+            <w:rFonts w:ascii="Cambria Math" w:eastAsiaTheme="minorEastAsia" w:hAnsi="Cambria Math"/>
+          </w:rPr>
+          <m:t>n</m:t>
+        </m:r>
+        <m:r>
+          <w:rPr>
+            <w:rFonts w:ascii="Cambria Math" w:eastAsiaTheme="minorEastAsia" w:hAnsi="Cambria Math"/>
+            <w:lang w:val="ru-RU"/>
+          </w:rPr>
+          <m:t>1+</m:t>
+        </m:r>
+        <m:r>
+          <w:rPr>
+            <w:rFonts w:ascii="Cambria Math" w:eastAsiaTheme="minorEastAsia" w:hAnsi="Cambria Math"/>
+          </w:rPr>
+          <m:t>n</m:t>
+        </m:r>
+        <m:r>
+          <w:rPr>
+            <w:rFonts w:ascii="Cambria Math" w:eastAsiaTheme="minorEastAsia" w:hAnsi="Cambria Math"/>
+            <w:lang w:val="ru-RU"/>
+          </w:rPr>
+          <m:t>2-2)</m:t>
+        </m:r>
+      </m:oMath>
+      <w:r>
+        <w:rPr>
+          <w:rFonts w:eastAsiaTheme="minorEastAsia"/>
+          <w:lang w:val="ru-RU"/>
+        </w:rPr>
+        <w:t xml:space="preserve">, где </w:t>
+      </w:r>
+      <w:r>
+        <w:rPr>
+          <w:rFonts w:eastAsiaTheme="minorEastAsia"/>
+          <w:lang w:val="ru-RU"/>
+        </w:rPr>
+        <w:t xml:space="preserve">0.05 </w:t>
+      </w:r>
+      <w:r>
+        <w:rPr>
+          <w:rFonts w:eastAsiaTheme="minorEastAsia"/>
+          <w:lang w:val="ru-RU"/>
+        </w:rPr>
+        <w:t>–</w:t>
+      </w:r>
+      <w:r>
+        <w:rPr>
+          <w:rFonts w:eastAsiaTheme="minorEastAsia"/>
+          <w:lang w:val="ru-RU"/>
+        </w:rPr>
+        <w:t xml:space="preserve"> </w:t>
+      </w:r>
+      <w:r>
+        <w:rPr>
+          <w:rFonts w:eastAsiaTheme="minorEastAsia"/>
+          <w:lang w:val="ru-RU"/>
+        </w:rPr>
+        <w:t xml:space="preserve">выбранная степень значимости, </w:t>
+      </w:r>
+      <m:oMath>
+        <m:r>
+          <w:rPr>
+            <w:rFonts w:ascii="Cambria Math" w:eastAsiaTheme="minorEastAsia" w:hAnsi="Cambria Math"/>
+          </w:rPr>
+          <m:t>n</m:t>
+        </m:r>
+        <m:r>
+          <w:rPr>
+            <w:rFonts w:ascii="Cambria Math" w:eastAsiaTheme="minorEastAsia" w:hAnsi="Cambria Math"/>
+            <w:lang w:val="ru-RU"/>
+          </w:rPr>
+          <m:t>1+</m:t>
+        </m:r>
+        <m:r>
+          <w:rPr>
+            <w:rFonts w:ascii="Cambria Math" w:eastAsiaTheme="minorEastAsia" w:hAnsi="Cambria Math"/>
+          </w:rPr>
+          <m:t>n</m:t>
+        </m:r>
+        <m:r>
+          <w:rPr>
+            <w:rFonts w:ascii="Cambria Math" w:eastAsiaTheme="minorEastAsia" w:hAnsi="Cambria Math"/>
+            <w:lang w:val="ru-RU"/>
+          </w:rPr>
+          <m:t>2-2</m:t>
+        </m:r>
+      </m:oMath>
+      <w:r>
+        <w:rPr>
+          <w:rFonts w:eastAsiaTheme="minorEastAsia"/>
+          <w:lang w:val="ru-RU"/>
+        </w:rPr>
+        <w:t xml:space="preserve"> – степень свободы в двух выборках.</w:t>
+      </w:r>
+      <w:r>
+        <w:rPr>
+          <w:rFonts w:eastAsiaTheme="minorEastAsia"/>
+          <w:lang w:val="ru-RU"/>
+        </w:rPr>
+        <w:t xml:space="preserve"> </w:t>
+      </w:r>
     </w:p>
     <w:p>
       <w:pPr>
         <w:pStyle w:val="a7"/>
         <w:numPr>
           <w:ilvl w:val="0"/>
-          <w:numId w:val="20"/>
+          <w:numId w:val="22"/>
         </w:numPr>
         <w:rPr>
           <w:lang w:val="ru-RU"/>
@@ -1747,12 +1955,224 @@
         <w:pStyle w:val="a7"/>
         <w:numPr>
           <w:ilvl w:val="0"/>
-          <w:numId w:val="20"/>
+          <w:numId w:val="22"/>
         </w:numPr>
         <w:rPr>
           <w:lang w:val="ru-RU"/>
         </w:rPr>
       </w:pPr>
+      <w:r>
+        <w:rPr>
+          <w:lang w:val="ru-RU"/>
+        </w:rPr>
+        <w:t xml:space="preserve">Для проведения расчёта рангового коэффициента </w:t>
+      </w:r>
+      <w:proofErr w:type="spellStart"/>
+      <w:r>
+        <w:rPr>
+          <w:lang w:val="ru-RU"/>
+        </w:rPr>
+        <w:t>Спирмена</w:t>
+      </w:r>
+      <w:proofErr w:type="spellEnd"/>
+      <w:r>
+        <w:rPr>
+          <w:lang w:val="ru-RU"/>
+        </w:rPr>
+        <w:t xml:space="preserve"> была выбран поиск связи между игровым стажем и часов игры в день. Значения переменных были ранжированы, после чего был получен коэффициент </w:t>
+      </w:r>
+      <m:oMath>
+        <m:r>
+          <w:rPr>
+            <w:rFonts w:ascii="Cambria Math" w:hAnsi="Cambria Math"/>
+          </w:rPr>
+          <m:t>r</m:t>
+        </m:r>
+        <m:r>
+          <w:rPr>
+            <w:rFonts w:ascii="Cambria Math" w:hAnsi="Cambria Math"/>
+            <w:lang w:val="ru-RU"/>
+          </w:rPr>
+          <m:t xml:space="preserve"> = 0.988807885</m:t>
+        </m:r>
+      </m:oMath>
+      <w:r>
+        <w:rPr>
+          <w:lang w:val="ru-RU"/>
+        </w:rPr>
+        <w:t xml:space="preserve">. Если коэффициент приближается к единице, это говорит о наличии сильной линейной связи. Для доказательства этого, вычислен </w:t>
+      </w:r>
+      <w:r>
+        <w:t>t</w:t>
+      </w:r>
+      <w:r>
+        <w:rPr>
+          <w:lang w:val="ru-RU"/>
+        </w:rPr>
+        <w:t xml:space="preserve">-критерий, значение которого получилось </w:t>
+      </w:r>
+      <m:oMath>
+        <m:r>
+          <w:rPr>
+            <w:rFonts w:ascii="Cambria Math" w:hAnsi="Cambria Math"/>
+          </w:rPr>
+          <m:t>t</m:t>
+        </m:r>
+        <m:r>
+          <w:rPr>
+            <w:rFonts w:ascii="Cambria Math" w:hAnsi="Cambria Math"/>
+            <w:lang w:val="ru-RU"/>
+          </w:rPr>
+          <m:t xml:space="preserve"> = 183.670768</m:t>
+        </m:r>
+      </m:oMath>
+      <w:r>
+        <w:rPr>
+          <w:rFonts w:eastAsiaTheme="minorEastAsia"/>
+          <w:lang w:val="ru-RU"/>
+        </w:rPr>
+        <w:t xml:space="preserve">. Значение </w:t>
+      </w:r>
+      <w:r>
+        <w:rPr>
+          <w:rFonts w:eastAsiaTheme="minorEastAsia"/>
+        </w:rPr>
+        <w:t>t</w:t>
+      </w:r>
+      <w:r>
+        <w:rPr>
+          <w:rFonts w:eastAsiaTheme="minorEastAsia"/>
+          <w:lang w:val="ru-RU"/>
+        </w:rPr>
+        <w:t>-критическое для выборки</w:t>
+      </w:r>
+      <w:r>
+        <w:rPr>
+          <w:rFonts w:eastAsiaTheme="minorEastAsia"/>
+          <w:lang w:val="ru-RU"/>
+        </w:rPr>
+        <w:t xml:space="preserve">: </w:t>
+      </w:r>
+      <m:oMath>
+        <m:sSub>
+          <m:sSubPr>
+            <m:ctrlPr>
+              <w:rPr>
+                <w:rFonts w:ascii="Cambria Math" w:eastAsiaTheme="minorEastAsia" w:hAnsi="Cambria Math"/>
+                <w:i/>
+              </w:rPr>
+            </m:ctrlPr>
+          </m:sSubPr>
+          <m:e>
+            <m:r>
+              <w:rPr>
+                <w:rFonts w:ascii="Cambria Math" w:eastAsiaTheme="minorEastAsia" w:hAnsi="Cambria Math"/>
+              </w:rPr>
+              <m:t>t</m:t>
+            </m:r>
+          </m:e>
+          <m:sub>
+            <m:r>
+              <w:rPr>
+                <w:rFonts w:ascii="Cambria Math" w:eastAsiaTheme="minorEastAsia" w:hAnsi="Cambria Math"/>
+                <w:lang w:val="ru-RU"/>
+              </w:rPr>
+              <m:t>к</m:t>
+            </m:r>
+          </m:sub>
+        </m:sSub>
+        <m:r>
+          <w:rPr>
+            <w:rFonts w:ascii="Cambria Math" w:eastAsiaTheme="minorEastAsia" w:hAnsi="Cambria Math"/>
+            <w:lang w:val="ru-RU"/>
+          </w:rPr>
+          <m:t>=</m:t>
+        </m:r>
+        <m:r>
+          <w:rPr>
+            <w:rFonts w:ascii="Cambria Math" w:eastAsiaTheme="minorEastAsia" w:hAnsi="Cambria Math"/>
+            <w:lang w:val="ru-RU"/>
+          </w:rPr>
+          <m:t>1.96151</m:t>
+        </m:r>
+      </m:oMath>
+      <w:r>
+        <w:rPr>
+          <w:rFonts w:eastAsiaTheme="minorEastAsia"/>
+          <w:lang w:val="ru-RU"/>
+        </w:rPr>
+        <w:t xml:space="preserve">. </w:t>
+      </w:r>
+      <m:oMath>
+        <m:r>
+          <w:rPr>
+            <w:rFonts w:ascii="Cambria Math" w:eastAsiaTheme="minorEastAsia" w:hAnsi="Cambria Math"/>
+            <w:lang w:val="ru-RU"/>
+          </w:rPr>
+          <m:t>|</m:t>
+        </m:r>
+        <m:r>
+          <w:rPr>
+            <w:rFonts w:ascii="Cambria Math" w:eastAsiaTheme="minorEastAsia" w:hAnsi="Cambria Math"/>
+          </w:rPr>
+          <m:t>t</m:t>
+        </m:r>
+        <m:r>
+          <w:rPr>
+            <w:rFonts w:ascii="Cambria Math" w:eastAsiaTheme="minorEastAsia" w:hAnsi="Cambria Math"/>
+            <w:lang w:val="ru-RU"/>
+          </w:rPr>
+          <m:t>| &gt; |</m:t>
+        </m:r>
+        <m:sSub>
+          <m:sSubPr>
+            <m:ctrlPr>
+              <w:rPr>
+                <w:rFonts w:ascii="Cambria Math" w:eastAsiaTheme="minorEastAsia" w:hAnsi="Cambria Math"/>
+                <w:i/>
+              </w:rPr>
+            </m:ctrlPr>
+          </m:sSubPr>
+          <m:e>
+            <m:r>
+              <w:rPr>
+                <w:rFonts w:ascii="Cambria Math" w:eastAsiaTheme="minorEastAsia" w:hAnsi="Cambria Math"/>
+              </w:rPr>
+              <m:t>t</m:t>
+            </m:r>
+          </m:e>
+          <m:sub>
+            <m:r>
+              <w:rPr>
+                <w:rFonts w:ascii="Cambria Math" w:eastAsiaTheme="minorEastAsia" w:hAnsi="Cambria Math"/>
+                <w:lang w:val="ru-RU"/>
+              </w:rPr>
+              <m:t>к</m:t>
+            </m:r>
+          </m:sub>
+        </m:sSub>
+        <m:r>
+          <w:rPr>
+            <w:rFonts w:ascii="Cambria Math" w:eastAsiaTheme="minorEastAsia" w:hAnsi="Cambria Math"/>
+            <w:lang w:val="ru-RU"/>
+          </w:rPr>
+          <m:t>|</m:t>
+        </m:r>
+      </m:oMath>
+      <w:r>
+        <w:rPr>
+          <w:rFonts w:eastAsiaTheme="minorEastAsia"/>
+          <w:lang w:val="ru-RU"/>
+        </w:rPr>
+        <w:t>, что показывает сильную статистическую значимость.</w:t>
+      </w:r>
+      <w:r>
+        <w:rPr>
+          <w:rFonts w:eastAsiaTheme="minorEastAsia"/>
+          <w:lang w:val="ru-RU"/>
+        </w:rPr>
+        <w:t xml:space="preserve"> </w:t>
+      </w:r>
     </w:p>
     <w:p>
       <w:pPr>
@@ -1765,15 +2185,195 @@
         <w:rPr>
           <w:lang w:val="ru-RU"/>
         </w:rPr>
+        <w:lastRenderedPageBreak/>
         <w:t>Выводы:</w:t>
       </w:r>
     </w:p>
     <w:p>
       <w:pPr>
-        <w:rPr>
-          <w:lang w:val="ru-RU"/>
-        </w:rPr>
-      </w:pPr>
+        <w:pStyle w:val="a7"/>
+        <w:numPr>
+          <w:ilvl w:val="0"/>
+          <w:numId w:val="23"/>
+        </w:numPr>
+        <w:rPr>
+          <w:lang w:val="ru-RU"/>
+        </w:rPr>
+      </w:pPr>
+      <w:r>
+        <w:rPr>
+          <w:lang w:val="ru-RU"/>
+        </w:rPr>
+        <w:t xml:space="preserve">Между </w:t>
+      </w:r>
+      <w:r>
+        <w:rPr>
+          <w:lang w:val="ru-RU"/>
+        </w:rPr>
+        <w:t xml:space="preserve">часами игры и баллом учеников слабая и статистически незначительная линейная </w:t>
+      </w:r>
+      <w:proofErr w:type="spellStart"/>
+      <w:r>
+        <w:rPr>
+          <w:lang w:val="ru-RU"/>
+        </w:rPr>
+        <w:t>взяимосвязь</w:t>
+      </w:r>
+      <w:proofErr w:type="spellEnd"/>
+      <w:r>
+        <w:rPr>
+          <w:lang w:val="ru-RU"/>
+        </w:rPr>
+        <w:t>.</w:t>
+      </w:r>
+    </w:p>
+    <w:p>
+      <w:pPr>
+        <w:pStyle w:val="a7"/>
+        <w:numPr>
+          <w:ilvl w:val="0"/>
+          <w:numId w:val="23"/>
+        </w:numPr>
+        <w:rPr>
+          <w:lang w:val="ru-RU"/>
+        </w:rPr>
+      </w:pPr>
+      <w:r>
+        <w:rPr>
+          <w:lang w:val="ru-RU"/>
+        </w:rPr>
+        <w:t>Между игровым стажем и временем игры в день имеется сильная и статистически значимая линейная взаимосвязь.</w:t>
+      </w:r>
+    </w:p>
+    <w:p>
+      <w:pPr>
+        <w:ind w:firstLine="0"/>
+        <w:rPr>
+          <w:lang w:val="ru-RU"/>
+        </w:rPr>
+      </w:pPr>
+    </w:p>
+    <w:p>
+      <w:pPr>
+        <w:pStyle w:val="a7"/>
+        <w:numPr>
+          <w:ilvl w:val="0"/>
+          <w:numId w:val="23"/>
+        </w:numPr>
+        <w:rPr>
+          <w:lang w:val="ru-RU"/>
+        </w:rPr>
+      </w:pPr>
+      <w:r>
+        <w:rPr>
+          <w:lang w:val="ru-RU"/>
+        </w:rPr>
+        <w:t>Инструменты для вычисления:</w:t>
+      </w:r>
+    </w:p>
+    <w:p>
+      <w:pPr>
+        <w:pStyle w:val="a7"/>
+        <w:numPr>
+          <w:ilvl w:val="0"/>
+          <w:numId w:val="24"/>
+        </w:numPr>
+        <w:rPr>
+          <w:lang w:val="ru-RU"/>
+        </w:rPr>
+      </w:pPr>
+      <w:r>
+        <w:rPr>
+          <w:lang w:val="ru-RU"/>
+        </w:rPr>
+        <w:t xml:space="preserve">Нелинейные между количественными – коэффициент </w:t>
+      </w:r>
+      <w:proofErr w:type="spellStart"/>
+      <w:r>
+        <w:rPr>
+          <w:lang w:val="ru-RU"/>
+        </w:rPr>
+        <w:t>Спирмена</w:t>
+      </w:r>
+      <w:proofErr w:type="spellEnd"/>
+      <w:r>
+        <w:rPr>
+          <w:lang w:val="ru-RU"/>
+        </w:rPr>
+        <w:t>, ящик с усами, криволинейная регрессия</w:t>
+      </w:r>
+      <w:r>
+        <w:rPr>
+          <w:lang w:val="ru-RU"/>
+        </w:rPr>
+        <w:t>;</w:t>
+      </w:r>
+    </w:p>
+    <w:p>
+      <w:pPr>
+        <w:pStyle w:val="a7"/>
+        <w:numPr>
+          <w:ilvl w:val="0"/>
+          <w:numId w:val="24"/>
+        </w:numPr>
+        <w:rPr>
+          <w:lang w:val="ru-RU"/>
+        </w:rPr>
+      </w:pPr>
+      <w:r>
+        <w:rPr>
+          <w:lang w:val="ru-RU"/>
+        </w:rPr>
+        <w:t>Зависимости между качественными – хи-квадрат</w:t>
+      </w:r>
+      <w:r>
+        <w:rPr>
+          <w:lang w:val="ru-RU"/>
+        </w:rPr>
+        <w:t>;</w:t>
+      </w:r>
+    </w:p>
+    <w:p>
+      <w:pPr>
+        <w:pStyle w:val="a7"/>
+        <w:numPr>
+          <w:ilvl w:val="0"/>
+          <w:numId w:val="24"/>
+        </w:numPr>
+        <w:rPr>
+          <w:lang w:val="ru-RU"/>
+        </w:rPr>
+      </w:pPr>
+      <w:r>
+        <w:rPr>
+          <w:lang w:val="ru-RU"/>
+        </w:rPr>
+        <w:t xml:space="preserve">Зависимости между качественными и количественными – </w:t>
+      </w:r>
+      <w:r>
+        <w:rPr>
+          <w:lang w:val="ru-RU"/>
+        </w:rPr>
+        <w:t>дисперсионный</w:t>
+      </w:r>
+      <w:r>
+        <w:rPr>
+          <w:lang w:val="ru-RU"/>
+        </w:rPr>
+        <w:t xml:space="preserve"> </w:t>
+      </w:r>
+      <w:r>
+        <w:rPr>
+          <w:lang w:val="ru-RU"/>
+        </w:rPr>
+        <w:t>анализ</w:t>
+      </w:r>
+      <w:r>
+        <w:rPr>
+          <w:lang w:val="ru-RU"/>
+        </w:rPr>
+        <w:t>, ящик с усами.</w:t>
+      </w:r>
     </w:p>
     <w:sectPr>
       <w:headerReference w:type="even" r:id="rId8"/>
@@ -2782,6 +3382,291 @@
     </w:lvl>
   </w:abstractNum>
   <w:abstractNum w:abstractNumId="7" w15:restartNumberingAfterBreak="0">
+    <w:nsid w:val="19EC1FFD"/>
+    <w:multiLevelType w:val="hybridMultilevel"/>
+    <w:tmpl w:val="EC74E576"/>
+    <w:lvl w:ilvl="0" w:tplc="0419000F">
+      <w:start w:val="1"/>
+      <w:numFmt w:val="decimal"/>
+      <w:lvlText w:val="%1."/>
+      <w:lvlJc w:val="left"/>
+      <w:pPr>
+        <w:ind w:left="1145" w:hanging="360"/>
+      </w:pPr>
+    </w:lvl>
+    <w:lvl w:ilvl="1" w:tplc="04190019" w:tentative="1">
+      <w:start w:val="1"/>
+      <w:numFmt w:val="lowerLetter"/>
+      <w:lvlText w:val="%2."/>
+      <w:lvlJc w:val="left"/>
+      <w:pPr>
+        <w:ind w:left="1865" w:hanging="360"/>
+      </w:pPr>
+    </w:lvl>
+    <w:lvl w:ilvl="2" w:tplc="0419001B" w:tentative="1">
+      <w:start w:val="1"/>
+      <w:numFmt w:val="lowerRoman"/>
+      <w:lvlText w:val="%3."/>
+      <w:lvlJc w:val="right"/>
+      <w:pPr>
+        <w:ind w:left="2585" w:hanging="180"/>
+      </w:pPr>
+    </w:lvl>
+    <w:lvl w:ilvl="3" w:tplc="0419000F" w:tentative="1">
+      <w:start w:val="1"/>
+      <w:numFmt w:val="decimal"/>
+      <w:lvlText w:val="%4."/>
+      <w:lvlJc w:val="left"/>
+      <w:pPr>
+        <w:ind w:left="3305" w:hanging="360"/>
+      </w:pPr>
+    </w:lvl>
+    <w:lvl w:ilvl="4" w:tplc="04190019" w:tentative="1">
+      <w:start w:val="1"/>
+      <w:numFmt w:val="lowerLetter"/>
+      <w:lvlText w:val="%5."/>
+      <w:lvlJc w:val="left"/>
+      <w:pPr>
+        <w:ind w:left="4025" w:hanging="360"/>
+      </w:pPr>
+    </w:lvl>
+    <w:lvl w:ilvl="5" w:tplc="0419001B" w:tentative="1">
+      <w:start w:val="1"/>
+      <w:numFmt w:val="lowerRoman"/>
+      <w:lvlText w:val="%6."/>
+      <w:lvlJc w:val="right"/>
+      <w:pPr>
+        <w:ind w:left="4745" w:hanging="180"/>
+      </w:pPr>
+    </w:lvl>
+    <w:lvl w:ilvl="6" w:tplc="0419000F" w:tentative="1">
+      <w:start w:val="1"/>
+      <w:numFmt w:val="decimal"/>
+      <w:lvlText w:val="%7."/>
+      <w:lvlJc w:val="left"/>
+      <w:pPr>
+        <w:ind w:left="5465" w:hanging="360"/>
+      </w:pPr>
+    </w:lvl>
+    <w:lvl w:ilvl="7" w:tplc="04190019" w:tentative="1">
+      <w:start w:val="1"/>
+      <w:numFmt w:val="lowerLetter"/>
+      <w:lvlText w:val="%8."/>
+      <w:lvlJc w:val="left"/>
+      <w:pPr>
+        <w:ind w:left="6185" w:hanging="360"/>
+      </w:pPr>
+    </w:lvl>
+    <w:lvl w:ilvl="8" w:tplc="0419001B" w:tentative="1">
+      <w:start w:val="1"/>
+      <w:numFmt w:val="lowerRoman"/>
+      <w:lvlText w:val="%9."/>
+      <w:lvlJc w:val="right"/>
+      <w:pPr>
+        <w:ind w:left="6905" w:hanging="180"/>
+      </w:pPr>
+    </w:lvl>
+  </w:abstractNum>
+  <w:abstractNum w:abstractNumId="8" w15:restartNumberingAfterBreak="0">
+    <w:nsid w:val="2C9802D8"/>
+    <w:multiLevelType w:val="hybridMultilevel"/>
+    <w:tmpl w:val="96280E86"/>
+    <w:lvl w:ilvl="0" w:tplc="0419000F">
+      <w:start w:val="1"/>
+      <w:numFmt w:val="decimal"/>
+      <w:lvlText w:val="%1."/>
+      <w:lvlJc w:val="left"/>
+      <w:pPr>
+        <w:ind w:left="720" w:hanging="360"/>
+      </w:pPr>
+    </w:lvl>
+    <w:lvl w:ilvl="1" w:tplc="04190019" w:tentative="1">
+      <w:start w:val="1"/>
+      <w:numFmt w:val="lowerLetter"/>
+      <w:lvlText w:val="%2."/>
+      <w:lvlJc w:val="left"/>
+      <w:pPr>
+        <w:ind w:left="1440" w:hanging="360"/>
+      </w:pPr>
+    </w:lvl>
+    <w:lvl w:ilvl="2" w:tplc="0419001B" w:tentative="1">
+      <w:start w:val="1"/>
+      <w:numFmt w:val="lowerRoman"/>
+      <w:lvlText w:val="%3."/>
+      <w:lvlJc w:val="right"/>
+      <w:pPr>
+        <w:ind w:left="2160" w:hanging="180"/>
+      </w:pPr>
+    </w:lvl>
+    <w:lvl w:ilvl="3" w:tplc="0419000F" w:tentative="1">
+      <w:start w:val="1"/>
+      <w:numFmt w:val="decimal"/>
+      <w:lvlText w:val="%4."/>
+      <w:lvlJc w:val="left"/>
+      <w:pPr>
+        <w:ind w:left="2880" w:hanging="360"/>
+      </w:pPr>
+    </w:lvl>
+    <w:lvl w:ilvl="4" w:tplc="04190019" w:tentative="1">
+      <w:start w:val="1"/>
+      <w:numFmt w:val="lowerLetter"/>
+      <w:lvlText w:val="%5."/>
+      <w:lvlJc w:val="left"/>
+      <w:pPr>
+        <w:ind w:left="3600" w:hanging="360"/>
+      </w:pPr>
+    </w:lvl>
+    <w:lvl w:ilvl="5" w:tplc="0419001B" w:tentative="1">
+      <w:start w:val="1"/>
+      <w:numFmt w:val="lowerRoman"/>
+      <w:lvlText w:val="%6."/>
+      <w:lvlJc w:val="right"/>
+      <w:pPr>
+        <w:ind w:left="4320" w:hanging="180"/>
+      </w:pPr>
+    </w:lvl>
+    <w:lvl w:ilvl="6" w:tplc="0419000F" w:tentative="1">
+      <w:start w:val="1"/>
+      <w:numFmt w:val="decimal"/>
+      <w:lvlText w:val="%7."/>
+      <w:lvlJc w:val="left"/>
+      <w:pPr>
+        <w:ind w:left="5040" w:hanging="360"/>
+      </w:pPr>
+    </w:lvl>
+    <w:lvl w:ilvl="7" w:tplc="04190019" w:tentative="1">
+      <w:start w:val="1"/>
+      <w:numFmt w:val="lowerLetter"/>
+      <w:lvlText w:val="%8."/>
+      <w:lvlJc w:val="left"/>
+      <w:pPr>
+        <w:ind w:left="5760" w:hanging="360"/>
+      </w:pPr>
+    </w:lvl>
+    <w:lvl w:ilvl="8" w:tplc="0419001B" w:tentative="1">
+      <w:start w:val="1"/>
+      <w:numFmt w:val="lowerRoman"/>
+      <w:lvlText w:val="%9."/>
+      <w:lvlJc w:val="right"/>
+      <w:pPr>
+        <w:ind w:left="6480" w:hanging="180"/>
+      </w:pPr>
+    </w:lvl>
+  </w:abstractNum>
+  <w:abstractNum w:abstractNumId="9" w15:restartNumberingAfterBreak="0">
+    <w:nsid w:val="30D93CB6"/>
+    <w:multiLevelType w:val="hybridMultilevel"/>
+    <w:tmpl w:val="9650FD36"/>
+    <w:lvl w:ilvl="0" w:tplc="04190001">
+      <w:start w:val="1"/>
+      <w:numFmt w:val="bullet"/>
+      <w:lvlText w:val=""/>
+      <w:lvlJc w:val="left"/>
+      <w:pPr>
+        <w:ind w:left="1505" w:hanging="360"/>
+      </w:pPr>
+      <w:rPr>
+        <w:rFonts w:ascii="Symbol" w:hAnsi="Symbol" w:hint="default"/>
+      </w:rPr>
+    </w:lvl>
+    <w:lvl w:ilvl="1" w:tplc="04190003" w:tentative="1">
+      <w:start w:val="1"/>
+      <w:numFmt w:val="bullet"/>
+      <w:lvlText w:val="o"/>
+      <w:lvlJc w:val="left"/>
+      <w:pPr>
+        <w:ind w:left="2225" w:hanging="360"/>
+      </w:pPr>
+      <w:rPr>
+        <w:rFonts w:ascii="Courier New" w:hAnsi="Courier New" w:cs="Courier New" w:hint="default"/>
+      </w:rPr>
+    </w:lvl>
+    <w:lvl w:ilvl="2" w:tplc="04190005" w:tentative="1">
+      <w:start w:val="1"/>
+      <w:numFmt w:val="bullet"/>
+      <w:lvlText w:val=""/>
+      <w:lvlJc w:val="left"/>
+      <w:pPr>
+        <w:ind w:left="2945" w:hanging="360"/>
+      </w:pPr>
+      <w:rPr>
+        <w:rFonts w:ascii="Wingdings" w:hAnsi="Wingdings" w:hint="default"/>
+      </w:rPr>
+    </w:lvl>
+    <w:lvl w:ilvl="3" w:tplc="04190001" w:tentative="1">
+      <w:start w:val="1"/>
+      <w:numFmt w:val="bullet"/>
+      <w:lvlText w:val=""/>
+      <w:lvlJc w:val="left"/>
+      <w:pPr>
+        <w:ind w:left="3665" w:hanging="360"/>
+      </w:pPr>
+      <w:rPr>
+        <w:rFonts w:ascii="Symbol" w:hAnsi="Symbol" w:hint="default"/>
+      </w:rPr>
+    </w:lvl>
+    <w:lvl w:ilvl="4" w:tplc="04190003" w:tentative="1">
+      <w:start w:val="1"/>
+      <w:numFmt w:val="bullet"/>
+      <w:lvlText w:val="o"/>
+      <w:lvlJc w:val="left"/>
+      <w:pPr>
+        <w:ind w:left="4385" w:hanging="360"/>
+      </w:pPr>
+      <w:rPr>
+        <w:rFonts w:ascii="Courier New" w:hAnsi="Courier New" w:cs="Courier New" w:hint="default"/>
+      </w:rPr>
+    </w:lvl>
+    <w:lvl w:ilvl="5" w:tplc="04190005" w:tentative="1">
+      <w:start w:val="1"/>
+      <w:numFmt w:val="bullet"/>
+      <w:lvlText w:val=""/>
+      <w:lvlJc w:val="left"/>
+      <w:pPr>
+        <w:ind w:left="5105" w:hanging="360"/>
+      </w:pPr>
+      <w:rPr>
+        <w:rFonts w:ascii="Wingdings" w:hAnsi="Wingdings" w:hint="default"/>
+      </w:rPr>
+    </w:lvl>
+    <w:lvl w:ilvl="6" w:tplc="04190001" w:tentative="1">
+      <w:start w:val="1"/>
+      <w:numFmt w:val="bullet"/>
+      <w:lvlText w:val=""/>
+      <w:lvlJc w:val="left"/>
+      <w:pPr>
+        <w:ind w:left="5825" w:hanging="360"/>
+      </w:pPr>
+      <w:rPr>
+        <w:rFonts w:ascii="Symbol" w:hAnsi="Symbol" w:hint="default"/>
+      </w:rPr>
+    </w:lvl>
+    <w:lvl w:ilvl="7" w:tplc="04190003" w:tentative="1">
+      <w:start w:val="1"/>
+      <w:numFmt w:val="bullet"/>
+      <w:lvlText w:val="o"/>
+      <w:lvlJc w:val="left"/>
+      <w:pPr>
+        <w:ind w:left="6545" w:hanging="360"/>
+      </w:pPr>
+      <w:rPr>
+        <w:rFonts w:ascii="Courier New" w:hAnsi="Courier New" w:cs="Courier New" w:hint="default"/>
+      </w:rPr>
+    </w:lvl>
+    <w:lvl w:ilvl="8" w:tplc="04190005" w:tentative="1">
+      <w:start w:val="1"/>
+      <w:numFmt w:val="bullet"/>
+      <w:lvlText w:val=""/>
+      <w:lvlJc w:val="left"/>
+      <w:pPr>
+        <w:ind w:left="7265" w:hanging="360"/>
+      </w:pPr>
+      <w:rPr>
+        <w:rFonts w:ascii="Wingdings" w:hAnsi="Wingdings" w:hint="default"/>
+      </w:rPr>
+    </w:lvl>
+  </w:abstractNum>
+  <w:abstractNum w:abstractNumId="10" w15:restartNumberingAfterBreak="0">
     <w:nsid w:val="33BB5BC5"/>
     <w:multiLevelType w:val="hybridMultilevel"/>
     <w:tmpl w:val="AF142BDA"/>
@@ -2894,7 +3779,7 @@
       </w:rPr>
     </w:lvl>
   </w:abstractNum>
-  <w:abstractNum w:abstractNumId="8" w15:restartNumberingAfterBreak="0">
+  <w:abstractNum w:abstractNumId="11" w15:restartNumberingAfterBreak="0">
     <w:nsid w:val="365F0BD8"/>
     <w:multiLevelType w:val="hybridMultilevel"/>
     <w:tmpl w:val="3EFEDF4E"/>
@@ -2980,7 +3865,7 @@
       </w:pPr>
     </w:lvl>
   </w:abstractNum>
-  <w:abstractNum w:abstractNumId="9" w15:restartNumberingAfterBreak="0">
+  <w:abstractNum w:abstractNumId="12" w15:restartNumberingAfterBreak="0">
     <w:nsid w:val="495A4B55"/>
     <w:multiLevelType w:val="hybridMultilevel"/>
     <w:tmpl w:val="5D3C45EE"/>
@@ -3066,7 +3951,7 @@
       </w:pPr>
     </w:lvl>
   </w:abstractNum>
-  <w:abstractNum w:abstractNumId="10" w15:restartNumberingAfterBreak="0">
+  <w:abstractNum w:abstractNumId="13" w15:restartNumberingAfterBreak="0">
     <w:nsid w:val="4A5E3F41"/>
     <w:multiLevelType w:val="hybridMultilevel"/>
     <w:tmpl w:val="E6362F96"/>
@@ -3152,7 +4037,7 @@
       </w:pPr>
     </w:lvl>
   </w:abstractNum>
-  <w:abstractNum w:abstractNumId="11" w15:restartNumberingAfterBreak="0">
+  <w:abstractNum w:abstractNumId="14" w15:restartNumberingAfterBreak="0">
     <w:nsid w:val="602711F1"/>
     <w:multiLevelType w:val="hybridMultilevel"/>
     <w:tmpl w:val="419C824C"/>
@@ -3265,7 +4150,7 @@
       </w:rPr>
     </w:lvl>
   </w:abstractNum>
-  <w:abstractNum w:abstractNumId="12" w15:restartNumberingAfterBreak="0">
+  <w:abstractNum w:abstractNumId="15" w15:restartNumberingAfterBreak="0">
     <w:nsid w:val="6762654E"/>
     <w:multiLevelType w:val="hybridMultilevel"/>
     <w:tmpl w:val="793EC6A2"/>
@@ -3351,7 +4236,7 @@
       </w:pPr>
     </w:lvl>
   </w:abstractNum>
-  <w:abstractNum w:abstractNumId="13" w15:restartNumberingAfterBreak="0">
+  <w:abstractNum w:abstractNumId="16" w15:restartNumberingAfterBreak="0">
     <w:nsid w:val="676B44D3"/>
     <w:multiLevelType w:val="hybridMultilevel"/>
     <w:tmpl w:val="2B0A6368"/>
@@ -3437,7 +4322,96 @@
       </w:pPr>
     </w:lvl>
   </w:abstractNum>
-  <w:abstractNum w:abstractNumId="14" w15:restartNumberingAfterBreak="0">
+  <w:abstractNum w:abstractNumId="17" w15:restartNumberingAfterBreak="0">
+    <w:nsid w:val="69163EDA"/>
+    <w:multiLevelType w:val="hybridMultilevel"/>
+    <w:tmpl w:val="4A88CE88"/>
+    <w:lvl w:ilvl="0" w:tplc="F6DACF50">
+      <w:start w:val="1"/>
+      <w:numFmt w:val="decimal"/>
+      <w:lvlText w:val="%1."/>
+      <w:lvlJc w:val="left"/>
+      <w:pPr>
+        <w:ind w:left="785" w:hanging="360"/>
+      </w:pPr>
+      <w:rPr>
+        <w:rFonts w:hint="default"/>
+      </w:rPr>
+    </w:lvl>
+    <w:lvl w:ilvl="1" w:tplc="04190019" w:tentative="1">
+      <w:start w:val="1"/>
+      <w:numFmt w:val="lowerLetter"/>
+      <w:lvlText w:val="%2."/>
+      <w:lvlJc w:val="left"/>
+      <w:pPr>
+        <w:ind w:left="1505" w:hanging="360"/>
+      </w:pPr>
+    </w:lvl>
+    <w:lvl w:ilvl="2" w:tplc="0419001B" w:tentative="1">
+      <w:start w:val="1"/>
+      <w:numFmt w:val="lowerRoman"/>
+      <w:lvlText w:val="%3."/>
+      <w:lvlJc w:val="right"/>
+      <w:pPr>
+        <w:ind w:left="2225" w:hanging="180"/>
+      </w:pPr>
+    </w:lvl>
+    <w:lvl w:ilvl="3" w:tplc="0419000F" w:tentative="1">
+      <w:start w:val="1"/>
+      <w:numFmt w:val="decimal"/>
+      <w:lvlText w:val="%4."/>
+      <w:lvlJc w:val="left"/>
+      <w:pPr>
+        <w:ind w:left="2945" w:hanging="360"/>
+      </w:pPr>
+    </w:lvl>
+    <w:lvl w:ilvl="4" w:tplc="04190019" w:tentative="1">
+      <w:start w:val="1"/>
+      <w:numFmt w:val="lowerLetter"/>
+      <w:lvlText w:val="%5."/>
+      <w:lvlJc w:val="left"/>
+      <w:pPr>
+        <w:ind w:left="3665" w:hanging="360"/>
+      </w:pPr>
+    </w:lvl>
+    <w:lvl w:ilvl="5" w:tplc="0419001B" w:tentative="1">
+      <w:start w:val="1"/>
+      <w:numFmt w:val="lowerRoman"/>
+      <w:lvlText w:val="%6."/>
+      <w:lvlJc w:val="right"/>
+      <w:pPr>
+        <w:ind w:left="4385" w:hanging="180"/>
+      </w:pPr>
+    </w:lvl>
+    <w:lvl w:ilvl="6" w:tplc="0419000F" w:tentative="1">
+      <w:start w:val="1"/>
+      <w:numFmt w:val="decimal"/>
+      <w:lvlText w:val="%7."/>
+      <w:lvlJc w:val="left"/>
+      <w:pPr>
+        <w:ind w:left="5105" w:hanging="360"/>
+      </w:pPr>
+    </w:lvl>
+    <w:lvl w:ilvl="7" w:tplc="04190019" w:tentative="1">
+      <w:start w:val="1"/>
+      <w:numFmt w:val="lowerLetter"/>
+      <w:lvlText w:val="%8."/>
+      <w:lvlJc w:val="left"/>
+      <w:pPr>
+        <w:ind w:left="5825" w:hanging="360"/>
+      </w:pPr>
+    </w:lvl>
+    <w:lvl w:ilvl="8" w:tplc="0419001B" w:tentative="1">
+      <w:start w:val="1"/>
+      <w:numFmt w:val="lowerRoman"/>
+      <w:lvlText w:val="%9."/>
+      <w:lvlJc w:val="right"/>
+      <w:pPr>
+        <w:ind w:left="6545" w:hanging="180"/>
+      </w:pPr>
+    </w:lvl>
+  </w:abstractNum>
+  <w:abstractNum w:abstractNumId="18" w15:restartNumberingAfterBreak="0">
     <w:nsid w:val="6ABF7B7A"/>
     <w:multiLevelType w:val="hybridMultilevel"/>
     <w:tmpl w:val="A6C43B9C"/>
@@ -3523,7 +4497,7 @@
       </w:pPr>
     </w:lvl>
   </w:abstractNum>
-  <w:abstractNum w:abstractNumId="15" w15:restartNumberingAfterBreak="0">
+  <w:abstractNum w:abstractNumId="19" w15:restartNumberingAfterBreak="0">
     <w:nsid w:val="6EB7273F"/>
     <w:multiLevelType w:val="hybridMultilevel"/>
     <w:tmpl w:val="9C6C6662"/>
@@ -3636,7 +4610,7 @@
       </w:rPr>
     </w:lvl>
   </w:abstractNum>
-  <w:abstractNum w:abstractNumId="16" w15:restartNumberingAfterBreak="0">
+  <w:abstractNum w:abstractNumId="20" w15:restartNumberingAfterBreak="0">
     <w:nsid w:val="72A147EC"/>
     <w:multiLevelType w:val="hybridMultilevel"/>
     <w:tmpl w:val="CF6E5AE2"/>
@@ -3749,7 +4723,7 @@
       </w:rPr>
     </w:lvl>
   </w:abstractNum>
-  <w:abstractNum w:abstractNumId="17" w15:restartNumberingAfterBreak="0">
+  <w:abstractNum w:abstractNumId="21" w15:restartNumberingAfterBreak="0">
     <w:nsid w:val="72FE4C06"/>
     <w:multiLevelType w:val="hybridMultilevel"/>
     <w:tmpl w:val="486EF68C"/>
@@ -3838,7 +4812,7 @@
       </w:pPr>
     </w:lvl>
   </w:abstractNum>
-  <w:abstractNum w:abstractNumId="18" w15:restartNumberingAfterBreak="0">
+  <w:abstractNum w:abstractNumId="22" w15:restartNumberingAfterBreak="0">
     <w:nsid w:val="7A4D376A"/>
     <w:multiLevelType w:val="hybridMultilevel"/>
     <w:tmpl w:val="23B8BCC0"/>
@@ -3951,7 +4925,7 @@
       </w:rPr>
     </w:lvl>
   </w:abstractNum>
-  <w:abstractNum w:abstractNumId="19" w15:restartNumberingAfterBreak="0">
+  <w:abstractNum w:abstractNumId="23" w15:restartNumberingAfterBreak="0">
     <w:nsid w:val="7BAD6DD1"/>
     <w:multiLevelType w:val="hybridMultilevel"/>
     <w:tmpl w:val="52D411E0"/>
@@ -4074,55 +5048,67 @@
     <w:abstractNumId w:val="6"/>
   </w:num>
   <w:num w:numId="4" w16cid:durableId="982395125">
-    <w:abstractNumId w:val="13"/>
+    <w:abstractNumId w:val="16"/>
   </w:num>
   <w:num w:numId="5" w16cid:durableId="569652063">
-    <w:abstractNumId w:val="19"/>
+    <w:abstractNumId w:val="23"/>
   </w:num>
   <w:num w:numId="6" w16cid:durableId="285238671">
-    <w:abstractNumId w:val="16"/>
+    <w:abstractNumId w:val="20"/>
   </w:num>
   <w:num w:numId="7" w16cid:durableId="707418584">
     <w:abstractNumId w:val="0"/>
   </w:num>
   <w:num w:numId="8" w16cid:durableId="1898778269">
-    <w:abstractNumId w:val="9"/>
+    <w:abstractNumId w:val="12"/>
   </w:num>
   <w:num w:numId="9" w16cid:durableId="1883907230">
-    <w:abstractNumId w:val="18"/>
+    <w:abstractNumId w:val="22"/>
   </w:num>
   <w:num w:numId="10" w16cid:durableId="505248592">
-    <w:abstractNumId w:val="15"/>
+    <w:abstractNumId w:val="19"/>
   </w:num>
   <w:num w:numId="11" w16cid:durableId="365298338">
-    <w:abstractNumId w:val="8"/>
+    <w:abstractNumId w:val="11"/>
   </w:num>
   <w:num w:numId="12" w16cid:durableId="2068915188">
     <w:abstractNumId w:val="3"/>
   </w:num>
   <w:num w:numId="13" w16cid:durableId="1250038190">
-    <w:abstractNumId w:val="14"/>
+    <w:abstractNumId w:val="18"/>
   </w:num>
   <w:num w:numId="14" w16cid:durableId="681972936">
-    <w:abstractNumId w:val="12"/>
+    <w:abstractNumId w:val="15"/>
   </w:num>
   <w:num w:numId="15" w16cid:durableId="271285448">
     <w:abstractNumId w:val="2"/>
   </w:num>
   <w:num w:numId="16" w16cid:durableId="335958602">
-    <w:abstractNumId w:val="7"/>
+    <w:abstractNumId w:val="10"/>
   </w:num>
   <w:num w:numId="17" w16cid:durableId="1304653646">
-    <w:abstractNumId w:val="11"/>
+    <w:abstractNumId w:val="14"/>
   </w:num>
   <w:num w:numId="18" w16cid:durableId="358818155">
-    <w:abstractNumId w:val="10"/>
+    <w:abstractNumId w:val="13"/>
   </w:num>
   <w:num w:numId="19" w16cid:durableId="597563379">
     <w:abstractNumId w:val="1"/>
   </w:num>
   <w:num w:numId="20" w16cid:durableId="1872306350">
+    <w:abstractNumId w:val="21"/>
+  </w:num>
+  <w:num w:numId="21" w16cid:durableId="1774007673">
+    <w:abstractNumId w:val="7"/>
+  </w:num>
+  <w:num w:numId="22" w16cid:durableId="1086997936">
+    <w:abstractNumId w:val="8"/>
+  </w:num>
+  <w:num w:numId="23" w16cid:durableId="1770545881">
     <w:abstractNumId w:val="17"/>
+  </w:num>
+  <w:num w:numId="24" w16cid:durableId="912155482">
+    <w:abstractNumId w:val="9"/>
   </w:num>
 </w:numbering>
 </file>

</xml_diff>

<commit_message>
recent cource changes: 2025-05-28 12:32:36
</commit_message>
<xml_diff>
--- a/Курс 2/Основы Data Science/Лабораторные/05. Изучение связей между переменными/Отчёт5.docx
+++ b/Курс 2/Основы Data Science/Лабораторные/05. Изучение связей между переменными/Отчёт5.docx
@@ -1,6 +1,6 @@
 
 <file path=word/document.xml><?xml version="1.0" encoding="utf-8"?>
-<w:document xmlns:wpc="http://schemas.microsoft.com/office/word/2010/wordprocessingCanvas" xmlns:cx="http://schemas.microsoft.com/office/drawing/2014/chartex" xmlns:cx1="http://schemas.microsoft.com/office/drawing/2015/9/8/chartex" xmlns:cx2="http://schemas.microsoft.com/office/drawing/2015/10/21/chartex" xmlns:cx3="http://schemas.microsoft.com/office/drawing/2016/5/9/chartex" xmlns:cx4="http://schemas.microsoft.com/office/drawing/2016/5/10/chartex" xmlns:cx5="http://schemas.microsoft.com/office/drawing/2016/5/11/chartex" xmlns:cx6="http://schemas.microsoft.com/office/drawing/2016/5/12/chartex" xmlns:cx7="http://schemas.microsoft.com/office/drawing/2016/5/13/chartex" xmlns:cx8="http://schemas.microsoft.com/office/drawing/2016/5/14/chartex" xmlns:mc="http://schemas.openxmlformats.org/markup-compatibility/2006" xmlns:aink="http://schemas.microsoft.com/office/drawing/2016/ink" xmlns:am3d="http://schemas.microsoft.com/office/drawing/2017/model3d" xmlns:o="urn:schemas-microsoft-com:office:office" xmlns:oel="http://schemas.microsoft.com/office/2019/extlst" xmlns:r="http://schemas.openxmlformats.org/officeDocument/2006/relationships" xmlns:m="http://schemas.openxmlformats.org/officeDocument/2006/math" xmlns:v="urn:schemas-microsoft-com:vml" xmlns:wp14="http://schemas.microsoft.com/office/word/2010/wordprocessingDrawing" xmlns:wp="http://schemas.openxmlformats.org/drawingml/2006/wordprocessingDrawing" xmlns:w10="urn:schemas-microsoft-com:office:word" xmlns:w="http://schemas.openxmlformats.org/wordprocessingml/2006/main" xmlns:w14="http://schemas.microsoft.com/office/word/2010/wordml" xmlns:w15="http://schemas.microsoft.com/office/word/2012/wordml" xmlns:w16cex="http://schemas.microsoft.com/office/word/2018/wordml/cex" xmlns:w16cid="http://schemas.microsoft.com/office/word/2016/wordml/cid" xmlns:w16="http://schemas.microsoft.com/office/word/2018/wordml" xmlns:w16du="http://schemas.microsoft.com/office/word/2023/wordml/word16du" xmlns:w16sdtdh="http://schemas.microsoft.com/office/word/2020/wordml/sdtdatahash" xmlns:w16sdtfl="http://schemas.microsoft.com/office/word/2024/wordml/sdtformatlock" xmlns:w16se="http://schemas.microsoft.com/office/word/2015/wordml/symex" xmlns:wpg="http://schemas.microsoft.com/office/word/2010/wordprocessingGroup" xmlns:wpi="http://schemas.microsoft.com/office/word/2010/wordprocessingInk" xmlns:wne="http://schemas.microsoft.com/office/word/2006/wordml" xmlns:wps="http://schemas.microsoft.com/office/word/2010/wordprocessingShape" mc:Ignorable="w14 w15 w16se w16cid w16 w16cex w16sdtdh w16sdtfl w16du wp14">
+<w:document xmlns:wpc="http://schemas.microsoft.com/office/word/2010/wordprocessingCanvas" xmlns:cx="http://schemas.microsoft.com/office/drawing/2014/chartex" xmlns:cx1="http://schemas.microsoft.com/office/drawing/2015/9/8/chartex" xmlns:cx2="http://schemas.microsoft.com/office/drawing/2015/10/21/chartex" xmlns:cx3="http://schemas.microsoft.com/office/drawing/2016/5/9/chartex" xmlns:cx4="http://schemas.microsoft.com/office/drawing/2016/5/10/chartex" xmlns:cx5="http://schemas.microsoft.com/office/drawing/2016/5/11/chartex" xmlns:cx6="http://schemas.microsoft.com/office/drawing/2016/5/12/chartex" xmlns:cx7="http://schemas.microsoft.com/office/drawing/2016/5/13/chartex" xmlns:cx8="http://schemas.microsoft.com/office/drawing/2016/5/14/chartex" xmlns:mc="http://schemas.openxmlformats.org/markup-compatibility/2006" xmlns:aink="http://schemas.microsoft.com/office/drawing/2016/ink" xmlns:am3d="http://schemas.microsoft.com/office/drawing/2017/model3d" xmlns:o="urn:schemas-microsoft-com:office:office" xmlns:oel="http://schemas.microsoft.com/office/2019/extlst" xmlns:r="http://schemas.openxmlformats.org/officeDocument/2006/relationships" xmlns:m="http://schemas.openxmlformats.org/officeDocument/2006/math" xmlns:v="urn:schemas-microsoft-com:vml" xmlns:wp14="http://schemas.microsoft.com/office/word/2010/wordprocessingDrawing" xmlns:wp="http://schemas.openxmlformats.org/drawingml/2006/wordprocessingDrawing" xmlns:w10="urn:schemas-microsoft-com:office:word" xmlns:w="http://schemas.openxmlformats.org/wordprocessingml/2006/main" xmlns:w14="http://schemas.microsoft.com/office/word/2010/wordml" xmlns:w15="http://schemas.microsoft.com/office/word/2012/wordml" xmlns:w16cex="http://schemas.microsoft.com/office/word/2018/wordml/cex" xmlns:w16cid="http://schemas.microsoft.com/office/word/2016/wordml/cid" xmlns:w16="http://schemas.microsoft.com/office/word/2018/wordml" xmlns:w16sdtdh="http://schemas.microsoft.com/office/word/2020/wordml/sdtdatahash" xmlns:w16se="http://schemas.microsoft.com/office/word/2015/wordml/symex" xmlns:wpg="http://schemas.microsoft.com/office/word/2010/wordprocessingGroup" xmlns:wpi="http://schemas.microsoft.com/office/word/2010/wordprocessingInk" xmlns:wne="http://schemas.microsoft.com/office/word/2006/wordml" xmlns:wps="http://schemas.microsoft.com/office/word/2010/wordprocessingShape" mc:Ignorable="w14 w15 w16se w16cid w16 w16cex w16sdtdh wp14">
   <w:body>
     <w:p>
       <w:pPr>
@@ -989,21 +989,7 @@
         <w:rPr>
           <w:lang w:val="ru-RU" w:eastAsia="ru-RU"/>
         </w:rPr>
-        <w:t xml:space="preserve">2. Выберите зависимости, для которых можно воспользоваться ранговым коэффициентом </w:t>
-      </w:r>
-      <w:proofErr w:type="spellStart"/>
-      <w:r>
-        <w:rPr>
-          <w:lang w:val="ru-RU" w:eastAsia="ru-RU"/>
-        </w:rPr>
-        <w:t>Спирмена</w:t>
-      </w:r>
-      <w:proofErr w:type="spellEnd"/>
-      <w:r>
-        <w:rPr>
-          <w:lang w:val="ru-RU" w:eastAsia="ru-RU"/>
-        </w:rPr>
-        <w:t>. Вычислите те, которые могут быть использованы при описании данных. Вычислите и оцените коэффициент.</w:t>
+        <w:t>2. Выберите зависимости, для которых можно воспользоваться ранговым коэффициентом Спирмена. Вычислите те, которые могут быть использованы при описании данных. Вычислите и оцените коэффициент.</w:t>
       </w:r>
     </w:p>
     <w:p>
@@ -1152,21 +1138,7 @@
         <w:rPr>
           <w:lang w:val="ru-RU"/>
         </w:rPr>
-        <w:t xml:space="preserve">Коэффициент </w:t>
-      </w:r>
-      <w:proofErr w:type="spellStart"/>
-      <w:r>
-        <w:rPr>
-          <w:lang w:val="ru-RU"/>
-        </w:rPr>
-        <w:t>Спирмена</w:t>
-      </w:r>
-      <w:proofErr w:type="spellEnd"/>
-      <w:r>
-        <w:rPr>
-          <w:lang w:val="ru-RU"/>
-        </w:rPr>
-        <w:t xml:space="preserve"> </w:t>
+        <w:t xml:space="preserve">Коэффициент Спирмена </w:t>
       </w:r>
       <w:r>
         <w:rPr>
@@ -1178,16 +1150,8 @@
         <w:rPr>
           <w:lang w:val="ru-RU"/>
         </w:rPr>
-        <w:t xml:space="preserve">коэффициент </w:t>
-      </w:r>
-      <w:proofErr w:type="spellStart"/>
-      <w:r>
-        <w:rPr>
-          <w:lang w:val="ru-RU"/>
-        </w:rPr>
-        <w:t>Спирмена</w:t>
-      </w:r>
-      <w:proofErr w:type="spellEnd"/>
+        <w:t>коэффициент Спирмена</w:t>
+      </w:r>
       <w:r>
         <w:rPr>
           <w:lang w:val="ru-RU"/>
@@ -1619,23 +1583,7 @@
           <w:rFonts w:eastAsiaTheme="minorEastAsia"/>
           <w:lang w:val="ru-RU"/>
         </w:rPr>
-        <w:t xml:space="preserve">значение коэффициента </w:t>
-      </w:r>
-      <w:proofErr w:type="spellStart"/>
-      <w:r>
-        <w:rPr>
-          <w:rFonts w:eastAsiaTheme="minorEastAsia"/>
-          <w:lang w:val="ru-RU"/>
-        </w:rPr>
-        <w:t>Спирмена</w:t>
-      </w:r>
-      <w:proofErr w:type="spellEnd"/>
-      <w:r>
-        <w:rPr>
-          <w:rFonts w:eastAsiaTheme="minorEastAsia"/>
-          <w:lang w:val="ru-RU"/>
-        </w:rPr>
-        <w:t xml:space="preserve">, </w:t>
+        <w:t xml:space="preserve">значение коэффициента Спирмена, </w:t>
       </w:r>
       <m:oMath>
         <m:r>
@@ -1684,23 +1632,7 @@
           <w:rFonts w:eastAsiaTheme="minorEastAsia"/>
           <w:lang w:val="ru-RU"/>
         </w:rPr>
-        <w:t xml:space="preserve">коэффициент </w:t>
-      </w:r>
-      <w:proofErr w:type="gramStart"/>
-      <w:r>
-        <w:rPr>
-          <w:rFonts w:eastAsiaTheme="minorEastAsia"/>
-          <w:lang w:val="ru-RU"/>
-        </w:rPr>
-        <w:t>показывает</w:t>
-      </w:r>
-      <w:proofErr w:type="gramEnd"/>
-      <w:r>
-        <w:rPr>
-          <w:rFonts w:eastAsiaTheme="minorEastAsia"/>
-          <w:lang w:val="ru-RU"/>
-        </w:rPr>
-        <w:t xml:space="preserve"> насколько сильно наблюдаемая корреляция отличается от нулевой (отсутствия связи). </w:t>
+        <w:t xml:space="preserve">коэффициент показывает насколько сильно наблюдаемая корреляция отличается от нулевой (отсутствия связи). </w:t>
       </w:r>
       <w:r>
         <w:rPr>
@@ -1927,7 +1859,7 @@
               <w:color w:val="000000"/>
               <w:kern w:val="0"/>
               <w:sz w:val="24"/>
-              <w:lang w:val="ru-US" w:eastAsia="ru-RU"/>
+              <w:lang w:eastAsia="ru-RU"/>
               <w14:ligatures w14:val="none"/>
             </w:rPr>
             <m:t>-0.15979</m:t>
@@ -1949,6 +1881,21 @@
         </w:rPr>
         <w:t>Коэффициент оказался близко к нулю, из чего можно сделать вывод, что линейная зависимость для этих переменных слаба.</w:t>
       </w:r>
+      <w:r>
+        <w:rPr>
+          <w:lang w:val="ru-RU"/>
+        </w:rPr>
+        <w:t xml:space="preserve"> Также вычисленный коэффициент не попадает в доверительный интервал </w:t>
+      </w:r>
+      <w:r>
+        <w:t>t</w:t>
+      </w:r>
+      <w:r>
+        <w:rPr>
+          <w:lang w:val="ru-RU"/>
+        </w:rPr>
+        <w:t>-критического, что показывает его статистическую незначительность.</w:t>
+      </w:r>
     </w:p>
     <w:p>
       <w:pPr>
@@ -1965,21 +1912,7 @@
         <w:rPr>
           <w:lang w:val="ru-RU"/>
         </w:rPr>
-        <w:t xml:space="preserve">Для проведения расчёта рангового коэффициента </w:t>
-      </w:r>
-      <w:proofErr w:type="spellStart"/>
-      <w:r>
-        <w:rPr>
-          <w:lang w:val="ru-RU"/>
-        </w:rPr>
-        <w:t>Спирмена</w:t>
-      </w:r>
-      <w:proofErr w:type="spellEnd"/>
-      <w:r>
-        <w:rPr>
-          <w:lang w:val="ru-RU"/>
-        </w:rPr>
-        <w:t xml:space="preserve"> была выбран поиск связи между игровым стажем и часов игры в день. Значения переменных были ранжированы, после чего был получен коэффициент </w:t>
+        <w:t xml:space="preserve">Для проведения расчёта рангового коэффициента Спирмена была выбран поиск связи между игровым стажем и часов игры в день. Значения переменных были ранжированы, после чего был получен коэффициент </w:t>
       </w:r>
       <m:oMath>
         <m:r>
@@ -2086,14 +2019,7 @@
             <w:rFonts w:ascii="Cambria Math" w:eastAsiaTheme="minorEastAsia" w:hAnsi="Cambria Math"/>
             <w:lang w:val="ru-RU"/>
           </w:rPr>
-          <m:t>=</m:t>
-        </m:r>
-        <m:r>
-          <w:rPr>
-            <w:rFonts w:ascii="Cambria Math" w:eastAsiaTheme="minorEastAsia" w:hAnsi="Cambria Math"/>
-            <w:lang w:val="ru-RU"/>
-          </w:rPr>
-          <m:t>1.96151</m:t>
+          <m:t>=1.96151</m:t>
         </m:r>
       </m:oMath>
       <w:r>
@@ -2210,21 +2136,7 @@
         <w:rPr>
           <w:lang w:val="ru-RU"/>
         </w:rPr>
-        <w:t xml:space="preserve">часами игры и баллом учеников слабая и статистически незначительная линейная </w:t>
-      </w:r>
-      <w:proofErr w:type="spellStart"/>
-      <w:r>
-        <w:rPr>
-          <w:lang w:val="ru-RU"/>
-        </w:rPr>
-        <w:t>взяимосвязь</w:t>
-      </w:r>
-      <w:proofErr w:type="spellEnd"/>
-      <w:r>
-        <w:rPr>
-          <w:lang w:val="ru-RU"/>
-        </w:rPr>
-        <w:t>.</w:t>
+        <w:t>часами игры и баллом учеников слабая и статистически незначительная линейная взяимосвязь.</w:t>
       </w:r>
     </w:p>
     <w:p>
@@ -2247,14 +2159,6 @@
     </w:p>
     <w:p>
       <w:pPr>
-        <w:ind w:firstLine="0"/>
-        <w:rPr>
-          <w:lang w:val="ru-RU"/>
-        </w:rPr>
-      </w:pPr>
-    </w:p>
-    <w:p>
-      <w:pPr>
         <w:pStyle w:val="a7"/>
         <w:numPr>
           <w:ilvl w:val="0"/>
@@ -2286,21 +2190,7 @@
         <w:rPr>
           <w:lang w:val="ru-RU"/>
         </w:rPr>
-        <w:t xml:space="preserve">Нелинейные между количественными – коэффициент </w:t>
-      </w:r>
-      <w:proofErr w:type="spellStart"/>
-      <w:r>
-        <w:rPr>
-          <w:lang w:val="ru-RU"/>
-        </w:rPr>
-        <w:t>Спирмена</w:t>
-      </w:r>
-      <w:proofErr w:type="spellEnd"/>
-      <w:r>
-        <w:rPr>
-          <w:lang w:val="ru-RU"/>
-        </w:rPr>
-        <w:t>, ящик с усами, криволинейная регрессия</w:t>
+        <w:t>Нелинейные между количественными – коэффициент Спирмена, ящик с усами, криволинейная регрессия</w:t>
       </w:r>
       <w:r>
         <w:rPr>
@@ -2391,7 +2281,7 @@
 </file>
 
 <file path=word/endnotes.xml><?xml version="1.0" encoding="utf-8"?>
-<w:endnotes xmlns:wpc="http://schemas.microsoft.com/office/word/2010/wordprocessingCanvas" xmlns:cx="http://schemas.microsoft.com/office/drawing/2014/chartex" xmlns:cx1="http://schemas.microsoft.com/office/drawing/2015/9/8/chartex" xmlns:cx2="http://schemas.microsoft.com/office/drawing/2015/10/21/chartex" xmlns:cx3="http://schemas.microsoft.com/office/drawing/2016/5/9/chartex" xmlns:cx4="http://schemas.microsoft.com/office/drawing/2016/5/10/chartex" xmlns:cx5="http://schemas.microsoft.com/office/drawing/2016/5/11/chartex" xmlns:cx6="http://schemas.microsoft.com/office/drawing/2016/5/12/chartex" xmlns:cx7="http://schemas.microsoft.com/office/drawing/2016/5/13/chartex" xmlns:cx8="http://schemas.microsoft.com/office/drawing/2016/5/14/chartex" xmlns:mc="http://schemas.openxmlformats.org/markup-compatibility/2006" xmlns:aink="http://schemas.microsoft.com/office/drawing/2016/ink" xmlns:am3d="http://schemas.microsoft.com/office/drawing/2017/model3d" xmlns:o="urn:schemas-microsoft-com:office:office" xmlns:oel="http://schemas.microsoft.com/office/2019/extlst" xmlns:r="http://schemas.openxmlformats.org/officeDocument/2006/relationships" xmlns:m="http://schemas.openxmlformats.org/officeDocument/2006/math" xmlns:v="urn:schemas-microsoft-com:vml" xmlns:wp14="http://schemas.microsoft.com/office/word/2010/wordprocessingDrawing" xmlns:wp="http://schemas.openxmlformats.org/drawingml/2006/wordprocessingDrawing" xmlns:w10="urn:schemas-microsoft-com:office:word" xmlns:w="http://schemas.openxmlformats.org/wordprocessingml/2006/main" xmlns:w14="http://schemas.microsoft.com/office/word/2010/wordml" xmlns:w15="http://schemas.microsoft.com/office/word/2012/wordml" xmlns:w16cex="http://schemas.microsoft.com/office/word/2018/wordml/cex" xmlns:w16cid="http://schemas.microsoft.com/office/word/2016/wordml/cid" xmlns:w16="http://schemas.microsoft.com/office/word/2018/wordml" xmlns:w16du="http://schemas.microsoft.com/office/word/2023/wordml/word16du" xmlns:w16sdtdh="http://schemas.microsoft.com/office/word/2020/wordml/sdtdatahash" xmlns:w16sdtfl="http://schemas.microsoft.com/office/word/2024/wordml/sdtformatlock" xmlns:w16se="http://schemas.microsoft.com/office/word/2015/wordml/symex" xmlns:wpg="http://schemas.microsoft.com/office/word/2010/wordprocessingGroup" xmlns:wpi="http://schemas.microsoft.com/office/word/2010/wordprocessingInk" xmlns:wne="http://schemas.microsoft.com/office/word/2006/wordml" xmlns:wps="http://schemas.microsoft.com/office/word/2010/wordprocessingShape" mc:Ignorable="w14 w15 w16se w16cid w16 w16cex w16sdtdh w16sdtfl w16du wp14">
+<w:endnotes xmlns:wpc="http://schemas.microsoft.com/office/word/2010/wordprocessingCanvas" xmlns:cx="http://schemas.microsoft.com/office/drawing/2014/chartex" xmlns:cx1="http://schemas.microsoft.com/office/drawing/2015/9/8/chartex" xmlns:cx2="http://schemas.microsoft.com/office/drawing/2015/10/21/chartex" xmlns:cx3="http://schemas.microsoft.com/office/drawing/2016/5/9/chartex" xmlns:cx4="http://schemas.microsoft.com/office/drawing/2016/5/10/chartex" xmlns:cx5="http://schemas.microsoft.com/office/drawing/2016/5/11/chartex" xmlns:cx6="http://schemas.microsoft.com/office/drawing/2016/5/12/chartex" xmlns:cx7="http://schemas.microsoft.com/office/drawing/2016/5/13/chartex" xmlns:cx8="http://schemas.microsoft.com/office/drawing/2016/5/14/chartex" xmlns:mc="http://schemas.openxmlformats.org/markup-compatibility/2006" xmlns:aink="http://schemas.microsoft.com/office/drawing/2016/ink" xmlns:am3d="http://schemas.microsoft.com/office/drawing/2017/model3d" xmlns:o="urn:schemas-microsoft-com:office:office" xmlns:oel="http://schemas.microsoft.com/office/2019/extlst" xmlns:r="http://schemas.openxmlformats.org/officeDocument/2006/relationships" xmlns:m="http://schemas.openxmlformats.org/officeDocument/2006/math" xmlns:v="urn:schemas-microsoft-com:vml" xmlns:wp14="http://schemas.microsoft.com/office/word/2010/wordprocessingDrawing" xmlns:wp="http://schemas.openxmlformats.org/drawingml/2006/wordprocessingDrawing" xmlns:w10="urn:schemas-microsoft-com:office:word" xmlns:w="http://schemas.openxmlformats.org/wordprocessingml/2006/main" xmlns:w14="http://schemas.microsoft.com/office/word/2010/wordml" xmlns:w15="http://schemas.microsoft.com/office/word/2012/wordml" xmlns:w16cex="http://schemas.microsoft.com/office/word/2018/wordml/cex" xmlns:w16cid="http://schemas.microsoft.com/office/word/2016/wordml/cid" xmlns:w16="http://schemas.microsoft.com/office/word/2018/wordml" xmlns:w16sdtdh="http://schemas.microsoft.com/office/word/2020/wordml/sdtdatahash" xmlns:w16se="http://schemas.microsoft.com/office/word/2015/wordml/symex" xmlns:wpg="http://schemas.microsoft.com/office/word/2010/wordprocessingGroup" xmlns:wpi="http://schemas.microsoft.com/office/word/2010/wordprocessingInk" xmlns:wne="http://schemas.microsoft.com/office/word/2006/wordml" xmlns:wps="http://schemas.microsoft.com/office/word/2010/wordprocessingShape" mc:Ignorable="w14 w15 w16se w16cid w16 w16cex w16sdtdh wp14">
   <w:endnote w:type="separator" w:id="-1">
     <w:p>
       <w:pPr>
@@ -2416,7 +2306,7 @@
 </file>
 
 <file path=word/footer1.xml><?xml version="1.0" encoding="utf-8"?>
-<w:ftr xmlns:wpc="http://schemas.microsoft.com/office/word/2010/wordprocessingCanvas" xmlns:cx="http://schemas.microsoft.com/office/drawing/2014/chartex" xmlns:cx1="http://schemas.microsoft.com/office/drawing/2015/9/8/chartex" xmlns:cx2="http://schemas.microsoft.com/office/drawing/2015/10/21/chartex" xmlns:cx3="http://schemas.microsoft.com/office/drawing/2016/5/9/chartex" xmlns:cx4="http://schemas.microsoft.com/office/drawing/2016/5/10/chartex" xmlns:cx5="http://schemas.microsoft.com/office/drawing/2016/5/11/chartex" xmlns:cx6="http://schemas.microsoft.com/office/drawing/2016/5/12/chartex" xmlns:cx7="http://schemas.microsoft.com/office/drawing/2016/5/13/chartex" xmlns:cx8="http://schemas.microsoft.com/office/drawing/2016/5/14/chartex" xmlns:mc="http://schemas.openxmlformats.org/markup-compatibility/2006" xmlns:aink="http://schemas.microsoft.com/office/drawing/2016/ink" xmlns:am3d="http://schemas.microsoft.com/office/drawing/2017/model3d" xmlns:o="urn:schemas-microsoft-com:office:office" xmlns:oel="http://schemas.microsoft.com/office/2019/extlst" xmlns:r="http://schemas.openxmlformats.org/officeDocument/2006/relationships" xmlns:m="http://schemas.openxmlformats.org/officeDocument/2006/math" xmlns:v="urn:schemas-microsoft-com:vml" xmlns:wp14="http://schemas.microsoft.com/office/word/2010/wordprocessingDrawing" xmlns:wp="http://schemas.openxmlformats.org/drawingml/2006/wordprocessingDrawing" xmlns:w10="urn:schemas-microsoft-com:office:word" xmlns:w="http://schemas.openxmlformats.org/wordprocessingml/2006/main" xmlns:w14="http://schemas.microsoft.com/office/word/2010/wordml" xmlns:w15="http://schemas.microsoft.com/office/word/2012/wordml" xmlns:w16cex="http://schemas.microsoft.com/office/word/2018/wordml/cex" xmlns:w16cid="http://schemas.microsoft.com/office/word/2016/wordml/cid" xmlns:w16="http://schemas.microsoft.com/office/word/2018/wordml" xmlns:w16du="http://schemas.microsoft.com/office/word/2023/wordml/word16du" xmlns:w16sdtdh="http://schemas.microsoft.com/office/word/2020/wordml/sdtdatahash" xmlns:w16sdtfl="http://schemas.microsoft.com/office/word/2024/wordml/sdtformatlock" xmlns:w16se="http://schemas.microsoft.com/office/word/2015/wordml/symex" xmlns:wpg="http://schemas.microsoft.com/office/word/2010/wordprocessingGroup" xmlns:wpi="http://schemas.microsoft.com/office/word/2010/wordprocessingInk" xmlns:wne="http://schemas.microsoft.com/office/word/2006/wordml" xmlns:wps="http://schemas.microsoft.com/office/word/2010/wordprocessingShape" mc:Ignorable="w14 w15 w16se w16cid w16 w16cex w16sdtdh w16sdtfl w16du wp14">
+<w:ftr xmlns:wpc="http://schemas.microsoft.com/office/word/2010/wordprocessingCanvas" xmlns:cx="http://schemas.microsoft.com/office/drawing/2014/chartex" xmlns:cx1="http://schemas.microsoft.com/office/drawing/2015/9/8/chartex" xmlns:cx2="http://schemas.microsoft.com/office/drawing/2015/10/21/chartex" xmlns:cx3="http://schemas.microsoft.com/office/drawing/2016/5/9/chartex" xmlns:cx4="http://schemas.microsoft.com/office/drawing/2016/5/10/chartex" xmlns:cx5="http://schemas.microsoft.com/office/drawing/2016/5/11/chartex" xmlns:cx6="http://schemas.microsoft.com/office/drawing/2016/5/12/chartex" xmlns:cx7="http://schemas.microsoft.com/office/drawing/2016/5/13/chartex" xmlns:cx8="http://schemas.microsoft.com/office/drawing/2016/5/14/chartex" xmlns:mc="http://schemas.openxmlformats.org/markup-compatibility/2006" xmlns:aink="http://schemas.microsoft.com/office/drawing/2016/ink" xmlns:am3d="http://schemas.microsoft.com/office/drawing/2017/model3d" xmlns:o="urn:schemas-microsoft-com:office:office" xmlns:oel="http://schemas.microsoft.com/office/2019/extlst" xmlns:r="http://schemas.openxmlformats.org/officeDocument/2006/relationships" xmlns:m="http://schemas.openxmlformats.org/officeDocument/2006/math" xmlns:v="urn:schemas-microsoft-com:vml" xmlns:wp14="http://schemas.microsoft.com/office/word/2010/wordprocessingDrawing" xmlns:wp="http://schemas.openxmlformats.org/drawingml/2006/wordprocessingDrawing" xmlns:w10="urn:schemas-microsoft-com:office:word" xmlns:w="http://schemas.openxmlformats.org/wordprocessingml/2006/main" xmlns:w14="http://schemas.microsoft.com/office/word/2010/wordml" xmlns:w15="http://schemas.microsoft.com/office/word/2012/wordml" xmlns:w16cex="http://schemas.microsoft.com/office/word/2018/wordml/cex" xmlns:w16cid="http://schemas.microsoft.com/office/word/2016/wordml/cid" xmlns:w16="http://schemas.microsoft.com/office/word/2018/wordml" xmlns:w16sdtdh="http://schemas.microsoft.com/office/word/2020/wordml/sdtdatahash" xmlns:w16se="http://schemas.microsoft.com/office/word/2015/wordml/symex" xmlns:wpg="http://schemas.microsoft.com/office/word/2010/wordprocessingGroup" xmlns:wpi="http://schemas.microsoft.com/office/word/2010/wordprocessingInk" xmlns:wne="http://schemas.microsoft.com/office/word/2006/wordml" xmlns:wps="http://schemas.microsoft.com/office/word/2010/wordprocessingShape" mc:Ignorable="w14 w15 w16se w16cid w16 w16cex w16sdtdh wp14">
   <w:p>
     <w:pPr>
       <w:pStyle w:val="ae"/>
@@ -2425,23 +2315,13 @@
         <w:lang w:val="ru-RU"/>
       </w:rPr>
     </w:pPr>
-    <w:proofErr w:type="spellStart"/>
     <w:r>
       <w:rPr>
         <w:rFonts w:eastAsia="Times New Roman" w:cs="Times New Roman"/>
         <w:szCs w:val="28"/>
         <w:lang w:eastAsia="ru-RU"/>
       </w:rPr>
-      <w:t>Череповец</w:t>
-    </w:r>
-    <w:proofErr w:type="spellEnd"/>
-    <w:r>
-      <w:rPr>
-        <w:rFonts w:eastAsia="Times New Roman" w:cs="Times New Roman"/>
-        <w:szCs w:val="28"/>
-        <w:lang w:eastAsia="ru-RU"/>
-      </w:rPr>
-      <w:t>, 202</w:t>
+      <w:t>Череповец, 202</w:t>
     </w:r>
     <w:r>
       <w:rPr>
@@ -2464,7 +2344,7 @@
 </file>
 
 <file path=word/footnotes.xml><?xml version="1.0" encoding="utf-8"?>
-<w:footnotes xmlns:wpc="http://schemas.microsoft.com/office/word/2010/wordprocessingCanvas" xmlns:cx="http://schemas.microsoft.com/office/drawing/2014/chartex" xmlns:cx1="http://schemas.microsoft.com/office/drawing/2015/9/8/chartex" xmlns:cx2="http://schemas.microsoft.com/office/drawing/2015/10/21/chartex" xmlns:cx3="http://schemas.microsoft.com/office/drawing/2016/5/9/chartex" xmlns:cx4="http://schemas.microsoft.com/office/drawing/2016/5/10/chartex" xmlns:cx5="http://schemas.microsoft.com/office/drawing/2016/5/11/chartex" xmlns:cx6="http://schemas.microsoft.com/office/drawing/2016/5/12/chartex" xmlns:cx7="http://schemas.microsoft.com/office/drawing/2016/5/13/chartex" xmlns:cx8="http://schemas.microsoft.com/office/drawing/2016/5/14/chartex" xmlns:mc="http://schemas.openxmlformats.org/markup-compatibility/2006" xmlns:aink="http://schemas.microsoft.com/office/drawing/2016/ink" xmlns:am3d="http://schemas.microsoft.com/office/drawing/2017/model3d" xmlns:o="urn:schemas-microsoft-com:office:office" xmlns:oel="http://schemas.microsoft.com/office/2019/extlst" xmlns:r="http://schemas.openxmlformats.org/officeDocument/2006/relationships" xmlns:m="http://schemas.openxmlformats.org/officeDocument/2006/math" xmlns:v="urn:schemas-microsoft-com:vml" xmlns:wp14="http://schemas.microsoft.com/office/word/2010/wordprocessingDrawing" xmlns:wp="http://schemas.openxmlformats.org/drawingml/2006/wordprocessingDrawing" xmlns:w10="urn:schemas-microsoft-com:office:word" xmlns:w="http://schemas.openxmlformats.org/wordprocessingml/2006/main" xmlns:w14="http://schemas.microsoft.com/office/word/2010/wordml" xmlns:w15="http://schemas.microsoft.com/office/word/2012/wordml" xmlns:w16cex="http://schemas.microsoft.com/office/word/2018/wordml/cex" xmlns:w16cid="http://schemas.microsoft.com/office/word/2016/wordml/cid" xmlns:w16="http://schemas.microsoft.com/office/word/2018/wordml" xmlns:w16du="http://schemas.microsoft.com/office/word/2023/wordml/word16du" xmlns:w16sdtdh="http://schemas.microsoft.com/office/word/2020/wordml/sdtdatahash" xmlns:w16sdtfl="http://schemas.microsoft.com/office/word/2024/wordml/sdtformatlock" xmlns:w16se="http://schemas.microsoft.com/office/word/2015/wordml/symex" xmlns:wpg="http://schemas.microsoft.com/office/word/2010/wordprocessingGroup" xmlns:wpi="http://schemas.microsoft.com/office/word/2010/wordprocessingInk" xmlns:wne="http://schemas.microsoft.com/office/word/2006/wordml" xmlns:wps="http://schemas.microsoft.com/office/word/2010/wordprocessingShape" mc:Ignorable="w14 w15 w16se w16cid w16 w16cex w16sdtdh w16sdtfl w16du wp14">
+<w:footnotes xmlns:wpc="http://schemas.microsoft.com/office/word/2010/wordprocessingCanvas" xmlns:cx="http://schemas.microsoft.com/office/drawing/2014/chartex" xmlns:cx1="http://schemas.microsoft.com/office/drawing/2015/9/8/chartex" xmlns:cx2="http://schemas.microsoft.com/office/drawing/2015/10/21/chartex" xmlns:cx3="http://schemas.microsoft.com/office/drawing/2016/5/9/chartex" xmlns:cx4="http://schemas.microsoft.com/office/drawing/2016/5/10/chartex" xmlns:cx5="http://schemas.microsoft.com/office/drawing/2016/5/11/chartex" xmlns:cx6="http://schemas.microsoft.com/office/drawing/2016/5/12/chartex" xmlns:cx7="http://schemas.microsoft.com/office/drawing/2016/5/13/chartex" xmlns:cx8="http://schemas.microsoft.com/office/drawing/2016/5/14/chartex" xmlns:mc="http://schemas.openxmlformats.org/markup-compatibility/2006" xmlns:aink="http://schemas.microsoft.com/office/drawing/2016/ink" xmlns:am3d="http://schemas.microsoft.com/office/drawing/2017/model3d" xmlns:o="urn:schemas-microsoft-com:office:office" xmlns:oel="http://schemas.microsoft.com/office/2019/extlst" xmlns:r="http://schemas.openxmlformats.org/officeDocument/2006/relationships" xmlns:m="http://schemas.openxmlformats.org/officeDocument/2006/math" xmlns:v="urn:schemas-microsoft-com:vml" xmlns:wp14="http://schemas.microsoft.com/office/word/2010/wordprocessingDrawing" xmlns:wp="http://schemas.openxmlformats.org/drawingml/2006/wordprocessingDrawing" xmlns:w10="urn:schemas-microsoft-com:office:word" xmlns:w="http://schemas.openxmlformats.org/wordprocessingml/2006/main" xmlns:w14="http://schemas.microsoft.com/office/word/2010/wordml" xmlns:w15="http://schemas.microsoft.com/office/word/2012/wordml" xmlns:w16cex="http://schemas.microsoft.com/office/word/2018/wordml/cex" xmlns:w16cid="http://schemas.microsoft.com/office/word/2016/wordml/cid" xmlns:w16="http://schemas.microsoft.com/office/word/2018/wordml" xmlns:w16sdtdh="http://schemas.microsoft.com/office/word/2020/wordml/sdtdatahash" xmlns:w16se="http://schemas.microsoft.com/office/word/2015/wordml/symex" xmlns:wpg="http://schemas.microsoft.com/office/word/2010/wordprocessingGroup" xmlns:wpi="http://schemas.microsoft.com/office/word/2010/wordprocessingInk" xmlns:wne="http://schemas.microsoft.com/office/word/2006/wordml" xmlns:wps="http://schemas.microsoft.com/office/word/2010/wordprocessingShape" mc:Ignorable="w14 w15 w16se w16cid w16 w16cex w16sdtdh wp14">
   <w:footnote w:type="separator" w:id="-1">
     <w:p>
       <w:pPr>
@@ -2489,7 +2369,7 @@
 </file>
 
 <file path=word/header1.xml><?xml version="1.0" encoding="utf-8"?>
-<w:hdr xmlns:wpc="http://schemas.microsoft.com/office/word/2010/wordprocessingCanvas" xmlns:cx="http://schemas.microsoft.com/office/drawing/2014/chartex" xmlns:cx1="http://schemas.microsoft.com/office/drawing/2015/9/8/chartex" xmlns:cx2="http://schemas.microsoft.com/office/drawing/2015/10/21/chartex" xmlns:cx3="http://schemas.microsoft.com/office/drawing/2016/5/9/chartex" xmlns:cx4="http://schemas.microsoft.com/office/drawing/2016/5/10/chartex" xmlns:cx5="http://schemas.microsoft.com/office/drawing/2016/5/11/chartex" xmlns:cx6="http://schemas.microsoft.com/office/drawing/2016/5/12/chartex" xmlns:cx7="http://schemas.microsoft.com/office/drawing/2016/5/13/chartex" xmlns:cx8="http://schemas.microsoft.com/office/drawing/2016/5/14/chartex" xmlns:mc="http://schemas.openxmlformats.org/markup-compatibility/2006" xmlns:aink="http://schemas.microsoft.com/office/drawing/2016/ink" xmlns:am3d="http://schemas.microsoft.com/office/drawing/2017/model3d" xmlns:o="urn:schemas-microsoft-com:office:office" xmlns:oel="http://schemas.microsoft.com/office/2019/extlst" xmlns:r="http://schemas.openxmlformats.org/officeDocument/2006/relationships" xmlns:m="http://schemas.openxmlformats.org/officeDocument/2006/math" xmlns:v="urn:schemas-microsoft-com:vml" xmlns:wp14="http://schemas.microsoft.com/office/word/2010/wordprocessingDrawing" xmlns:wp="http://schemas.openxmlformats.org/drawingml/2006/wordprocessingDrawing" xmlns:w10="urn:schemas-microsoft-com:office:word" xmlns:w="http://schemas.openxmlformats.org/wordprocessingml/2006/main" xmlns:w14="http://schemas.microsoft.com/office/word/2010/wordml" xmlns:w15="http://schemas.microsoft.com/office/word/2012/wordml" xmlns:w16cex="http://schemas.microsoft.com/office/word/2018/wordml/cex" xmlns:w16cid="http://schemas.microsoft.com/office/word/2016/wordml/cid" xmlns:w16="http://schemas.microsoft.com/office/word/2018/wordml" xmlns:w16du="http://schemas.microsoft.com/office/word/2023/wordml/word16du" xmlns:w16sdtdh="http://schemas.microsoft.com/office/word/2020/wordml/sdtdatahash" xmlns:w16sdtfl="http://schemas.microsoft.com/office/word/2024/wordml/sdtformatlock" xmlns:w16se="http://schemas.microsoft.com/office/word/2015/wordml/symex" xmlns:wpg="http://schemas.microsoft.com/office/word/2010/wordprocessingGroup" xmlns:wpi="http://schemas.microsoft.com/office/word/2010/wordprocessingInk" xmlns:wne="http://schemas.microsoft.com/office/word/2006/wordml" xmlns:wps="http://schemas.microsoft.com/office/word/2010/wordprocessingShape" mc:Ignorable="w14 w15 w16se w16cid w16 w16cex w16sdtdh w16sdtfl w16du wp14">
+<w:hdr xmlns:wpc="http://schemas.microsoft.com/office/word/2010/wordprocessingCanvas" xmlns:cx="http://schemas.microsoft.com/office/drawing/2014/chartex" xmlns:cx1="http://schemas.microsoft.com/office/drawing/2015/9/8/chartex" xmlns:cx2="http://schemas.microsoft.com/office/drawing/2015/10/21/chartex" xmlns:cx3="http://schemas.microsoft.com/office/drawing/2016/5/9/chartex" xmlns:cx4="http://schemas.microsoft.com/office/drawing/2016/5/10/chartex" xmlns:cx5="http://schemas.microsoft.com/office/drawing/2016/5/11/chartex" xmlns:cx6="http://schemas.microsoft.com/office/drawing/2016/5/12/chartex" xmlns:cx7="http://schemas.microsoft.com/office/drawing/2016/5/13/chartex" xmlns:cx8="http://schemas.microsoft.com/office/drawing/2016/5/14/chartex" xmlns:mc="http://schemas.openxmlformats.org/markup-compatibility/2006" xmlns:aink="http://schemas.microsoft.com/office/drawing/2016/ink" xmlns:am3d="http://schemas.microsoft.com/office/drawing/2017/model3d" xmlns:o="urn:schemas-microsoft-com:office:office" xmlns:oel="http://schemas.microsoft.com/office/2019/extlst" xmlns:r="http://schemas.openxmlformats.org/officeDocument/2006/relationships" xmlns:m="http://schemas.openxmlformats.org/officeDocument/2006/math" xmlns:v="urn:schemas-microsoft-com:vml" xmlns:wp14="http://schemas.microsoft.com/office/word/2010/wordprocessingDrawing" xmlns:wp="http://schemas.openxmlformats.org/drawingml/2006/wordprocessingDrawing" xmlns:w10="urn:schemas-microsoft-com:office:word" xmlns:w="http://schemas.openxmlformats.org/wordprocessingml/2006/main" xmlns:w14="http://schemas.microsoft.com/office/word/2010/wordml" xmlns:w15="http://schemas.microsoft.com/office/word/2012/wordml" xmlns:w16cex="http://schemas.microsoft.com/office/word/2018/wordml/cex" xmlns:w16cid="http://schemas.microsoft.com/office/word/2016/wordml/cid" xmlns:w16="http://schemas.microsoft.com/office/word/2018/wordml" xmlns:w16sdtdh="http://schemas.microsoft.com/office/word/2020/wordml/sdtdatahash" xmlns:w16se="http://schemas.microsoft.com/office/word/2015/wordml/symex" xmlns:wpg="http://schemas.microsoft.com/office/word/2010/wordprocessingGroup" xmlns:wpi="http://schemas.microsoft.com/office/word/2010/wordprocessingInk" xmlns:wne="http://schemas.microsoft.com/office/word/2006/wordml" xmlns:wps="http://schemas.microsoft.com/office/word/2010/wordprocessingShape" mc:Ignorable="w14 w15 w16se w16cid w16 w16cex w16sdtdh wp14">
   <w:sdt>
     <w:sdtPr>
       <w:rPr>
@@ -2501,6 +2381,11 @@
         <w:docPartUnique/>
       </w:docPartObj>
     </w:sdtPr>
+    <w:sdtEndPr>
+      <w:rPr>
+        <w:rStyle w:val="af1"/>
+      </w:rPr>
+    </w:sdtEndPr>
     <w:sdtContent>
       <w:p>
         <w:pPr>
@@ -2540,7 +2425,7 @@
 </file>
 
 <file path=word/header2.xml><?xml version="1.0" encoding="utf-8"?>
-<w:hdr xmlns:wpc="http://schemas.microsoft.com/office/word/2010/wordprocessingCanvas" xmlns:cx="http://schemas.microsoft.com/office/drawing/2014/chartex" xmlns:cx1="http://schemas.microsoft.com/office/drawing/2015/9/8/chartex" xmlns:cx2="http://schemas.microsoft.com/office/drawing/2015/10/21/chartex" xmlns:cx3="http://schemas.microsoft.com/office/drawing/2016/5/9/chartex" xmlns:cx4="http://schemas.microsoft.com/office/drawing/2016/5/10/chartex" xmlns:cx5="http://schemas.microsoft.com/office/drawing/2016/5/11/chartex" xmlns:cx6="http://schemas.microsoft.com/office/drawing/2016/5/12/chartex" xmlns:cx7="http://schemas.microsoft.com/office/drawing/2016/5/13/chartex" xmlns:cx8="http://schemas.microsoft.com/office/drawing/2016/5/14/chartex" xmlns:mc="http://schemas.openxmlformats.org/markup-compatibility/2006" xmlns:aink="http://schemas.microsoft.com/office/drawing/2016/ink" xmlns:am3d="http://schemas.microsoft.com/office/drawing/2017/model3d" xmlns:o="urn:schemas-microsoft-com:office:office" xmlns:oel="http://schemas.microsoft.com/office/2019/extlst" xmlns:r="http://schemas.openxmlformats.org/officeDocument/2006/relationships" xmlns:m="http://schemas.openxmlformats.org/officeDocument/2006/math" xmlns:v="urn:schemas-microsoft-com:vml" xmlns:wp14="http://schemas.microsoft.com/office/word/2010/wordprocessingDrawing" xmlns:wp="http://schemas.openxmlformats.org/drawingml/2006/wordprocessingDrawing" xmlns:w10="urn:schemas-microsoft-com:office:word" xmlns:w="http://schemas.openxmlformats.org/wordprocessingml/2006/main" xmlns:w14="http://schemas.microsoft.com/office/word/2010/wordml" xmlns:w15="http://schemas.microsoft.com/office/word/2012/wordml" xmlns:w16cex="http://schemas.microsoft.com/office/word/2018/wordml/cex" xmlns:w16cid="http://schemas.microsoft.com/office/word/2016/wordml/cid" xmlns:w16="http://schemas.microsoft.com/office/word/2018/wordml" xmlns:w16du="http://schemas.microsoft.com/office/word/2023/wordml/word16du" xmlns:w16sdtdh="http://schemas.microsoft.com/office/word/2020/wordml/sdtdatahash" xmlns:w16sdtfl="http://schemas.microsoft.com/office/word/2024/wordml/sdtformatlock" xmlns:w16se="http://schemas.microsoft.com/office/word/2015/wordml/symex" xmlns:wpg="http://schemas.microsoft.com/office/word/2010/wordprocessingGroup" xmlns:wpi="http://schemas.microsoft.com/office/word/2010/wordprocessingInk" xmlns:wne="http://schemas.microsoft.com/office/word/2006/wordml" xmlns:wps="http://schemas.microsoft.com/office/word/2010/wordprocessingShape" mc:Ignorable="w14 w15 w16se w16cid w16 w16cex w16sdtdh w16sdtfl w16du wp14">
+<w:hdr xmlns:wpc="http://schemas.microsoft.com/office/word/2010/wordprocessingCanvas" xmlns:cx="http://schemas.microsoft.com/office/drawing/2014/chartex" xmlns:cx1="http://schemas.microsoft.com/office/drawing/2015/9/8/chartex" xmlns:cx2="http://schemas.microsoft.com/office/drawing/2015/10/21/chartex" xmlns:cx3="http://schemas.microsoft.com/office/drawing/2016/5/9/chartex" xmlns:cx4="http://schemas.microsoft.com/office/drawing/2016/5/10/chartex" xmlns:cx5="http://schemas.microsoft.com/office/drawing/2016/5/11/chartex" xmlns:cx6="http://schemas.microsoft.com/office/drawing/2016/5/12/chartex" xmlns:cx7="http://schemas.microsoft.com/office/drawing/2016/5/13/chartex" xmlns:cx8="http://schemas.microsoft.com/office/drawing/2016/5/14/chartex" xmlns:mc="http://schemas.openxmlformats.org/markup-compatibility/2006" xmlns:aink="http://schemas.microsoft.com/office/drawing/2016/ink" xmlns:am3d="http://schemas.microsoft.com/office/drawing/2017/model3d" xmlns:o="urn:schemas-microsoft-com:office:office" xmlns:oel="http://schemas.microsoft.com/office/2019/extlst" xmlns:r="http://schemas.openxmlformats.org/officeDocument/2006/relationships" xmlns:m="http://schemas.openxmlformats.org/officeDocument/2006/math" xmlns:v="urn:schemas-microsoft-com:vml" xmlns:wp14="http://schemas.microsoft.com/office/word/2010/wordprocessingDrawing" xmlns:wp="http://schemas.openxmlformats.org/drawingml/2006/wordprocessingDrawing" xmlns:w10="urn:schemas-microsoft-com:office:word" xmlns:w="http://schemas.openxmlformats.org/wordprocessingml/2006/main" xmlns:w14="http://schemas.microsoft.com/office/word/2010/wordml" xmlns:w15="http://schemas.microsoft.com/office/word/2012/wordml" xmlns:w16cex="http://schemas.microsoft.com/office/word/2018/wordml/cex" xmlns:w16cid="http://schemas.microsoft.com/office/word/2016/wordml/cid" xmlns:w16="http://schemas.microsoft.com/office/word/2018/wordml" xmlns:w16sdtdh="http://schemas.microsoft.com/office/word/2020/wordml/sdtdatahash" xmlns:w16se="http://schemas.microsoft.com/office/word/2015/wordml/symex" xmlns:wpg="http://schemas.microsoft.com/office/word/2010/wordprocessingGroup" xmlns:wpi="http://schemas.microsoft.com/office/word/2010/wordprocessingInk" xmlns:wne="http://schemas.microsoft.com/office/word/2006/wordml" xmlns:wps="http://schemas.microsoft.com/office/word/2010/wordprocessingShape" mc:Ignorable="w14 w15 w16se w16cid w16 w16cex w16sdtdh wp14">
   <w:sdt>
     <w:sdtPr>
       <w:rPr>
@@ -2552,6 +2437,11 @@
         <w:docPartUnique/>
       </w:docPartObj>
     </w:sdtPr>
+    <w:sdtEndPr>
+      <w:rPr>
+        <w:rStyle w:val="af1"/>
+      </w:rPr>
+    </w:sdtEndPr>
     <w:sdtContent>
       <w:p>
         <w:pPr>
@@ -2604,7 +2494,7 @@
 </file>
 
 <file path=word/header3.xml><?xml version="1.0" encoding="utf-8"?>
-<w:hdr xmlns:wpc="http://schemas.microsoft.com/office/word/2010/wordprocessingCanvas" xmlns:cx="http://schemas.microsoft.com/office/drawing/2014/chartex" xmlns:cx1="http://schemas.microsoft.com/office/drawing/2015/9/8/chartex" xmlns:cx2="http://schemas.microsoft.com/office/drawing/2015/10/21/chartex" xmlns:cx3="http://schemas.microsoft.com/office/drawing/2016/5/9/chartex" xmlns:cx4="http://schemas.microsoft.com/office/drawing/2016/5/10/chartex" xmlns:cx5="http://schemas.microsoft.com/office/drawing/2016/5/11/chartex" xmlns:cx6="http://schemas.microsoft.com/office/drawing/2016/5/12/chartex" xmlns:cx7="http://schemas.microsoft.com/office/drawing/2016/5/13/chartex" xmlns:cx8="http://schemas.microsoft.com/office/drawing/2016/5/14/chartex" xmlns:mc="http://schemas.openxmlformats.org/markup-compatibility/2006" xmlns:aink="http://schemas.microsoft.com/office/drawing/2016/ink" xmlns:am3d="http://schemas.microsoft.com/office/drawing/2017/model3d" xmlns:o="urn:schemas-microsoft-com:office:office" xmlns:oel="http://schemas.microsoft.com/office/2019/extlst" xmlns:r="http://schemas.openxmlformats.org/officeDocument/2006/relationships" xmlns:m="http://schemas.openxmlformats.org/officeDocument/2006/math" xmlns:v="urn:schemas-microsoft-com:vml" xmlns:wp14="http://schemas.microsoft.com/office/word/2010/wordprocessingDrawing" xmlns:wp="http://schemas.openxmlformats.org/drawingml/2006/wordprocessingDrawing" xmlns:w10="urn:schemas-microsoft-com:office:word" xmlns:w="http://schemas.openxmlformats.org/wordprocessingml/2006/main" xmlns:w14="http://schemas.microsoft.com/office/word/2010/wordml" xmlns:w15="http://schemas.microsoft.com/office/word/2012/wordml" xmlns:w16cex="http://schemas.microsoft.com/office/word/2018/wordml/cex" xmlns:w16cid="http://schemas.microsoft.com/office/word/2016/wordml/cid" xmlns:w16="http://schemas.microsoft.com/office/word/2018/wordml" xmlns:w16du="http://schemas.microsoft.com/office/word/2023/wordml/word16du" xmlns:w16sdtdh="http://schemas.microsoft.com/office/word/2020/wordml/sdtdatahash" xmlns:w16sdtfl="http://schemas.microsoft.com/office/word/2024/wordml/sdtformatlock" xmlns:w16se="http://schemas.microsoft.com/office/word/2015/wordml/symex" xmlns:wpg="http://schemas.microsoft.com/office/word/2010/wordprocessingGroup" xmlns:wpi="http://schemas.microsoft.com/office/word/2010/wordprocessingInk" xmlns:wne="http://schemas.microsoft.com/office/word/2006/wordml" xmlns:wps="http://schemas.microsoft.com/office/word/2010/wordprocessingShape" mc:Ignorable="w14 w15 w16se w16cid w16 w16cex w16sdtdh w16sdtfl w16du wp14">
+<w:hdr xmlns:wpc="http://schemas.microsoft.com/office/word/2010/wordprocessingCanvas" xmlns:cx="http://schemas.microsoft.com/office/drawing/2014/chartex" xmlns:cx1="http://schemas.microsoft.com/office/drawing/2015/9/8/chartex" xmlns:cx2="http://schemas.microsoft.com/office/drawing/2015/10/21/chartex" xmlns:cx3="http://schemas.microsoft.com/office/drawing/2016/5/9/chartex" xmlns:cx4="http://schemas.microsoft.com/office/drawing/2016/5/10/chartex" xmlns:cx5="http://schemas.microsoft.com/office/drawing/2016/5/11/chartex" xmlns:cx6="http://schemas.microsoft.com/office/drawing/2016/5/12/chartex" xmlns:cx7="http://schemas.microsoft.com/office/drawing/2016/5/13/chartex" xmlns:cx8="http://schemas.microsoft.com/office/drawing/2016/5/14/chartex" xmlns:mc="http://schemas.openxmlformats.org/markup-compatibility/2006" xmlns:aink="http://schemas.microsoft.com/office/drawing/2016/ink" xmlns:am3d="http://schemas.microsoft.com/office/drawing/2017/model3d" xmlns:o="urn:schemas-microsoft-com:office:office" xmlns:oel="http://schemas.microsoft.com/office/2019/extlst" xmlns:r="http://schemas.openxmlformats.org/officeDocument/2006/relationships" xmlns:m="http://schemas.openxmlformats.org/officeDocument/2006/math" xmlns:v="urn:schemas-microsoft-com:vml" xmlns:wp14="http://schemas.microsoft.com/office/word/2010/wordprocessingDrawing" xmlns:wp="http://schemas.openxmlformats.org/drawingml/2006/wordprocessingDrawing" xmlns:w10="urn:schemas-microsoft-com:office:word" xmlns:w="http://schemas.openxmlformats.org/wordprocessingml/2006/main" xmlns:w14="http://schemas.microsoft.com/office/word/2010/wordml" xmlns:w15="http://schemas.microsoft.com/office/word/2012/wordml" xmlns:w16cex="http://schemas.microsoft.com/office/word/2018/wordml/cex" xmlns:w16cid="http://schemas.microsoft.com/office/word/2016/wordml/cid" xmlns:w16="http://schemas.microsoft.com/office/word/2018/wordml" xmlns:w16sdtdh="http://schemas.microsoft.com/office/word/2020/wordml/sdtdatahash" xmlns:w16se="http://schemas.microsoft.com/office/word/2015/wordml/symex" xmlns:wpg="http://schemas.microsoft.com/office/word/2010/wordprocessingGroup" xmlns:wpi="http://schemas.microsoft.com/office/word/2010/wordprocessingInk" xmlns:wne="http://schemas.microsoft.com/office/word/2006/wordml" xmlns:wps="http://schemas.microsoft.com/office/word/2010/wordprocessingShape" mc:Ignorable="w14 w15 w16se w16cid w16 w16cex w16sdtdh wp14">
   <w:p>
     <w:pPr>
       <w:spacing w:line="240" w:lineRule="auto"/>
@@ -2748,7 +2638,7 @@
 </file>
 
 <file path=word/numbering.xml><?xml version="1.0" encoding="utf-8"?>
-<w:numbering xmlns:wpc="http://schemas.microsoft.com/office/word/2010/wordprocessingCanvas" xmlns:cx="http://schemas.microsoft.com/office/drawing/2014/chartex" xmlns:cx1="http://schemas.microsoft.com/office/drawing/2015/9/8/chartex" xmlns:cx2="http://schemas.microsoft.com/office/drawing/2015/10/21/chartex" xmlns:cx3="http://schemas.microsoft.com/office/drawing/2016/5/9/chartex" xmlns:cx4="http://schemas.microsoft.com/office/drawing/2016/5/10/chartex" xmlns:cx5="http://schemas.microsoft.com/office/drawing/2016/5/11/chartex" xmlns:cx6="http://schemas.microsoft.com/office/drawing/2016/5/12/chartex" xmlns:cx7="http://schemas.microsoft.com/office/drawing/2016/5/13/chartex" xmlns:cx8="http://schemas.microsoft.com/office/drawing/2016/5/14/chartex" xmlns:mc="http://schemas.openxmlformats.org/markup-compatibility/2006" xmlns:aink="http://schemas.microsoft.com/office/drawing/2016/ink" xmlns:am3d="http://schemas.microsoft.com/office/drawing/2017/model3d" xmlns:o="urn:schemas-microsoft-com:office:office" xmlns:oel="http://schemas.microsoft.com/office/2019/extlst" xmlns:r="http://schemas.openxmlformats.org/officeDocument/2006/relationships" xmlns:m="http://schemas.openxmlformats.org/officeDocument/2006/math" xmlns:v="urn:schemas-microsoft-com:vml" xmlns:wp14="http://schemas.microsoft.com/office/word/2010/wordprocessingDrawing" xmlns:wp="http://schemas.openxmlformats.org/drawingml/2006/wordprocessingDrawing" xmlns:w10="urn:schemas-microsoft-com:office:word" xmlns:w="http://schemas.openxmlformats.org/wordprocessingml/2006/main" xmlns:w14="http://schemas.microsoft.com/office/word/2010/wordml" xmlns:w15="http://schemas.microsoft.com/office/word/2012/wordml" xmlns:w16cex="http://schemas.microsoft.com/office/word/2018/wordml/cex" xmlns:w16cid="http://schemas.microsoft.com/office/word/2016/wordml/cid" xmlns:w16="http://schemas.microsoft.com/office/word/2018/wordml" xmlns:w16du="http://schemas.microsoft.com/office/word/2023/wordml/word16du" xmlns:w16sdtdh="http://schemas.microsoft.com/office/word/2020/wordml/sdtdatahash" xmlns:w16sdtfl="http://schemas.microsoft.com/office/word/2024/wordml/sdtformatlock" xmlns:w16se="http://schemas.microsoft.com/office/word/2015/wordml/symex" xmlns:wpg="http://schemas.microsoft.com/office/word/2010/wordprocessingGroup" xmlns:wpi="http://schemas.microsoft.com/office/word/2010/wordprocessingInk" xmlns:wne="http://schemas.microsoft.com/office/word/2006/wordml" xmlns:wps="http://schemas.microsoft.com/office/word/2010/wordprocessingShape" mc:Ignorable="w14 w15 w16se w16cid w16 w16cex w16sdtdh w16sdtfl w16du wp14">
+<w:numbering xmlns:wpc="http://schemas.microsoft.com/office/word/2010/wordprocessingCanvas" xmlns:cx="http://schemas.microsoft.com/office/drawing/2014/chartex" xmlns:cx1="http://schemas.microsoft.com/office/drawing/2015/9/8/chartex" xmlns:cx2="http://schemas.microsoft.com/office/drawing/2015/10/21/chartex" xmlns:cx3="http://schemas.microsoft.com/office/drawing/2016/5/9/chartex" xmlns:cx4="http://schemas.microsoft.com/office/drawing/2016/5/10/chartex" xmlns:cx5="http://schemas.microsoft.com/office/drawing/2016/5/11/chartex" xmlns:cx6="http://schemas.microsoft.com/office/drawing/2016/5/12/chartex" xmlns:cx7="http://schemas.microsoft.com/office/drawing/2016/5/13/chartex" xmlns:cx8="http://schemas.microsoft.com/office/drawing/2016/5/14/chartex" xmlns:mc="http://schemas.openxmlformats.org/markup-compatibility/2006" xmlns:aink="http://schemas.microsoft.com/office/drawing/2016/ink" xmlns:am3d="http://schemas.microsoft.com/office/drawing/2017/model3d" xmlns:o="urn:schemas-microsoft-com:office:office" xmlns:oel="http://schemas.microsoft.com/office/2019/extlst" xmlns:r="http://schemas.openxmlformats.org/officeDocument/2006/relationships" xmlns:m="http://schemas.openxmlformats.org/officeDocument/2006/math" xmlns:v="urn:schemas-microsoft-com:vml" xmlns:wp14="http://schemas.microsoft.com/office/word/2010/wordprocessingDrawing" xmlns:wp="http://schemas.openxmlformats.org/drawingml/2006/wordprocessingDrawing" xmlns:w10="urn:schemas-microsoft-com:office:word" xmlns:w="http://schemas.openxmlformats.org/wordprocessingml/2006/main" xmlns:w14="http://schemas.microsoft.com/office/word/2010/wordml" xmlns:w15="http://schemas.microsoft.com/office/word/2012/wordml" xmlns:w16cex="http://schemas.microsoft.com/office/word/2018/wordml/cex" xmlns:w16cid="http://schemas.microsoft.com/office/word/2016/wordml/cid" xmlns:w16="http://schemas.microsoft.com/office/word/2018/wordml" xmlns:w16sdtdh="http://schemas.microsoft.com/office/word/2020/wordml/sdtdatahash" xmlns:w16se="http://schemas.microsoft.com/office/word/2015/wordml/symex" xmlns:wpg="http://schemas.microsoft.com/office/word/2010/wordprocessingGroup" xmlns:wpi="http://schemas.microsoft.com/office/word/2010/wordprocessingInk" xmlns:wne="http://schemas.microsoft.com/office/word/2006/wordml" xmlns:wps="http://schemas.microsoft.com/office/word/2010/wordprocessingShape" mc:Ignorable="w14 w15 w16se w16cid w16 w16cex w16sdtdh wp14">
   <w:abstractNum w:abstractNumId="0" w15:restartNumberingAfterBreak="0">
     <w:nsid w:val="007B1D9F"/>
     <w:multiLevelType w:val="hybridMultilevel"/>
@@ -5114,7 +5004,7 @@
 </file>
 
 <file path=word/styles.xml><?xml version="1.0" encoding="utf-8"?>
-<w:styles xmlns:mc="http://schemas.openxmlformats.org/markup-compatibility/2006" xmlns:r="http://schemas.openxmlformats.org/officeDocument/2006/relationships" xmlns:w="http://schemas.openxmlformats.org/wordprocessingml/2006/main" xmlns:w14="http://schemas.microsoft.com/office/word/2010/wordml" xmlns:w15="http://schemas.microsoft.com/office/word/2012/wordml" xmlns:w16cex="http://schemas.microsoft.com/office/word/2018/wordml/cex" xmlns:w16cid="http://schemas.microsoft.com/office/word/2016/wordml/cid" xmlns:w16="http://schemas.microsoft.com/office/word/2018/wordml" xmlns:w16du="http://schemas.microsoft.com/office/word/2023/wordml/word16du" xmlns:w16sdtdh="http://schemas.microsoft.com/office/word/2020/wordml/sdtdatahash" xmlns:w16sdtfl="http://schemas.microsoft.com/office/word/2024/wordml/sdtformatlock" xmlns:w16se="http://schemas.microsoft.com/office/word/2015/wordml/symex" mc:Ignorable="w14 w15 w16se w16cid w16 w16cex w16sdtdh w16sdtfl w16du">
+<w:styles xmlns:mc="http://schemas.openxmlformats.org/markup-compatibility/2006" xmlns:r="http://schemas.openxmlformats.org/officeDocument/2006/relationships" xmlns:w="http://schemas.openxmlformats.org/wordprocessingml/2006/main" xmlns:w14="http://schemas.microsoft.com/office/word/2010/wordml" xmlns:w15="http://schemas.microsoft.com/office/word/2012/wordml" xmlns:w16cex="http://schemas.microsoft.com/office/word/2018/wordml/cex" xmlns:w16cid="http://schemas.microsoft.com/office/word/2016/wordml/cid" xmlns:w16="http://schemas.microsoft.com/office/word/2018/wordml" xmlns:w16sdtdh="http://schemas.microsoft.com/office/word/2020/wordml/sdtdatahash" xmlns:w16se="http://schemas.microsoft.com/office/word/2015/wordml/symex" mc:Ignorable="w14 w15 w16se w16cid w16 w16cex w16sdtdh">
   <w:docDefaults>
     <w:rPrDefault>
       <w:rPr>

</xml_diff>

<commit_message>
add some missing things from course 1
</commit_message>
<xml_diff>
--- a/Курс 2/Основы Data Science/Лабораторные/05. Изучение связей между переменными/Отчёт5.docx
+++ b/Курс 2/Основы Data Science/Лабораторные/05. Изучение связей между переменными/Отчёт5.docx
@@ -1,6 +1,6 @@
 
 <file path=word/document.xml><?xml version="1.0" encoding="utf-8"?>
-<w:document xmlns:wpc="http://schemas.microsoft.com/office/word/2010/wordprocessingCanvas" xmlns:cx="http://schemas.microsoft.com/office/drawing/2014/chartex" xmlns:cx1="http://schemas.microsoft.com/office/drawing/2015/9/8/chartex" xmlns:cx2="http://schemas.microsoft.com/office/drawing/2015/10/21/chartex" xmlns:cx3="http://schemas.microsoft.com/office/drawing/2016/5/9/chartex" xmlns:cx4="http://schemas.microsoft.com/office/drawing/2016/5/10/chartex" xmlns:cx5="http://schemas.microsoft.com/office/drawing/2016/5/11/chartex" xmlns:cx6="http://schemas.microsoft.com/office/drawing/2016/5/12/chartex" xmlns:cx7="http://schemas.microsoft.com/office/drawing/2016/5/13/chartex" xmlns:cx8="http://schemas.microsoft.com/office/drawing/2016/5/14/chartex" xmlns:mc="http://schemas.openxmlformats.org/markup-compatibility/2006" xmlns:aink="http://schemas.microsoft.com/office/drawing/2016/ink" xmlns:am3d="http://schemas.microsoft.com/office/drawing/2017/model3d" xmlns:o="urn:schemas-microsoft-com:office:office" xmlns:oel="http://schemas.microsoft.com/office/2019/extlst" xmlns:r="http://schemas.openxmlformats.org/officeDocument/2006/relationships" xmlns:m="http://schemas.openxmlformats.org/officeDocument/2006/math" xmlns:v="urn:schemas-microsoft-com:vml" xmlns:wp14="http://schemas.microsoft.com/office/word/2010/wordprocessingDrawing" xmlns:wp="http://schemas.openxmlformats.org/drawingml/2006/wordprocessingDrawing" xmlns:w10="urn:schemas-microsoft-com:office:word" xmlns:w="http://schemas.openxmlformats.org/wordprocessingml/2006/main" xmlns:w14="http://schemas.microsoft.com/office/word/2010/wordml" xmlns:w15="http://schemas.microsoft.com/office/word/2012/wordml" xmlns:w16cex="http://schemas.microsoft.com/office/word/2018/wordml/cex" xmlns:w16cid="http://schemas.microsoft.com/office/word/2016/wordml/cid" xmlns:w16="http://schemas.microsoft.com/office/word/2018/wordml" xmlns:w16sdtdh="http://schemas.microsoft.com/office/word/2020/wordml/sdtdatahash" xmlns:w16se="http://schemas.microsoft.com/office/word/2015/wordml/symex" xmlns:wpg="http://schemas.microsoft.com/office/word/2010/wordprocessingGroup" xmlns:wpi="http://schemas.microsoft.com/office/word/2010/wordprocessingInk" xmlns:wne="http://schemas.microsoft.com/office/word/2006/wordml" xmlns:wps="http://schemas.microsoft.com/office/word/2010/wordprocessingShape" mc:Ignorable="w14 w15 w16se w16cid w16 w16cex w16sdtdh wp14">
+<w:document xmlns:wpc="http://schemas.microsoft.com/office/word/2010/wordprocessingCanvas" xmlns:cx="http://schemas.microsoft.com/office/drawing/2014/chartex" xmlns:cx1="http://schemas.microsoft.com/office/drawing/2015/9/8/chartex" xmlns:cx2="http://schemas.microsoft.com/office/drawing/2015/10/21/chartex" xmlns:cx3="http://schemas.microsoft.com/office/drawing/2016/5/9/chartex" xmlns:cx4="http://schemas.microsoft.com/office/drawing/2016/5/10/chartex" xmlns:cx5="http://schemas.microsoft.com/office/drawing/2016/5/11/chartex" xmlns:cx6="http://schemas.microsoft.com/office/drawing/2016/5/12/chartex" xmlns:cx7="http://schemas.microsoft.com/office/drawing/2016/5/13/chartex" xmlns:cx8="http://schemas.microsoft.com/office/drawing/2016/5/14/chartex" xmlns:mc="http://schemas.openxmlformats.org/markup-compatibility/2006" xmlns:aink="http://schemas.microsoft.com/office/drawing/2016/ink" xmlns:am3d="http://schemas.microsoft.com/office/drawing/2017/model3d" xmlns:o="urn:schemas-microsoft-com:office:office" xmlns:oel="http://schemas.microsoft.com/office/2019/extlst" xmlns:r="http://schemas.openxmlformats.org/officeDocument/2006/relationships" xmlns:m="http://schemas.openxmlformats.org/officeDocument/2006/math" xmlns:v="urn:schemas-microsoft-com:vml" xmlns:wp14="http://schemas.microsoft.com/office/word/2010/wordprocessingDrawing" xmlns:wp="http://schemas.openxmlformats.org/drawingml/2006/wordprocessingDrawing" xmlns:w10="urn:schemas-microsoft-com:office:word" xmlns:w="http://schemas.openxmlformats.org/wordprocessingml/2006/main" xmlns:w14="http://schemas.microsoft.com/office/word/2010/wordml" xmlns:w15="http://schemas.microsoft.com/office/word/2012/wordml" xmlns:w16cex="http://schemas.microsoft.com/office/word/2018/wordml/cex" xmlns:w16cid="http://schemas.microsoft.com/office/word/2016/wordml/cid" xmlns:w16="http://schemas.microsoft.com/office/word/2018/wordml" xmlns:w16du="http://schemas.microsoft.com/office/word/2023/wordml/word16du" xmlns:w16sdtdh="http://schemas.microsoft.com/office/word/2020/wordml/sdtdatahash" xmlns:w16sdtfl="http://schemas.microsoft.com/office/word/2024/wordml/sdtformatlock" xmlns:w16se="http://schemas.microsoft.com/office/word/2015/wordml/symex" xmlns:wpg="http://schemas.microsoft.com/office/word/2010/wordprocessingGroup" xmlns:wpi="http://schemas.microsoft.com/office/word/2010/wordprocessingInk" xmlns:wne="http://schemas.microsoft.com/office/word/2006/wordml" xmlns:wps="http://schemas.microsoft.com/office/word/2010/wordprocessingShape" mc:Ignorable="w14 w15 w16se w16cid w16 w16cex w16sdtdh w16sdtfl w16du wp14">
   <w:body>
     <w:p>
       <w:pPr>
@@ -989,7 +989,21 @@
         <w:rPr>
           <w:lang w:val="ru-RU" w:eastAsia="ru-RU"/>
         </w:rPr>
-        <w:t>2. Выберите зависимости, для которых можно воспользоваться ранговым коэффициентом Спирмена. Вычислите те, которые могут быть использованы при описании данных. Вычислите и оцените коэффициент.</w:t>
+        <w:t xml:space="preserve">2. Выберите зависимости, для которых можно воспользоваться ранговым коэффициентом </w:t>
+      </w:r>
+      <w:proofErr w:type="spellStart"/>
+      <w:r>
+        <w:rPr>
+          <w:lang w:val="ru-RU" w:eastAsia="ru-RU"/>
+        </w:rPr>
+        <w:t>Спирмена</w:t>
+      </w:r>
+      <w:proofErr w:type="spellEnd"/>
+      <w:r>
+        <w:rPr>
+          <w:lang w:val="ru-RU" w:eastAsia="ru-RU"/>
+        </w:rPr>
+        <w:t>. Вычислите те, которые могут быть использованы при описании данных. Вычислите и оцените коэффициент.</w:t>
       </w:r>
     </w:p>
     <w:p>
@@ -1138,7 +1152,21 @@
         <w:rPr>
           <w:lang w:val="ru-RU"/>
         </w:rPr>
-        <w:t xml:space="preserve">Коэффициент Спирмена </w:t>
+        <w:t xml:space="preserve">Коэффициент </w:t>
+      </w:r>
+      <w:proofErr w:type="spellStart"/>
+      <w:r>
+        <w:rPr>
+          <w:lang w:val="ru-RU"/>
+        </w:rPr>
+        <w:t>Спирмена</w:t>
+      </w:r>
+      <w:proofErr w:type="spellEnd"/>
+      <w:r>
+        <w:rPr>
+          <w:lang w:val="ru-RU"/>
+        </w:rPr>
+        <w:t xml:space="preserve"> </w:t>
       </w:r>
       <w:r>
         <w:rPr>
@@ -1150,8 +1178,16 @@
         <w:rPr>
           <w:lang w:val="ru-RU"/>
         </w:rPr>
-        <w:t>коэффициент Спирмена</w:t>
-      </w:r>
+        <w:t xml:space="preserve">коэффициент </w:t>
+      </w:r>
+      <w:proofErr w:type="spellStart"/>
+      <w:r>
+        <w:rPr>
+          <w:lang w:val="ru-RU"/>
+        </w:rPr>
+        <w:t>Спирмена</w:t>
+      </w:r>
+      <w:proofErr w:type="spellEnd"/>
       <w:r>
         <w:rPr>
           <w:lang w:val="ru-RU"/>
@@ -1583,7 +1619,23 @@
           <w:rFonts w:eastAsiaTheme="minorEastAsia"/>
           <w:lang w:val="ru-RU"/>
         </w:rPr>
-        <w:t xml:space="preserve">значение коэффициента Спирмена, </w:t>
+        <w:t xml:space="preserve">значение коэффициента </w:t>
+      </w:r>
+      <w:proofErr w:type="spellStart"/>
+      <w:r>
+        <w:rPr>
+          <w:rFonts w:eastAsiaTheme="minorEastAsia"/>
+          <w:lang w:val="ru-RU"/>
+        </w:rPr>
+        <w:t>Спирмена</w:t>
+      </w:r>
+      <w:proofErr w:type="spellEnd"/>
+      <w:r>
+        <w:rPr>
+          <w:rFonts w:eastAsiaTheme="minorEastAsia"/>
+          <w:lang w:val="ru-RU"/>
+        </w:rPr>
+        <w:t xml:space="preserve">, </w:t>
       </w:r>
       <m:oMath>
         <m:r>
@@ -1785,6 +1837,185 @@
           <w:lang w:val="ru-RU"/>
         </w:rPr>
         <w:t xml:space="preserve"> </w:t>
+      </w:r>
+    </w:p>
+    <w:p>
+      <w:pPr>
+        <w:rPr>
+          <w:rFonts w:eastAsiaTheme="minorEastAsia"/>
+          <w:lang w:val="ru-RU"/>
+        </w:rPr>
+      </w:pPr>
+      <w:r>
+        <w:rPr>
+          <w:rFonts w:eastAsiaTheme="minorEastAsia"/>
+          <w:lang w:val="ru-RU"/>
+        </w:rPr>
+        <w:t xml:space="preserve">Гипотезы для </w:t>
+      </w:r>
+      <w:r>
+        <w:rPr>
+          <w:rFonts w:eastAsiaTheme="minorEastAsia"/>
+        </w:rPr>
+        <w:t>t-</w:t>
+      </w:r>
+      <w:r>
+        <w:rPr>
+          <w:rFonts w:eastAsiaTheme="minorEastAsia"/>
+          <w:lang w:val="ru-RU"/>
+        </w:rPr>
+        <w:t>критерия:</w:t>
+      </w:r>
+    </w:p>
+    <w:p>
+      <w:pPr>
+        <w:rPr>
+          <w:rFonts w:eastAsiaTheme="minorEastAsia"/>
+          <w:lang w:val="ru-RU"/>
+        </w:rPr>
+      </w:pPr>
+      <m:oMath>
+        <m:r>
+          <w:rPr>
+            <w:rFonts w:ascii="Cambria Math" w:eastAsiaTheme="minorEastAsia" w:hAnsi="Cambria Math"/>
+          </w:rPr>
+          <m:t>H</m:t>
+        </m:r>
+        <m:r>
+          <w:rPr>
+            <w:rFonts w:ascii="Cambria Math" w:eastAsiaTheme="minorEastAsia" w:hAnsi="Cambria Math"/>
+            <w:lang w:val="ru-RU"/>
+          </w:rPr>
+          <m:t>0</m:t>
+        </m:r>
+      </m:oMath>
+      <w:r>
+        <w:rPr>
+          <w:rFonts w:eastAsiaTheme="minorEastAsia"/>
+          <w:lang w:val="ru-RU"/>
+        </w:rPr>
+        <w:t xml:space="preserve"> – </w:t>
+      </w:r>
+      <w:r>
+        <w:rPr>
+          <w:rFonts w:eastAsiaTheme="minorEastAsia"/>
+          <w:lang w:val="ru-RU"/>
+        </w:rPr>
+        <w:t xml:space="preserve">между переменными нет </w:t>
+      </w:r>
+      <w:r>
+        <w:rPr>
+          <w:rFonts w:eastAsiaTheme="minorEastAsia"/>
+          <w:lang w:val="ru-RU"/>
+        </w:rPr>
+        <w:t>(линейной</w:t>
+      </w:r>
+      <w:r>
+        <w:rPr>
+          <w:rFonts w:eastAsiaTheme="minorEastAsia"/>
+          <w:lang w:val="ru-RU"/>
+        </w:rPr>
+        <w:t>/</w:t>
+      </w:r>
+      <w:r>
+        <w:rPr>
+          <w:rFonts w:eastAsiaTheme="minorEastAsia"/>
+          <w:lang w:val="ru-RU"/>
+        </w:rPr>
+        <w:t xml:space="preserve">монотонной) </w:t>
+      </w:r>
+      <w:r>
+        <w:rPr>
+          <w:rFonts w:eastAsiaTheme="minorEastAsia"/>
+          <w:lang w:val="ru-RU"/>
+        </w:rPr>
+        <w:t>зависимости</w:t>
+      </w:r>
+    </w:p>
+    <w:p>
+      <w:pPr>
+        <w:rPr>
+          <w:rFonts w:eastAsiaTheme="minorEastAsia"/>
+          <w:lang w:val="ru-RU"/>
+        </w:rPr>
+      </w:pPr>
+      <m:oMath>
+        <m:r>
+          <w:rPr>
+            <w:rFonts w:ascii="Cambria Math" w:eastAsiaTheme="minorEastAsia" w:hAnsi="Cambria Math"/>
+          </w:rPr>
+          <m:t>H</m:t>
+        </m:r>
+        <m:r>
+          <w:rPr>
+            <w:rFonts w:ascii="Cambria Math" w:eastAsiaTheme="minorEastAsia" w:hAnsi="Cambria Math"/>
+            <w:lang w:val="ru-RU"/>
+          </w:rPr>
+          <m:t>1</m:t>
+        </m:r>
+      </m:oMath>
+      <w:r>
+        <w:rPr>
+          <w:rFonts w:eastAsiaTheme="minorEastAsia"/>
+          <w:lang w:val="ru-RU"/>
+        </w:rPr>
+        <w:t xml:space="preserve"> – </w:t>
+      </w:r>
+      <w:r>
+        <w:rPr>
+          <w:rFonts w:eastAsiaTheme="minorEastAsia"/>
+          <w:lang w:val="ru-RU"/>
+        </w:rPr>
+        <w:t>между переменными существует</w:t>
+      </w:r>
+      <w:r>
+        <w:rPr>
+          <w:rFonts w:eastAsiaTheme="minorEastAsia"/>
+          <w:lang w:val="ru-RU"/>
+        </w:rPr>
+        <w:t xml:space="preserve"> (</w:t>
+      </w:r>
+      <w:r>
+        <w:rPr>
+          <w:rFonts w:eastAsiaTheme="minorEastAsia"/>
+          <w:lang w:val="ru-RU"/>
+        </w:rPr>
+        <w:t>линейн</w:t>
+      </w:r>
+      <w:r>
+        <w:rPr>
+          <w:rFonts w:eastAsiaTheme="minorEastAsia"/>
+          <w:lang w:val="ru-RU"/>
+        </w:rPr>
+        <w:t>ая</w:t>
+      </w:r>
+      <w:r>
+        <w:rPr>
+          <w:rFonts w:eastAsiaTheme="minorEastAsia"/>
+          <w:lang w:val="ru-RU"/>
+        </w:rPr>
+        <w:t>/</w:t>
+      </w:r>
+      <w:r>
+        <w:rPr>
+          <w:rFonts w:eastAsiaTheme="minorEastAsia"/>
+          <w:lang w:val="ru-RU"/>
+        </w:rPr>
+        <w:t>монотонн</w:t>
+      </w:r>
+      <w:r>
+        <w:rPr>
+          <w:rFonts w:eastAsiaTheme="minorEastAsia"/>
+          <w:lang w:val="ru-RU"/>
+        </w:rPr>
+        <w:t>ая)</w:t>
+      </w:r>
+      <w:r>
+        <w:rPr>
+          <w:rFonts w:eastAsiaTheme="minorEastAsia"/>
+          <w:lang w:val="ru-RU"/>
+        </w:rPr>
+        <w:t xml:space="preserve"> зависимость</w:t>
       </w:r>
     </w:p>
     <w:p>
@@ -1885,7 +2116,13 @@
         <w:rPr>
           <w:lang w:val="ru-RU"/>
         </w:rPr>
-        <w:t xml:space="preserve"> Также вычисленный коэффициент не попадает в доверительный интервал </w:t>
+        <w:t xml:space="preserve"> </w:t>
+      </w:r>
+      <w:r>
+        <w:rPr>
+          <w:lang w:val="ru-RU"/>
+        </w:rPr>
+        <w:t xml:space="preserve">Для подтверждения статистической значимости был вычислен </w:t>
       </w:r>
       <w:r>
         <w:t>t</w:t>
@@ -1894,7 +2131,75 @@
         <w:rPr>
           <w:lang w:val="ru-RU"/>
         </w:rPr>
-        <w:t>-критического, что показывает его статистическую незначительность.</w:t>
+        <w:t>-</w:t>
+      </w:r>
+      <w:r>
+        <w:rPr>
+          <w:lang w:val="ru-RU"/>
+        </w:rPr>
+        <w:t xml:space="preserve">критерий и </w:t>
+      </w:r>
+      <w:r>
+        <w:t>t</w:t>
+      </w:r>
+      <w:r>
+        <w:rPr>
+          <w:lang w:val="ru-RU"/>
+        </w:rPr>
+        <w:t>-</w:t>
+      </w:r>
+      <w:r>
+        <w:rPr>
+          <w:lang w:val="ru-RU"/>
+        </w:rPr>
+        <w:t xml:space="preserve">критическое. </w:t>
+      </w:r>
+      <w:r>
+        <w:t>T</w:t>
+      </w:r>
+      <w:r>
+        <w:rPr>
+          <w:lang w:val="ru-RU"/>
+        </w:rPr>
+        <w:t xml:space="preserve">-критерий оказался </w:t>
+      </w:r>
+      <w:r>
+        <w:rPr>
+          <w:lang w:val="ru-RU"/>
+        </w:rPr>
+        <w:t>больше</w:t>
+      </w:r>
+      <w:r>
+        <w:rPr>
+          <w:lang w:val="ru-RU"/>
+        </w:rPr>
+        <w:t xml:space="preserve"> критического, что говорит о </w:t>
+      </w:r>
+      <w:r>
+        <w:rPr>
+          <w:lang w:val="ru-RU"/>
+        </w:rPr>
+        <w:t>статистической значимости</w:t>
+      </w:r>
+      <w:r>
+        <w:rPr>
+          <w:lang w:val="ru-RU"/>
+        </w:rPr>
+        <w:t xml:space="preserve"> полученной </w:t>
+      </w:r>
+      <w:proofErr w:type="spellStart"/>
+      <w:r>
+        <w:rPr>
+          <w:lang w:val="ru-RU"/>
+        </w:rPr>
+        <w:t>корелляции</w:t>
+      </w:r>
+      <w:proofErr w:type="spellEnd"/>
+      <w:r>
+        <w:rPr>
+          <w:lang w:val="ru-RU"/>
+        </w:rPr>
+        <w:t>.</w:t>
       </w:r>
     </w:p>
     <w:p>
@@ -1912,7 +2217,28 @@
         <w:rPr>
           <w:lang w:val="ru-RU"/>
         </w:rPr>
-        <w:t xml:space="preserve">Для проведения расчёта рангового коэффициента Спирмена была выбран поиск связи между игровым стажем и часов игры в день. Значения переменных были ранжированы, после чего был получен коэффициент </w:t>
+        <w:t xml:space="preserve">Для проведения расчёта рангового коэффициента </w:t>
+      </w:r>
+      <w:proofErr w:type="spellStart"/>
+      <w:r>
+        <w:rPr>
+          <w:lang w:val="ru-RU"/>
+        </w:rPr>
+        <w:t>Спирмена</w:t>
+      </w:r>
+      <w:proofErr w:type="spellEnd"/>
+      <w:r>
+        <w:rPr>
+          <w:lang w:val="ru-RU"/>
+        </w:rPr>
+        <w:t xml:space="preserve"> была выбран поиск связи между игровым стажем и часов игры в день. Значения </w:t>
+      </w:r>
+      <w:r>
+        <w:rPr>
+          <w:lang w:val="ru-RU"/>
+        </w:rPr>
+        <w:lastRenderedPageBreak/>
+        <w:t xml:space="preserve">переменных были ранжированы, после чего был получен коэффициент </w:t>
       </w:r>
       <m:oMath>
         <m:r>
@@ -2019,7 +2345,14 @@
             <w:rFonts w:ascii="Cambria Math" w:eastAsiaTheme="minorEastAsia" w:hAnsi="Cambria Math"/>
             <w:lang w:val="ru-RU"/>
           </w:rPr>
-          <m:t>=1.96151</m:t>
+          <m:t>=</m:t>
+        </m:r>
+        <m:r>
+          <w:rPr>
+            <w:rFonts w:ascii="Cambria Math" w:eastAsiaTheme="minorEastAsia" w:hAnsi="Cambria Math"/>
+            <w:lang w:val="ru-RU"/>
+          </w:rPr>
+          <m:t>0.960128881</m:t>
         </m:r>
       </m:oMath>
       <w:r>
@@ -2027,7 +2360,7 @@
           <w:rFonts w:eastAsiaTheme="minorEastAsia"/>
           <w:lang w:val="ru-RU"/>
         </w:rPr>
-        <w:t xml:space="preserve">. </w:t>
+        <w:t xml:space="preserve"> </w:t>
       </w:r>
       <m:oMath>
         <m:r>
@@ -2107,11 +2440,18 @@
           <w:lang w:val="ru-RU"/>
         </w:rPr>
       </w:pPr>
-      <w:r>
-        <w:rPr>
-          <w:lang w:val="ru-RU"/>
-        </w:rPr>
-        <w:lastRenderedPageBreak/>
+    </w:p>
+    <w:p>
+      <w:pPr>
+        <w:ind w:firstLine="0"/>
+        <w:rPr>
+          <w:lang w:val="ru-RU"/>
+        </w:rPr>
+      </w:pPr>
+      <w:r>
+        <w:rPr>
+          <w:lang w:val="ru-RU"/>
+        </w:rPr>
         <w:t>Выводы:</w:t>
       </w:r>
     </w:p>
@@ -2120,7 +2460,7 @@
         <w:pStyle w:val="a7"/>
         <w:numPr>
           <w:ilvl w:val="0"/>
-          <w:numId w:val="23"/>
+          <w:numId w:val="25"/>
         </w:numPr>
         <w:rPr>
           <w:lang w:val="ru-RU"/>
@@ -2136,7 +2476,21 @@
         <w:rPr>
           <w:lang w:val="ru-RU"/>
         </w:rPr>
-        <w:t>часами игры и баллом учеников слабая и статистически незначительная линейная взяимосвязь.</w:t>
+        <w:t xml:space="preserve">часами игры и баллом учеников слабая и статистически незначительная линейная </w:t>
+      </w:r>
+      <w:proofErr w:type="spellStart"/>
+      <w:r>
+        <w:rPr>
+          <w:lang w:val="ru-RU"/>
+        </w:rPr>
+        <w:t>взяимосвязь</w:t>
+      </w:r>
+      <w:proofErr w:type="spellEnd"/>
+      <w:r>
+        <w:rPr>
+          <w:lang w:val="ru-RU"/>
+        </w:rPr>
+        <w:t>.</w:t>
       </w:r>
     </w:p>
     <w:p>
@@ -2144,7 +2498,7 @@
         <w:pStyle w:val="a7"/>
         <w:numPr>
           <w:ilvl w:val="0"/>
-          <w:numId w:val="23"/>
+          <w:numId w:val="25"/>
         </w:numPr>
         <w:rPr>
           <w:lang w:val="ru-RU"/>
@@ -2156,13 +2510,22 @@
         </w:rPr>
         <w:t>Между игровым стажем и временем игры в день имеется сильная и статистически значимая линейная взаимосвязь.</w:t>
       </w:r>
+    </w:p>
+    <w:p>
+      <w:pPr>
+        <w:pStyle w:val="a7"/>
+        <w:ind w:left="720" w:firstLine="0"/>
+        <w:rPr>
+          <w:lang w:val="ru-RU"/>
+        </w:rPr>
+      </w:pPr>
     </w:p>
     <w:p>
       <w:pPr>
         <w:pStyle w:val="a7"/>
         <w:numPr>
           <w:ilvl w:val="0"/>
-          <w:numId w:val="23"/>
+          <w:numId w:val="22"/>
         </w:numPr>
         <w:rPr>
           <w:lang w:val="ru-RU"/>
@@ -2190,7 +2553,21 @@
         <w:rPr>
           <w:lang w:val="ru-RU"/>
         </w:rPr>
-        <w:t>Нелинейные между количественными – коэффициент Спирмена, ящик с усами, криволинейная регрессия</w:t>
+        <w:t xml:space="preserve">Нелинейные между количественными – коэффициент </w:t>
+      </w:r>
+      <w:proofErr w:type="spellStart"/>
+      <w:r>
+        <w:rPr>
+          <w:lang w:val="ru-RU"/>
+        </w:rPr>
+        <w:t>Спирмена</w:t>
+      </w:r>
+      <w:proofErr w:type="spellEnd"/>
+      <w:r>
+        <w:rPr>
+          <w:lang w:val="ru-RU"/>
+        </w:rPr>
+        <w:t>, ящик с усами, криволинейная регрессия</w:t>
       </w:r>
       <w:r>
         <w:rPr>
@@ -2281,7 +2658,7 @@
 </file>
 
 <file path=word/endnotes.xml><?xml version="1.0" encoding="utf-8"?>
-<w:endnotes xmlns:wpc="http://schemas.microsoft.com/office/word/2010/wordprocessingCanvas" xmlns:cx="http://schemas.microsoft.com/office/drawing/2014/chartex" xmlns:cx1="http://schemas.microsoft.com/office/drawing/2015/9/8/chartex" xmlns:cx2="http://schemas.microsoft.com/office/drawing/2015/10/21/chartex" xmlns:cx3="http://schemas.microsoft.com/office/drawing/2016/5/9/chartex" xmlns:cx4="http://schemas.microsoft.com/office/drawing/2016/5/10/chartex" xmlns:cx5="http://schemas.microsoft.com/office/drawing/2016/5/11/chartex" xmlns:cx6="http://schemas.microsoft.com/office/drawing/2016/5/12/chartex" xmlns:cx7="http://schemas.microsoft.com/office/drawing/2016/5/13/chartex" xmlns:cx8="http://schemas.microsoft.com/office/drawing/2016/5/14/chartex" xmlns:mc="http://schemas.openxmlformats.org/markup-compatibility/2006" xmlns:aink="http://schemas.microsoft.com/office/drawing/2016/ink" xmlns:am3d="http://schemas.microsoft.com/office/drawing/2017/model3d" xmlns:o="urn:schemas-microsoft-com:office:office" xmlns:oel="http://schemas.microsoft.com/office/2019/extlst" xmlns:r="http://schemas.openxmlformats.org/officeDocument/2006/relationships" xmlns:m="http://schemas.openxmlformats.org/officeDocument/2006/math" xmlns:v="urn:schemas-microsoft-com:vml" xmlns:wp14="http://schemas.microsoft.com/office/word/2010/wordprocessingDrawing" xmlns:wp="http://schemas.openxmlformats.org/drawingml/2006/wordprocessingDrawing" xmlns:w10="urn:schemas-microsoft-com:office:word" xmlns:w="http://schemas.openxmlformats.org/wordprocessingml/2006/main" xmlns:w14="http://schemas.microsoft.com/office/word/2010/wordml" xmlns:w15="http://schemas.microsoft.com/office/word/2012/wordml" xmlns:w16cex="http://schemas.microsoft.com/office/word/2018/wordml/cex" xmlns:w16cid="http://schemas.microsoft.com/office/word/2016/wordml/cid" xmlns:w16="http://schemas.microsoft.com/office/word/2018/wordml" xmlns:w16sdtdh="http://schemas.microsoft.com/office/word/2020/wordml/sdtdatahash" xmlns:w16se="http://schemas.microsoft.com/office/word/2015/wordml/symex" xmlns:wpg="http://schemas.microsoft.com/office/word/2010/wordprocessingGroup" xmlns:wpi="http://schemas.microsoft.com/office/word/2010/wordprocessingInk" xmlns:wne="http://schemas.microsoft.com/office/word/2006/wordml" xmlns:wps="http://schemas.microsoft.com/office/word/2010/wordprocessingShape" mc:Ignorable="w14 w15 w16se w16cid w16 w16cex w16sdtdh wp14">
+<w:endnotes xmlns:wpc="http://schemas.microsoft.com/office/word/2010/wordprocessingCanvas" xmlns:cx="http://schemas.microsoft.com/office/drawing/2014/chartex" xmlns:cx1="http://schemas.microsoft.com/office/drawing/2015/9/8/chartex" xmlns:cx2="http://schemas.microsoft.com/office/drawing/2015/10/21/chartex" xmlns:cx3="http://schemas.microsoft.com/office/drawing/2016/5/9/chartex" xmlns:cx4="http://schemas.microsoft.com/office/drawing/2016/5/10/chartex" xmlns:cx5="http://schemas.microsoft.com/office/drawing/2016/5/11/chartex" xmlns:cx6="http://schemas.microsoft.com/office/drawing/2016/5/12/chartex" xmlns:cx7="http://schemas.microsoft.com/office/drawing/2016/5/13/chartex" xmlns:cx8="http://schemas.microsoft.com/office/drawing/2016/5/14/chartex" xmlns:mc="http://schemas.openxmlformats.org/markup-compatibility/2006" xmlns:aink="http://schemas.microsoft.com/office/drawing/2016/ink" xmlns:am3d="http://schemas.microsoft.com/office/drawing/2017/model3d" xmlns:o="urn:schemas-microsoft-com:office:office" xmlns:oel="http://schemas.microsoft.com/office/2019/extlst" xmlns:r="http://schemas.openxmlformats.org/officeDocument/2006/relationships" xmlns:m="http://schemas.openxmlformats.org/officeDocument/2006/math" xmlns:v="urn:schemas-microsoft-com:vml" xmlns:wp14="http://schemas.microsoft.com/office/word/2010/wordprocessingDrawing" xmlns:wp="http://schemas.openxmlformats.org/drawingml/2006/wordprocessingDrawing" xmlns:w10="urn:schemas-microsoft-com:office:word" xmlns:w="http://schemas.openxmlformats.org/wordprocessingml/2006/main" xmlns:w14="http://schemas.microsoft.com/office/word/2010/wordml" xmlns:w15="http://schemas.microsoft.com/office/word/2012/wordml" xmlns:w16cex="http://schemas.microsoft.com/office/word/2018/wordml/cex" xmlns:w16cid="http://schemas.microsoft.com/office/word/2016/wordml/cid" xmlns:w16="http://schemas.microsoft.com/office/word/2018/wordml" xmlns:w16du="http://schemas.microsoft.com/office/word/2023/wordml/word16du" xmlns:w16sdtdh="http://schemas.microsoft.com/office/word/2020/wordml/sdtdatahash" xmlns:w16sdtfl="http://schemas.microsoft.com/office/word/2024/wordml/sdtformatlock" xmlns:w16se="http://schemas.microsoft.com/office/word/2015/wordml/symex" xmlns:wpg="http://schemas.microsoft.com/office/word/2010/wordprocessingGroup" xmlns:wpi="http://schemas.microsoft.com/office/word/2010/wordprocessingInk" xmlns:wne="http://schemas.microsoft.com/office/word/2006/wordml" xmlns:wps="http://schemas.microsoft.com/office/word/2010/wordprocessingShape" mc:Ignorable="w14 w15 w16se w16cid w16 w16cex w16sdtdh w16sdtfl w16du wp14">
   <w:endnote w:type="separator" w:id="-1">
     <w:p>
       <w:pPr>
@@ -2306,7 +2683,7 @@
 </file>
 
 <file path=word/footer1.xml><?xml version="1.0" encoding="utf-8"?>
-<w:ftr xmlns:wpc="http://schemas.microsoft.com/office/word/2010/wordprocessingCanvas" xmlns:cx="http://schemas.microsoft.com/office/drawing/2014/chartex" xmlns:cx1="http://schemas.microsoft.com/office/drawing/2015/9/8/chartex" xmlns:cx2="http://schemas.microsoft.com/office/drawing/2015/10/21/chartex" xmlns:cx3="http://schemas.microsoft.com/office/drawing/2016/5/9/chartex" xmlns:cx4="http://schemas.microsoft.com/office/drawing/2016/5/10/chartex" xmlns:cx5="http://schemas.microsoft.com/office/drawing/2016/5/11/chartex" xmlns:cx6="http://schemas.microsoft.com/office/drawing/2016/5/12/chartex" xmlns:cx7="http://schemas.microsoft.com/office/drawing/2016/5/13/chartex" xmlns:cx8="http://schemas.microsoft.com/office/drawing/2016/5/14/chartex" xmlns:mc="http://schemas.openxmlformats.org/markup-compatibility/2006" xmlns:aink="http://schemas.microsoft.com/office/drawing/2016/ink" xmlns:am3d="http://schemas.microsoft.com/office/drawing/2017/model3d" xmlns:o="urn:schemas-microsoft-com:office:office" xmlns:oel="http://schemas.microsoft.com/office/2019/extlst" xmlns:r="http://schemas.openxmlformats.org/officeDocument/2006/relationships" xmlns:m="http://schemas.openxmlformats.org/officeDocument/2006/math" xmlns:v="urn:schemas-microsoft-com:vml" xmlns:wp14="http://schemas.microsoft.com/office/word/2010/wordprocessingDrawing" xmlns:wp="http://schemas.openxmlformats.org/drawingml/2006/wordprocessingDrawing" xmlns:w10="urn:schemas-microsoft-com:office:word" xmlns:w="http://schemas.openxmlformats.org/wordprocessingml/2006/main" xmlns:w14="http://schemas.microsoft.com/office/word/2010/wordml" xmlns:w15="http://schemas.microsoft.com/office/word/2012/wordml" xmlns:w16cex="http://schemas.microsoft.com/office/word/2018/wordml/cex" xmlns:w16cid="http://schemas.microsoft.com/office/word/2016/wordml/cid" xmlns:w16="http://schemas.microsoft.com/office/word/2018/wordml" xmlns:w16sdtdh="http://schemas.microsoft.com/office/word/2020/wordml/sdtdatahash" xmlns:w16se="http://schemas.microsoft.com/office/word/2015/wordml/symex" xmlns:wpg="http://schemas.microsoft.com/office/word/2010/wordprocessingGroup" xmlns:wpi="http://schemas.microsoft.com/office/word/2010/wordprocessingInk" xmlns:wne="http://schemas.microsoft.com/office/word/2006/wordml" xmlns:wps="http://schemas.microsoft.com/office/word/2010/wordprocessingShape" mc:Ignorable="w14 w15 w16se w16cid w16 w16cex w16sdtdh wp14">
+<w:ftr xmlns:wpc="http://schemas.microsoft.com/office/word/2010/wordprocessingCanvas" xmlns:cx="http://schemas.microsoft.com/office/drawing/2014/chartex" xmlns:cx1="http://schemas.microsoft.com/office/drawing/2015/9/8/chartex" xmlns:cx2="http://schemas.microsoft.com/office/drawing/2015/10/21/chartex" xmlns:cx3="http://schemas.microsoft.com/office/drawing/2016/5/9/chartex" xmlns:cx4="http://schemas.microsoft.com/office/drawing/2016/5/10/chartex" xmlns:cx5="http://schemas.microsoft.com/office/drawing/2016/5/11/chartex" xmlns:cx6="http://schemas.microsoft.com/office/drawing/2016/5/12/chartex" xmlns:cx7="http://schemas.microsoft.com/office/drawing/2016/5/13/chartex" xmlns:cx8="http://schemas.microsoft.com/office/drawing/2016/5/14/chartex" xmlns:mc="http://schemas.openxmlformats.org/markup-compatibility/2006" xmlns:aink="http://schemas.microsoft.com/office/drawing/2016/ink" xmlns:am3d="http://schemas.microsoft.com/office/drawing/2017/model3d" xmlns:o="urn:schemas-microsoft-com:office:office" xmlns:oel="http://schemas.microsoft.com/office/2019/extlst" xmlns:r="http://schemas.openxmlformats.org/officeDocument/2006/relationships" xmlns:m="http://schemas.openxmlformats.org/officeDocument/2006/math" xmlns:v="urn:schemas-microsoft-com:vml" xmlns:wp14="http://schemas.microsoft.com/office/word/2010/wordprocessingDrawing" xmlns:wp="http://schemas.openxmlformats.org/drawingml/2006/wordprocessingDrawing" xmlns:w10="urn:schemas-microsoft-com:office:word" xmlns:w="http://schemas.openxmlformats.org/wordprocessingml/2006/main" xmlns:w14="http://schemas.microsoft.com/office/word/2010/wordml" xmlns:w15="http://schemas.microsoft.com/office/word/2012/wordml" xmlns:w16cex="http://schemas.microsoft.com/office/word/2018/wordml/cex" xmlns:w16cid="http://schemas.microsoft.com/office/word/2016/wordml/cid" xmlns:w16="http://schemas.microsoft.com/office/word/2018/wordml" xmlns:w16du="http://schemas.microsoft.com/office/word/2023/wordml/word16du" xmlns:w16sdtdh="http://schemas.microsoft.com/office/word/2020/wordml/sdtdatahash" xmlns:w16sdtfl="http://schemas.microsoft.com/office/word/2024/wordml/sdtformatlock" xmlns:w16se="http://schemas.microsoft.com/office/word/2015/wordml/symex" xmlns:wpg="http://schemas.microsoft.com/office/word/2010/wordprocessingGroup" xmlns:wpi="http://schemas.microsoft.com/office/word/2010/wordprocessingInk" xmlns:wne="http://schemas.microsoft.com/office/word/2006/wordml" xmlns:wps="http://schemas.microsoft.com/office/word/2010/wordprocessingShape" mc:Ignorable="w14 w15 w16se w16cid w16 w16cex w16sdtdh w16sdtfl w16du wp14">
   <w:p>
     <w:pPr>
       <w:pStyle w:val="ae"/>
@@ -2315,13 +2692,23 @@
         <w:lang w:val="ru-RU"/>
       </w:rPr>
     </w:pPr>
+    <w:proofErr w:type="spellStart"/>
     <w:r>
       <w:rPr>
         <w:rFonts w:eastAsia="Times New Roman" w:cs="Times New Roman"/>
         <w:szCs w:val="28"/>
         <w:lang w:eastAsia="ru-RU"/>
       </w:rPr>
-      <w:t>Череповец, 202</w:t>
+      <w:t>Череповец</w:t>
+    </w:r>
+    <w:proofErr w:type="spellEnd"/>
+    <w:r>
+      <w:rPr>
+        <w:rFonts w:eastAsia="Times New Roman" w:cs="Times New Roman"/>
+        <w:szCs w:val="28"/>
+        <w:lang w:eastAsia="ru-RU"/>
+      </w:rPr>
+      <w:t>, 202</w:t>
     </w:r>
     <w:r>
       <w:rPr>
@@ -2344,7 +2731,7 @@
 </file>
 
 <file path=word/footnotes.xml><?xml version="1.0" encoding="utf-8"?>
-<w:footnotes xmlns:wpc="http://schemas.microsoft.com/office/word/2010/wordprocessingCanvas" xmlns:cx="http://schemas.microsoft.com/office/drawing/2014/chartex" xmlns:cx1="http://schemas.microsoft.com/office/drawing/2015/9/8/chartex" xmlns:cx2="http://schemas.microsoft.com/office/drawing/2015/10/21/chartex" xmlns:cx3="http://schemas.microsoft.com/office/drawing/2016/5/9/chartex" xmlns:cx4="http://schemas.microsoft.com/office/drawing/2016/5/10/chartex" xmlns:cx5="http://schemas.microsoft.com/office/drawing/2016/5/11/chartex" xmlns:cx6="http://schemas.microsoft.com/office/drawing/2016/5/12/chartex" xmlns:cx7="http://schemas.microsoft.com/office/drawing/2016/5/13/chartex" xmlns:cx8="http://schemas.microsoft.com/office/drawing/2016/5/14/chartex" xmlns:mc="http://schemas.openxmlformats.org/markup-compatibility/2006" xmlns:aink="http://schemas.microsoft.com/office/drawing/2016/ink" xmlns:am3d="http://schemas.microsoft.com/office/drawing/2017/model3d" xmlns:o="urn:schemas-microsoft-com:office:office" xmlns:oel="http://schemas.microsoft.com/office/2019/extlst" xmlns:r="http://schemas.openxmlformats.org/officeDocument/2006/relationships" xmlns:m="http://schemas.openxmlformats.org/officeDocument/2006/math" xmlns:v="urn:schemas-microsoft-com:vml" xmlns:wp14="http://schemas.microsoft.com/office/word/2010/wordprocessingDrawing" xmlns:wp="http://schemas.openxmlformats.org/drawingml/2006/wordprocessingDrawing" xmlns:w10="urn:schemas-microsoft-com:office:word" xmlns:w="http://schemas.openxmlformats.org/wordprocessingml/2006/main" xmlns:w14="http://schemas.microsoft.com/office/word/2010/wordml" xmlns:w15="http://schemas.microsoft.com/office/word/2012/wordml" xmlns:w16cex="http://schemas.microsoft.com/office/word/2018/wordml/cex" xmlns:w16cid="http://schemas.microsoft.com/office/word/2016/wordml/cid" xmlns:w16="http://schemas.microsoft.com/office/word/2018/wordml" xmlns:w16sdtdh="http://schemas.microsoft.com/office/word/2020/wordml/sdtdatahash" xmlns:w16se="http://schemas.microsoft.com/office/word/2015/wordml/symex" xmlns:wpg="http://schemas.microsoft.com/office/word/2010/wordprocessingGroup" xmlns:wpi="http://schemas.microsoft.com/office/word/2010/wordprocessingInk" xmlns:wne="http://schemas.microsoft.com/office/word/2006/wordml" xmlns:wps="http://schemas.microsoft.com/office/word/2010/wordprocessingShape" mc:Ignorable="w14 w15 w16se w16cid w16 w16cex w16sdtdh wp14">
+<w:footnotes xmlns:wpc="http://schemas.microsoft.com/office/word/2010/wordprocessingCanvas" xmlns:cx="http://schemas.microsoft.com/office/drawing/2014/chartex" xmlns:cx1="http://schemas.microsoft.com/office/drawing/2015/9/8/chartex" xmlns:cx2="http://schemas.microsoft.com/office/drawing/2015/10/21/chartex" xmlns:cx3="http://schemas.microsoft.com/office/drawing/2016/5/9/chartex" xmlns:cx4="http://schemas.microsoft.com/office/drawing/2016/5/10/chartex" xmlns:cx5="http://schemas.microsoft.com/office/drawing/2016/5/11/chartex" xmlns:cx6="http://schemas.microsoft.com/office/drawing/2016/5/12/chartex" xmlns:cx7="http://schemas.microsoft.com/office/drawing/2016/5/13/chartex" xmlns:cx8="http://schemas.microsoft.com/office/drawing/2016/5/14/chartex" xmlns:mc="http://schemas.openxmlformats.org/markup-compatibility/2006" xmlns:aink="http://schemas.microsoft.com/office/drawing/2016/ink" xmlns:am3d="http://schemas.microsoft.com/office/drawing/2017/model3d" xmlns:o="urn:schemas-microsoft-com:office:office" xmlns:oel="http://schemas.microsoft.com/office/2019/extlst" xmlns:r="http://schemas.openxmlformats.org/officeDocument/2006/relationships" xmlns:m="http://schemas.openxmlformats.org/officeDocument/2006/math" xmlns:v="urn:schemas-microsoft-com:vml" xmlns:wp14="http://schemas.microsoft.com/office/word/2010/wordprocessingDrawing" xmlns:wp="http://schemas.openxmlformats.org/drawingml/2006/wordprocessingDrawing" xmlns:w10="urn:schemas-microsoft-com:office:word" xmlns:w="http://schemas.openxmlformats.org/wordprocessingml/2006/main" xmlns:w14="http://schemas.microsoft.com/office/word/2010/wordml" xmlns:w15="http://schemas.microsoft.com/office/word/2012/wordml" xmlns:w16cex="http://schemas.microsoft.com/office/word/2018/wordml/cex" xmlns:w16cid="http://schemas.microsoft.com/office/word/2016/wordml/cid" xmlns:w16="http://schemas.microsoft.com/office/word/2018/wordml" xmlns:w16du="http://schemas.microsoft.com/office/word/2023/wordml/word16du" xmlns:w16sdtdh="http://schemas.microsoft.com/office/word/2020/wordml/sdtdatahash" xmlns:w16sdtfl="http://schemas.microsoft.com/office/word/2024/wordml/sdtformatlock" xmlns:w16se="http://schemas.microsoft.com/office/word/2015/wordml/symex" xmlns:wpg="http://schemas.microsoft.com/office/word/2010/wordprocessingGroup" xmlns:wpi="http://schemas.microsoft.com/office/word/2010/wordprocessingInk" xmlns:wne="http://schemas.microsoft.com/office/word/2006/wordml" xmlns:wps="http://schemas.microsoft.com/office/word/2010/wordprocessingShape" mc:Ignorable="w14 w15 w16se w16cid w16 w16cex w16sdtdh w16sdtfl w16du wp14">
   <w:footnote w:type="separator" w:id="-1">
     <w:p>
       <w:pPr>
@@ -2369,7 +2756,7 @@
 </file>
 
 <file path=word/header1.xml><?xml version="1.0" encoding="utf-8"?>
-<w:hdr xmlns:wpc="http://schemas.microsoft.com/office/word/2010/wordprocessingCanvas" xmlns:cx="http://schemas.microsoft.com/office/drawing/2014/chartex" xmlns:cx1="http://schemas.microsoft.com/office/drawing/2015/9/8/chartex" xmlns:cx2="http://schemas.microsoft.com/office/drawing/2015/10/21/chartex" xmlns:cx3="http://schemas.microsoft.com/office/drawing/2016/5/9/chartex" xmlns:cx4="http://schemas.microsoft.com/office/drawing/2016/5/10/chartex" xmlns:cx5="http://schemas.microsoft.com/office/drawing/2016/5/11/chartex" xmlns:cx6="http://schemas.microsoft.com/office/drawing/2016/5/12/chartex" xmlns:cx7="http://schemas.microsoft.com/office/drawing/2016/5/13/chartex" xmlns:cx8="http://schemas.microsoft.com/office/drawing/2016/5/14/chartex" xmlns:mc="http://schemas.openxmlformats.org/markup-compatibility/2006" xmlns:aink="http://schemas.microsoft.com/office/drawing/2016/ink" xmlns:am3d="http://schemas.microsoft.com/office/drawing/2017/model3d" xmlns:o="urn:schemas-microsoft-com:office:office" xmlns:oel="http://schemas.microsoft.com/office/2019/extlst" xmlns:r="http://schemas.openxmlformats.org/officeDocument/2006/relationships" xmlns:m="http://schemas.openxmlformats.org/officeDocument/2006/math" xmlns:v="urn:schemas-microsoft-com:vml" xmlns:wp14="http://schemas.microsoft.com/office/word/2010/wordprocessingDrawing" xmlns:wp="http://schemas.openxmlformats.org/drawingml/2006/wordprocessingDrawing" xmlns:w10="urn:schemas-microsoft-com:office:word" xmlns:w="http://schemas.openxmlformats.org/wordprocessingml/2006/main" xmlns:w14="http://schemas.microsoft.com/office/word/2010/wordml" xmlns:w15="http://schemas.microsoft.com/office/word/2012/wordml" xmlns:w16cex="http://schemas.microsoft.com/office/word/2018/wordml/cex" xmlns:w16cid="http://schemas.microsoft.com/office/word/2016/wordml/cid" xmlns:w16="http://schemas.microsoft.com/office/word/2018/wordml" xmlns:w16sdtdh="http://schemas.microsoft.com/office/word/2020/wordml/sdtdatahash" xmlns:w16se="http://schemas.microsoft.com/office/word/2015/wordml/symex" xmlns:wpg="http://schemas.microsoft.com/office/word/2010/wordprocessingGroup" xmlns:wpi="http://schemas.microsoft.com/office/word/2010/wordprocessingInk" xmlns:wne="http://schemas.microsoft.com/office/word/2006/wordml" xmlns:wps="http://schemas.microsoft.com/office/word/2010/wordprocessingShape" mc:Ignorable="w14 w15 w16se w16cid w16 w16cex w16sdtdh wp14">
+<w:hdr xmlns:wpc="http://schemas.microsoft.com/office/word/2010/wordprocessingCanvas" xmlns:cx="http://schemas.microsoft.com/office/drawing/2014/chartex" xmlns:cx1="http://schemas.microsoft.com/office/drawing/2015/9/8/chartex" xmlns:cx2="http://schemas.microsoft.com/office/drawing/2015/10/21/chartex" xmlns:cx3="http://schemas.microsoft.com/office/drawing/2016/5/9/chartex" xmlns:cx4="http://schemas.microsoft.com/office/drawing/2016/5/10/chartex" xmlns:cx5="http://schemas.microsoft.com/office/drawing/2016/5/11/chartex" xmlns:cx6="http://schemas.microsoft.com/office/drawing/2016/5/12/chartex" xmlns:cx7="http://schemas.microsoft.com/office/drawing/2016/5/13/chartex" xmlns:cx8="http://schemas.microsoft.com/office/drawing/2016/5/14/chartex" xmlns:mc="http://schemas.openxmlformats.org/markup-compatibility/2006" xmlns:aink="http://schemas.microsoft.com/office/drawing/2016/ink" xmlns:am3d="http://schemas.microsoft.com/office/drawing/2017/model3d" xmlns:o="urn:schemas-microsoft-com:office:office" xmlns:oel="http://schemas.microsoft.com/office/2019/extlst" xmlns:r="http://schemas.openxmlformats.org/officeDocument/2006/relationships" xmlns:m="http://schemas.openxmlformats.org/officeDocument/2006/math" xmlns:v="urn:schemas-microsoft-com:vml" xmlns:wp14="http://schemas.microsoft.com/office/word/2010/wordprocessingDrawing" xmlns:wp="http://schemas.openxmlformats.org/drawingml/2006/wordprocessingDrawing" xmlns:w10="urn:schemas-microsoft-com:office:word" xmlns:w="http://schemas.openxmlformats.org/wordprocessingml/2006/main" xmlns:w14="http://schemas.microsoft.com/office/word/2010/wordml" xmlns:w15="http://schemas.microsoft.com/office/word/2012/wordml" xmlns:w16cex="http://schemas.microsoft.com/office/word/2018/wordml/cex" xmlns:w16cid="http://schemas.microsoft.com/office/word/2016/wordml/cid" xmlns:w16="http://schemas.microsoft.com/office/word/2018/wordml" xmlns:w16du="http://schemas.microsoft.com/office/word/2023/wordml/word16du" xmlns:w16sdtdh="http://schemas.microsoft.com/office/word/2020/wordml/sdtdatahash" xmlns:w16sdtfl="http://schemas.microsoft.com/office/word/2024/wordml/sdtformatlock" xmlns:w16se="http://schemas.microsoft.com/office/word/2015/wordml/symex" xmlns:wpg="http://schemas.microsoft.com/office/word/2010/wordprocessingGroup" xmlns:wpi="http://schemas.microsoft.com/office/word/2010/wordprocessingInk" xmlns:wne="http://schemas.microsoft.com/office/word/2006/wordml" xmlns:wps="http://schemas.microsoft.com/office/word/2010/wordprocessingShape" mc:Ignorable="w14 w15 w16se w16cid w16 w16cex w16sdtdh w16sdtfl w16du wp14">
   <w:sdt>
     <w:sdtPr>
       <w:rPr>
@@ -2381,11 +2768,6 @@
         <w:docPartUnique/>
       </w:docPartObj>
     </w:sdtPr>
-    <w:sdtEndPr>
-      <w:rPr>
-        <w:rStyle w:val="af1"/>
-      </w:rPr>
-    </w:sdtEndPr>
     <w:sdtContent>
       <w:p>
         <w:pPr>
@@ -2425,7 +2807,7 @@
 </file>
 
 <file path=word/header2.xml><?xml version="1.0" encoding="utf-8"?>
-<w:hdr xmlns:wpc="http://schemas.microsoft.com/office/word/2010/wordprocessingCanvas" xmlns:cx="http://schemas.microsoft.com/office/drawing/2014/chartex" xmlns:cx1="http://schemas.microsoft.com/office/drawing/2015/9/8/chartex" xmlns:cx2="http://schemas.microsoft.com/office/drawing/2015/10/21/chartex" xmlns:cx3="http://schemas.microsoft.com/office/drawing/2016/5/9/chartex" xmlns:cx4="http://schemas.microsoft.com/office/drawing/2016/5/10/chartex" xmlns:cx5="http://schemas.microsoft.com/office/drawing/2016/5/11/chartex" xmlns:cx6="http://schemas.microsoft.com/office/drawing/2016/5/12/chartex" xmlns:cx7="http://schemas.microsoft.com/office/drawing/2016/5/13/chartex" xmlns:cx8="http://schemas.microsoft.com/office/drawing/2016/5/14/chartex" xmlns:mc="http://schemas.openxmlformats.org/markup-compatibility/2006" xmlns:aink="http://schemas.microsoft.com/office/drawing/2016/ink" xmlns:am3d="http://schemas.microsoft.com/office/drawing/2017/model3d" xmlns:o="urn:schemas-microsoft-com:office:office" xmlns:oel="http://schemas.microsoft.com/office/2019/extlst" xmlns:r="http://schemas.openxmlformats.org/officeDocument/2006/relationships" xmlns:m="http://schemas.openxmlformats.org/officeDocument/2006/math" xmlns:v="urn:schemas-microsoft-com:vml" xmlns:wp14="http://schemas.microsoft.com/office/word/2010/wordprocessingDrawing" xmlns:wp="http://schemas.openxmlformats.org/drawingml/2006/wordprocessingDrawing" xmlns:w10="urn:schemas-microsoft-com:office:word" xmlns:w="http://schemas.openxmlformats.org/wordprocessingml/2006/main" xmlns:w14="http://schemas.microsoft.com/office/word/2010/wordml" xmlns:w15="http://schemas.microsoft.com/office/word/2012/wordml" xmlns:w16cex="http://schemas.microsoft.com/office/word/2018/wordml/cex" xmlns:w16cid="http://schemas.microsoft.com/office/word/2016/wordml/cid" xmlns:w16="http://schemas.microsoft.com/office/word/2018/wordml" xmlns:w16sdtdh="http://schemas.microsoft.com/office/word/2020/wordml/sdtdatahash" xmlns:w16se="http://schemas.microsoft.com/office/word/2015/wordml/symex" xmlns:wpg="http://schemas.microsoft.com/office/word/2010/wordprocessingGroup" xmlns:wpi="http://schemas.microsoft.com/office/word/2010/wordprocessingInk" xmlns:wne="http://schemas.microsoft.com/office/word/2006/wordml" xmlns:wps="http://schemas.microsoft.com/office/word/2010/wordprocessingShape" mc:Ignorable="w14 w15 w16se w16cid w16 w16cex w16sdtdh wp14">
+<w:hdr xmlns:wpc="http://schemas.microsoft.com/office/word/2010/wordprocessingCanvas" xmlns:cx="http://schemas.microsoft.com/office/drawing/2014/chartex" xmlns:cx1="http://schemas.microsoft.com/office/drawing/2015/9/8/chartex" xmlns:cx2="http://schemas.microsoft.com/office/drawing/2015/10/21/chartex" xmlns:cx3="http://schemas.microsoft.com/office/drawing/2016/5/9/chartex" xmlns:cx4="http://schemas.microsoft.com/office/drawing/2016/5/10/chartex" xmlns:cx5="http://schemas.microsoft.com/office/drawing/2016/5/11/chartex" xmlns:cx6="http://schemas.microsoft.com/office/drawing/2016/5/12/chartex" xmlns:cx7="http://schemas.microsoft.com/office/drawing/2016/5/13/chartex" xmlns:cx8="http://schemas.microsoft.com/office/drawing/2016/5/14/chartex" xmlns:mc="http://schemas.openxmlformats.org/markup-compatibility/2006" xmlns:aink="http://schemas.microsoft.com/office/drawing/2016/ink" xmlns:am3d="http://schemas.microsoft.com/office/drawing/2017/model3d" xmlns:o="urn:schemas-microsoft-com:office:office" xmlns:oel="http://schemas.microsoft.com/office/2019/extlst" xmlns:r="http://schemas.openxmlformats.org/officeDocument/2006/relationships" xmlns:m="http://schemas.openxmlformats.org/officeDocument/2006/math" xmlns:v="urn:schemas-microsoft-com:vml" xmlns:wp14="http://schemas.microsoft.com/office/word/2010/wordprocessingDrawing" xmlns:wp="http://schemas.openxmlformats.org/drawingml/2006/wordprocessingDrawing" xmlns:w10="urn:schemas-microsoft-com:office:word" xmlns:w="http://schemas.openxmlformats.org/wordprocessingml/2006/main" xmlns:w14="http://schemas.microsoft.com/office/word/2010/wordml" xmlns:w15="http://schemas.microsoft.com/office/word/2012/wordml" xmlns:w16cex="http://schemas.microsoft.com/office/word/2018/wordml/cex" xmlns:w16cid="http://schemas.microsoft.com/office/word/2016/wordml/cid" xmlns:w16="http://schemas.microsoft.com/office/word/2018/wordml" xmlns:w16du="http://schemas.microsoft.com/office/word/2023/wordml/word16du" xmlns:w16sdtdh="http://schemas.microsoft.com/office/word/2020/wordml/sdtdatahash" xmlns:w16sdtfl="http://schemas.microsoft.com/office/word/2024/wordml/sdtformatlock" xmlns:w16se="http://schemas.microsoft.com/office/word/2015/wordml/symex" xmlns:wpg="http://schemas.microsoft.com/office/word/2010/wordprocessingGroup" xmlns:wpi="http://schemas.microsoft.com/office/word/2010/wordprocessingInk" xmlns:wne="http://schemas.microsoft.com/office/word/2006/wordml" xmlns:wps="http://schemas.microsoft.com/office/word/2010/wordprocessingShape" mc:Ignorable="w14 w15 w16se w16cid w16 w16cex w16sdtdh w16sdtfl w16du wp14">
   <w:sdt>
     <w:sdtPr>
       <w:rPr>
@@ -2437,11 +2819,6 @@
         <w:docPartUnique/>
       </w:docPartObj>
     </w:sdtPr>
-    <w:sdtEndPr>
-      <w:rPr>
-        <w:rStyle w:val="af1"/>
-      </w:rPr>
-    </w:sdtEndPr>
     <w:sdtContent>
       <w:p>
         <w:pPr>
@@ -2494,7 +2871,7 @@
 </file>
 
 <file path=word/header3.xml><?xml version="1.0" encoding="utf-8"?>
-<w:hdr xmlns:wpc="http://schemas.microsoft.com/office/word/2010/wordprocessingCanvas" xmlns:cx="http://schemas.microsoft.com/office/drawing/2014/chartex" xmlns:cx1="http://schemas.microsoft.com/office/drawing/2015/9/8/chartex" xmlns:cx2="http://schemas.microsoft.com/office/drawing/2015/10/21/chartex" xmlns:cx3="http://schemas.microsoft.com/office/drawing/2016/5/9/chartex" xmlns:cx4="http://schemas.microsoft.com/office/drawing/2016/5/10/chartex" xmlns:cx5="http://schemas.microsoft.com/office/drawing/2016/5/11/chartex" xmlns:cx6="http://schemas.microsoft.com/office/drawing/2016/5/12/chartex" xmlns:cx7="http://schemas.microsoft.com/office/drawing/2016/5/13/chartex" xmlns:cx8="http://schemas.microsoft.com/office/drawing/2016/5/14/chartex" xmlns:mc="http://schemas.openxmlformats.org/markup-compatibility/2006" xmlns:aink="http://schemas.microsoft.com/office/drawing/2016/ink" xmlns:am3d="http://schemas.microsoft.com/office/drawing/2017/model3d" xmlns:o="urn:schemas-microsoft-com:office:office" xmlns:oel="http://schemas.microsoft.com/office/2019/extlst" xmlns:r="http://schemas.openxmlformats.org/officeDocument/2006/relationships" xmlns:m="http://schemas.openxmlformats.org/officeDocument/2006/math" xmlns:v="urn:schemas-microsoft-com:vml" xmlns:wp14="http://schemas.microsoft.com/office/word/2010/wordprocessingDrawing" xmlns:wp="http://schemas.openxmlformats.org/drawingml/2006/wordprocessingDrawing" xmlns:w10="urn:schemas-microsoft-com:office:word" xmlns:w="http://schemas.openxmlformats.org/wordprocessingml/2006/main" xmlns:w14="http://schemas.microsoft.com/office/word/2010/wordml" xmlns:w15="http://schemas.microsoft.com/office/word/2012/wordml" xmlns:w16cex="http://schemas.microsoft.com/office/word/2018/wordml/cex" xmlns:w16cid="http://schemas.microsoft.com/office/word/2016/wordml/cid" xmlns:w16="http://schemas.microsoft.com/office/word/2018/wordml" xmlns:w16sdtdh="http://schemas.microsoft.com/office/word/2020/wordml/sdtdatahash" xmlns:w16se="http://schemas.microsoft.com/office/word/2015/wordml/symex" xmlns:wpg="http://schemas.microsoft.com/office/word/2010/wordprocessingGroup" xmlns:wpi="http://schemas.microsoft.com/office/word/2010/wordprocessingInk" xmlns:wne="http://schemas.microsoft.com/office/word/2006/wordml" xmlns:wps="http://schemas.microsoft.com/office/word/2010/wordprocessingShape" mc:Ignorable="w14 w15 w16se w16cid w16 w16cex w16sdtdh wp14">
+<w:hdr xmlns:wpc="http://schemas.microsoft.com/office/word/2010/wordprocessingCanvas" xmlns:cx="http://schemas.microsoft.com/office/drawing/2014/chartex" xmlns:cx1="http://schemas.microsoft.com/office/drawing/2015/9/8/chartex" xmlns:cx2="http://schemas.microsoft.com/office/drawing/2015/10/21/chartex" xmlns:cx3="http://schemas.microsoft.com/office/drawing/2016/5/9/chartex" xmlns:cx4="http://schemas.microsoft.com/office/drawing/2016/5/10/chartex" xmlns:cx5="http://schemas.microsoft.com/office/drawing/2016/5/11/chartex" xmlns:cx6="http://schemas.microsoft.com/office/drawing/2016/5/12/chartex" xmlns:cx7="http://schemas.microsoft.com/office/drawing/2016/5/13/chartex" xmlns:cx8="http://schemas.microsoft.com/office/drawing/2016/5/14/chartex" xmlns:mc="http://schemas.openxmlformats.org/markup-compatibility/2006" xmlns:aink="http://schemas.microsoft.com/office/drawing/2016/ink" xmlns:am3d="http://schemas.microsoft.com/office/drawing/2017/model3d" xmlns:o="urn:schemas-microsoft-com:office:office" xmlns:oel="http://schemas.microsoft.com/office/2019/extlst" xmlns:r="http://schemas.openxmlformats.org/officeDocument/2006/relationships" xmlns:m="http://schemas.openxmlformats.org/officeDocument/2006/math" xmlns:v="urn:schemas-microsoft-com:vml" xmlns:wp14="http://schemas.microsoft.com/office/word/2010/wordprocessingDrawing" xmlns:wp="http://schemas.openxmlformats.org/drawingml/2006/wordprocessingDrawing" xmlns:w10="urn:schemas-microsoft-com:office:word" xmlns:w="http://schemas.openxmlformats.org/wordprocessingml/2006/main" xmlns:w14="http://schemas.microsoft.com/office/word/2010/wordml" xmlns:w15="http://schemas.microsoft.com/office/word/2012/wordml" xmlns:w16cex="http://schemas.microsoft.com/office/word/2018/wordml/cex" xmlns:w16cid="http://schemas.microsoft.com/office/word/2016/wordml/cid" xmlns:w16="http://schemas.microsoft.com/office/word/2018/wordml" xmlns:w16du="http://schemas.microsoft.com/office/word/2023/wordml/word16du" xmlns:w16sdtdh="http://schemas.microsoft.com/office/word/2020/wordml/sdtdatahash" xmlns:w16sdtfl="http://schemas.microsoft.com/office/word/2024/wordml/sdtformatlock" xmlns:w16se="http://schemas.microsoft.com/office/word/2015/wordml/symex" xmlns:wpg="http://schemas.microsoft.com/office/word/2010/wordprocessingGroup" xmlns:wpi="http://schemas.microsoft.com/office/word/2010/wordprocessingInk" xmlns:wne="http://schemas.microsoft.com/office/word/2006/wordml" xmlns:wps="http://schemas.microsoft.com/office/word/2010/wordprocessingShape" mc:Ignorable="w14 w15 w16se w16cid w16 w16cex w16sdtdh w16sdtfl w16du wp14">
   <w:p>
     <w:pPr>
       <w:spacing w:line="240" w:lineRule="auto"/>
@@ -2638,7 +3015,7 @@
 </file>
 
 <file path=word/numbering.xml><?xml version="1.0" encoding="utf-8"?>
-<w:numbering xmlns:wpc="http://schemas.microsoft.com/office/word/2010/wordprocessingCanvas" xmlns:cx="http://schemas.microsoft.com/office/drawing/2014/chartex" xmlns:cx1="http://schemas.microsoft.com/office/drawing/2015/9/8/chartex" xmlns:cx2="http://schemas.microsoft.com/office/drawing/2015/10/21/chartex" xmlns:cx3="http://schemas.microsoft.com/office/drawing/2016/5/9/chartex" xmlns:cx4="http://schemas.microsoft.com/office/drawing/2016/5/10/chartex" xmlns:cx5="http://schemas.microsoft.com/office/drawing/2016/5/11/chartex" xmlns:cx6="http://schemas.microsoft.com/office/drawing/2016/5/12/chartex" xmlns:cx7="http://schemas.microsoft.com/office/drawing/2016/5/13/chartex" xmlns:cx8="http://schemas.microsoft.com/office/drawing/2016/5/14/chartex" xmlns:mc="http://schemas.openxmlformats.org/markup-compatibility/2006" xmlns:aink="http://schemas.microsoft.com/office/drawing/2016/ink" xmlns:am3d="http://schemas.microsoft.com/office/drawing/2017/model3d" xmlns:o="urn:schemas-microsoft-com:office:office" xmlns:oel="http://schemas.microsoft.com/office/2019/extlst" xmlns:r="http://schemas.openxmlformats.org/officeDocument/2006/relationships" xmlns:m="http://schemas.openxmlformats.org/officeDocument/2006/math" xmlns:v="urn:schemas-microsoft-com:vml" xmlns:wp14="http://schemas.microsoft.com/office/word/2010/wordprocessingDrawing" xmlns:wp="http://schemas.openxmlformats.org/drawingml/2006/wordprocessingDrawing" xmlns:w10="urn:schemas-microsoft-com:office:word" xmlns:w="http://schemas.openxmlformats.org/wordprocessingml/2006/main" xmlns:w14="http://schemas.microsoft.com/office/word/2010/wordml" xmlns:w15="http://schemas.microsoft.com/office/word/2012/wordml" xmlns:w16cex="http://schemas.microsoft.com/office/word/2018/wordml/cex" xmlns:w16cid="http://schemas.microsoft.com/office/word/2016/wordml/cid" xmlns:w16="http://schemas.microsoft.com/office/word/2018/wordml" xmlns:w16sdtdh="http://schemas.microsoft.com/office/word/2020/wordml/sdtdatahash" xmlns:w16se="http://schemas.microsoft.com/office/word/2015/wordml/symex" xmlns:wpg="http://schemas.microsoft.com/office/word/2010/wordprocessingGroup" xmlns:wpi="http://schemas.microsoft.com/office/word/2010/wordprocessingInk" xmlns:wne="http://schemas.microsoft.com/office/word/2006/wordml" xmlns:wps="http://schemas.microsoft.com/office/word/2010/wordprocessingShape" mc:Ignorable="w14 w15 w16se w16cid w16 w16cex w16sdtdh wp14">
+<w:numbering xmlns:wpc="http://schemas.microsoft.com/office/word/2010/wordprocessingCanvas" xmlns:cx="http://schemas.microsoft.com/office/drawing/2014/chartex" xmlns:cx1="http://schemas.microsoft.com/office/drawing/2015/9/8/chartex" xmlns:cx2="http://schemas.microsoft.com/office/drawing/2015/10/21/chartex" xmlns:cx3="http://schemas.microsoft.com/office/drawing/2016/5/9/chartex" xmlns:cx4="http://schemas.microsoft.com/office/drawing/2016/5/10/chartex" xmlns:cx5="http://schemas.microsoft.com/office/drawing/2016/5/11/chartex" xmlns:cx6="http://schemas.microsoft.com/office/drawing/2016/5/12/chartex" xmlns:cx7="http://schemas.microsoft.com/office/drawing/2016/5/13/chartex" xmlns:cx8="http://schemas.microsoft.com/office/drawing/2016/5/14/chartex" xmlns:mc="http://schemas.openxmlformats.org/markup-compatibility/2006" xmlns:aink="http://schemas.microsoft.com/office/drawing/2016/ink" xmlns:am3d="http://schemas.microsoft.com/office/drawing/2017/model3d" xmlns:o="urn:schemas-microsoft-com:office:office" xmlns:oel="http://schemas.microsoft.com/office/2019/extlst" xmlns:r="http://schemas.openxmlformats.org/officeDocument/2006/relationships" xmlns:m="http://schemas.openxmlformats.org/officeDocument/2006/math" xmlns:v="urn:schemas-microsoft-com:vml" xmlns:wp14="http://schemas.microsoft.com/office/word/2010/wordprocessingDrawing" xmlns:wp="http://schemas.openxmlformats.org/drawingml/2006/wordprocessingDrawing" xmlns:w10="urn:schemas-microsoft-com:office:word" xmlns:w="http://schemas.openxmlformats.org/wordprocessingml/2006/main" xmlns:w14="http://schemas.microsoft.com/office/word/2010/wordml" xmlns:w15="http://schemas.microsoft.com/office/word/2012/wordml" xmlns:w16cex="http://schemas.microsoft.com/office/word/2018/wordml/cex" xmlns:w16cid="http://schemas.microsoft.com/office/word/2016/wordml/cid" xmlns:w16="http://schemas.microsoft.com/office/word/2018/wordml" xmlns:w16du="http://schemas.microsoft.com/office/word/2023/wordml/word16du" xmlns:w16sdtdh="http://schemas.microsoft.com/office/word/2020/wordml/sdtdatahash" xmlns:w16sdtfl="http://schemas.microsoft.com/office/word/2024/wordml/sdtformatlock" xmlns:w16se="http://schemas.microsoft.com/office/word/2015/wordml/symex" xmlns:wpg="http://schemas.microsoft.com/office/word/2010/wordprocessingGroup" xmlns:wpi="http://schemas.microsoft.com/office/word/2010/wordprocessingInk" xmlns:wne="http://schemas.microsoft.com/office/word/2006/wordml" xmlns:wps="http://schemas.microsoft.com/office/word/2010/wordprocessingShape" mc:Ignorable="w14 w15 w16se w16cid w16 w16cex w16sdtdh w16sdtfl w16du wp14">
   <w:abstractNum w:abstractNumId="0" w15:restartNumberingAfterBreak="0">
     <w:nsid w:val="007B1D9F"/>
     <w:multiLevelType w:val="hybridMultilevel"/>
@@ -3444,6 +3821,119 @@
     </w:lvl>
   </w:abstractNum>
   <w:abstractNum w:abstractNumId="9" w15:restartNumberingAfterBreak="0">
+    <w:nsid w:val="2DBD7530"/>
+    <w:multiLevelType w:val="hybridMultilevel"/>
+    <w:tmpl w:val="A86836B4"/>
+    <w:lvl w:ilvl="0" w:tplc="04190001">
+      <w:start w:val="1"/>
+      <w:numFmt w:val="bullet"/>
+      <w:lvlText w:val=""/>
+      <w:lvlJc w:val="left"/>
+      <w:pPr>
+        <w:ind w:left="720" w:hanging="360"/>
+      </w:pPr>
+      <w:rPr>
+        <w:rFonts w:ascii="Symbol" w:hAnsi="Symbol" w:hint="default"/>
+      </w:rPr>
+    </w:lvl>
+    <w:lvl w:ilvl="1" w:tplc="04190003" w:tentative="1">
+      <w:start w:val="1"/>
+      <w:numFmt w:val="bullet"/>
+      <w:lvlText w:val="o"/>
+      <w:lvlJc w:val="left"/>
+      <w:pPr>
+        <w:ind w:left="1440" w:hanging="360"/>
+      </w:pPr>
+      <w:rPr>
+        <w:rFonts w:ascii="Courier New" w:hAnsi="Courier New" w:cs="Courier New" w:hint="default"/>
+      </w:rPr>
+    </w:lvl>
+    <w:lvl w:ilvl="2" w:tplc="04190005" w:tentative="1">
+      <w:start w:val="1"/>
+      <w:numFmt w:val="bullet"/>
+      <w:lvlText w:val=""/>
+      <w:lvlJc w:val="left"/>
+      <w:pPr>
+        <w:ind w:left="2160" w:hanging="360"/>
+      </w:pPr>
+      <w:rPr>
+        <w:rFonts w:ascii="Wingdings" w:hAnsi="Wingdings" w:hint="default"/>
+      </w:rPr>
+    </w:lvl>
+    <w:lvl w:ilvl="3" w:tplc="04190001" w:tentative="1">
+      <w:start w:val="1"/>
+      <w:numFmt w:val="bullet"/>
+      <w:lvlText w:val=""/>
+      <w:lvlJc w:val="left"/>
+      <w:pPr>
+        <w:ind w:left="2880" w:hanging="360"/>
+      </w:pPr>
+      <w:rPr>
+        <w:rFonts w:ascii="Symbol" w:hAnsi="Symbol" w:hint="default"/>
+      </w:rPr>
+    </w:lvl>
+    <w:lvl w:ilvl="4" w:tplc="04190003" w:tentative="1">
+      <w:start w:val="1"/>
+      <w:numFmt w:val="bullet"/>
+      <w:lvlText w:val="o"/>
+      <w:lvlJc w:val="left"/>
+      <w:pPr>
+        <w:ind w:left="3600" w:hanging="360"/>
+      </w:pPr>
+      <w:rPr>
+        <w:rFonts w:ascii="Courier New" w:hAnsi="Courier New" w:cs="Courier New" w:hint="default"/>
+      </w:rPr>
+    </w:lvl>
+    <w:lvl w:ilvl="5" w:tplc="04190005" w:tentative="1">
+      <w:start w:val="1"/>
+      <w:numFmt w:val="bullet"/>
+      <w:lvlText w:val=""/>
+      <w:lvlJc w:val="left"/>
+      <w:pPr>
+        <w:ind w:left="4320" w:hanging="360"/>
+      </w:pPr>
+      <w:rPr>
+        <w:rFonts w:ascii="Wingdings" w:hAnsi="Wingdings" w:hint="default"/>
+      </w:rPr>
+    </w:lvl>
+    <w:lvl w:ilvl="6" w:tplc="04190001" w:tentative="1">
+      <w:start w:val="1"/>
+      <w:numFmt w:val="bullet"/>
+      <w:lvlText w:val=""/>
+      <w:lvlJc w:val="left"/>
+      <w:pPr>
+        <w:ind w:left="5040" w:hanging="360"/>
+      </w:pPr>
+      <w:rPr>
+        <w:rFonts w:ascii="Symbol" w:hAnsi="Symbol" w:hint="default"/>
+      </w:rPr>
+    </w:lvl>
+    <w:lvl w:ilvl="7" w:tplc="04190003" w:tentative="1">
+      <w:start w:val="1"/>
+      <w:numFmt w:val="bullet"/>
+      <w:lvlText w:val="o"/>
+      <w:lvlJc w:val="left"/>
+      <w:pPr>
+        <w:ind w:left="5760" w:hanging="360"/>
+      </w:pPr>
+      <w:rPr>
+        <w:rFonts w:ascii="Courier New" w:hAnsi="Courier New" w:cs="Courier New" w:hint="default"/>
+      </w:rPr>
+    </w:lvl>
+    <w:lvl w:ilvl="8" w:tplc="04190005" w:tentative="1">
+      <w:start w:val="1"/>
+      <w:numFmt w:val="bullet"/>
+      <w:lvlText w:val=""/>
+      <w:lvlJc w:val="left"/>
+      <w:pPr>
+        <w:ind w:left="6480" w:hanging="360"/>
+      </w:pPr>
+      <w:rPr>
+        <w:rFonts w:ascii="Wingdings" w:hAnsi="Wingdings" w:hint="default"/>
+      </w:rPr>
+    </w:lvl>
+  </w:abstractNum>
+  <w:abstractNum w:abstractNumId="10" w15:restartNumberingAfterBreak="0">
     <w:nsid w:val="30D93CB6"/>
     <w:multiLevelType w:val="hybridMultilevel"/>
     <w:tmpl w:val="9650FD36"/>
@@ -3556,7 +4046,7 @@
       </w:rPr>
     </w:lvl>
   </w:abstractNum>
-  <w:abstractNum w:abstractNumId="10" w15:restartNumberingAfterBreak="0">
+  <w:abstractNum w:abstractNumId="11" w15:restartNumberingAfterBreak="0">
     <w:nsid w:val="33BB5BC5"/>
     <w:multiLevelType w:val="hybridMultilevel"/>
     <w:tmpl w:val="AF142BDA"/>
@@ -3669,7 +4159,7 @@
       </w:rPr>
     </w:lvl>
   </w:abstractNum>
-  <w:abstractNum w:abstractNumId="11" w15:restartNumberingAfterBreak="0">
+  <w:abstractNum w:abstractNumId="12" w15:restartNumberingAfterBreak="0">
     <w:nsid w:val="365F0BD8"/>
     <w:multiLevelType w:val="hybridMultilevel"/>
     <w:tmpl w:val="3EFEDF4E"/>
@@ -3755,7 +4245,7 @@
       </w:pPr>
     </w:lvl>
   </w:abstractNum>
-  <w:abstractNum w:abstractNumId="12" w15:restartNumberingAfterBreak="0">
+  <w:abstractNum w:abstractNumId="13" w15:restartNumberingAfterBreak="0">
     <w:nsid w:val="495A4B55"/>
     <w:multiLevelType w:val="hybridMultilevel"/>
     <w:tmpl w:val="5D3C45EE"/>
@@ -3841,7 +4331,7 @@
       </w:pPr>
     </w:lvl>
   </w:abstractNum>
-  <w:abstractNum w:abstractNumId="13" w15:restartNumberingAfterBreak="0">
+  <w:abstractNum w:abstractNumId="14" w15:restartNumberingAfterBreak="0">
     <w:nsid w:val="4A5E3F41"/>
     <w:multiLevelType w:val="hybridMultilevel"/>
     <w:tmpl w:val="E6362F96"/>
@@ -3927,7 +4417,7 @@
       </w:pPr>
     </w:lvl>
   </w:abstractNum>
-  <w:abstractNum w:abstractNumId="14" w15:restartNumberingAfterBreak="0">
+  <w:abstractNum w:abstractNumId="15" w15:restartNumberingAfterBreak="0">
     <w:nsid w:val="602711F1"/>
     <w:multiLevelType w:val="hybridMultilevel"/>
     <w:tmpl w:val="419C824C"/>
@@ -4040,7 +4530,7 @@
       </w:rPr>
     </w:lvl>
   </w:abstractNum>
-  <w:abstractNum w:abstractNumId="15" w15:restartNumberingAfterBreak="0">
+  <w:abstractNum w:abstractNumId="16" w15:restartNumberingAfterBreak="0">
     <w:nsid w:val="6762654E"/>
     <w:multiLevelType w:val="hybridMultilevel"/>
     <w:tmpl w:val="793EC6A2"/>
@@ -4126,7 +4616,7 @@
       </w:pPr>
     </w:lvl>
   </w:abstractNum>
-  <w:abstractNum w:abstractNumId="16" w15:restartNumberingAfterBreak="0">
+  <w:abstractNum w:abstractNumId="17" w15:restartNumberingAfterBreak="0">
     <w:nsid w:val="676B44D3"/>
     <w:multiLevelType w:val="hybridMultilevel"/>
     <w:tmpl w:val="2B0A6368"/>
@@ -4212,7 +4702,7 @@
       </w:pPr>
     </w:lvl>
   </w:abstractNum>
-  <w:abstractNum w:abstractNumId="17" w15:restartNumberingAfterBreak="0">
+  <w:abstractNum w:abstractNumId="18" w15:restartNumberingAfterBreak="0">
     <w:nsid w:val="69163EDA"/>
     <w:multiLevelType w:val="hybridMultilevel"/>
     <w:tmpl w:val="4A88CE88"/>
@@ -4301,7 +4791,7 @@
       </w:pPr>
     </w:lvl>
   </w:abstractNum>
-  <w:abstractNum w:abstractNumId="18" w15:restartNumberingAfterBreak="0">
+  <w:abstractNum w:abstractNumId="19" w15:restartNumberingAfterBreak="0">
     <w:nsid w:val="6ABF7B7A"/>
     <w:multiLevelType w:val="hybridMultilevel"/>
     <w:tmpl w:val="A6C43B9C"/>
@@ -4387,7 +4877,7 @@
       </w:pPr>
     </w:lvl>
   </w:abstractNum>
-  <w:abstractNum w:abstractNumId="19" w15:restartNumberingAfterBreak="0">
+  <w:abstractNum w:abstractNumId="20" w15:restartNumberingAfterBreak="0">
     <w:nsid w:val="6EB7273F"/>
     <w:multiLevelType w:val="hybridMultilevel"/>
     <w:tmpl w:val="9C6C6662"/>
@@ -4500,7 +4990,7 @@
       </w:rPr>
     </w:lvl>
   </w:abstractNum>
-  <w:abstractNum w:abstractNumId="20" w15:restartNumberingAfterBreak="0">
+  <w:abstractNum w:abstractNumId="21" w15:restartNumberingAfterBreak="0">
     <w:nsid w:val="72A147EC"/>
     <w:multiLevelType w:val="hybridMultilevel"/>
     <w:tmpl w:val="CF6E5AE2"/>
@@ -4613,7 +5103,7 @@
       </w:rPr>
     </w:lvl>
   </w:abstractNum>
-  <w:abstractNum w:abstractNumId="21" w15:restartNumberingAfterBreak="0">
+  <w:abstractNum w:abstractNumId="22" w15:restartNumberingAfterBreak="0">
     <w:nsid w:val="72FE4C06"/>
     <w:multiLevelType w:val="hybridMultilevel"/>
     <w:tmpl w:val="486EF68C"/>
@@ -4702,7 +5192,7 @@
       </w:pPr>
     </w:lvl>
   </w:abstractNum>
-  <w:abstractNum w:abstractNumId="22" w15:restartNumberingAfterBreak="0">
+  <w:abstractNum w:abstractNumId="23" w15:restartNumberingAfterBreak="0">
     <w:nsid w:val="7A4D376A"/>
     <w:multiLevelType w:val="hybridMultilevel"/>
     <w:tmpl w:val="23B8BCC0"/>
@@ -4815,7 +5305,7 @@
       </w:rPr>
     </w:lvl>
   </w:abstractNum>
-  <w:abstractNum w:abstractNumId="23" w15:restartNumberingAfterBreak="0">
+  <w:abstractNum w:abstractNumId="24" w15:restartNumberingAfterBreak="0">
     <w:nsid w:val="7BAD6DD1"/>
     <w:multiLevelType w:val="hybridMultilevel"/>
     <w:tmpl w:val="52D411E0"/>
@@ -4938,55 +5428,55 @@
     <w:abstractNumId w:val="6"/>
   </w:num>
   <w:num w:numId="4" w16cid:durableId="982395125">
-    <w:abstractNumId w:val="16"/>
+    <w:abstractNumId w:val="17"/>
   </w:num>
   <w:num w:numId="5" w16cid:durableId="569652063">
-    <w:abstractNumId w:val="23"/>
+    <w:abstractNumId w:val="24"/>
   </w:num>
   <w:num w:numId="6" w16cid:durableId="285238671">
-    <w:abstractNumId w:val="20"/>
+    <w:abstractNumId w:val="21"/>
   </w:num>
   <w:num w:numId="7" w16cid:durableId="707418584">
     <w:abstractNumId w:val="0"/>
   </w:num>
   <w:num w:numId="8" w16cid:durableId="1898778269">
-    <w:abstractNumId w:val="12"/>
+    <w:abstractNumId w:val="13"/>
   </w:num>
   <w:num w:numId="9" w16cid:durableId="1883907230">
-    <w:abstractNumId w:val="22"/>
+    <w:abstractNumId w:val="23"/>
   </w:num>
   <w:num w:numId="10" w16cid:durableId="505248592">
-    <w:abstractNumId w:val="19"/>
+    <w:abstractNumId w:val="20"/>
   </w:num>
   <w:num w:numId="11" w16cid:durableId="365298338">
-    <w:abstractNumId w:val="11"/>
+    <w:abstractNumId w:val="12"/>
   </w:num>
   <w:num w:numId="12" w16cid:durableId="2068915188">
     <w:abstractNumId w:val="3"/>
   </w:num>
   <w:num w:numId="13" w16cid:durableId="1250038190">
-    <w:abstractNumId w:val="18"/>
+    <w:abstractNumId w:val="19"/>
   </w:num>
   <w:num w:numId="14" w16cid:durableId="681972936">
-    <w:abstractNumId w:val="15"/>
+    <w:abstractNumId w:val="16"/>
   </w:num>
   <w:num w:numId="15" w16cid:durableId="271285448">
     <w:abstractNumId w:val="2"/>
   </w:num>
   <w:num w:numId="16" w16cid:durableId="335958602">
-    <w:abstractNumId w:val="10"/>
+    <w:abstractNumId w:val="11"/>
   </w:num>
   <w:num w:numId="17" w16cid:durableId="1304653646">
-    <w:abstractNumId w:val="14"/>
+    <w:abstractNumId w:val="15"/>
   </w:num>
   <w:num w:numId="18" w16cid:durableId="358818155">
-    <w:abstractNumId w:val="13"/>
+    <w:abstractNumId w:val="14"/>
   </w:num>
   <w:num w:numId="19" w16cid:durableId="597563379">
     <w:abstractNumId w:val="1"/>
   </w:num>
   <w:num w:numId="20" w16cid:durableId="1872306350">
-    <w:abstractNumId w:val="21"/>
+    <w:abstractNumId w:val="22"/>
   </w:num>
   <w:num w:numId="21" w16cid:durableId="1774007673">
     <w:abstractNumId w:val="7"/>
@@ -4995,16 +5485,19 @@
     <w:abstractNumId w:val="8"/>
   </w:num>
   <w:num w:numId="23" w16cid:durableId="1770545881">
-    <w:abstractNumId w:val="17"/>
+    <w:abstractNumId w:val="18"/>
   </w:num>
   <w:num w:numId="24" w16cid:durableId="912155482">
+    <w:abstractNumId w:val="10"/>
+  </w:num>
+  <w:num w:numId="25" w16cid:durableId="1588810488">
     <w:abstractNumId w:val="9"/>
   </w:num>
 </w:numbering>
 </file>
 
 <file path=word/styles.xml><?xml version="1.0" encoding="utf-8"?>
-<w:styles xmlns:mc="http://schemas.openxmlformats.org/markup-compatibility/2006" xmlns:r="http://schemas.openxmlformats.org/officeDocument/2006/relationships" xmlns:w="http://schemas.openxmlformats.org/wordprocessingml/2006/main" xmlns:w14="http://schemas.microsoft.com/office/word/2010/wordml" xmlns:w15="http://schemas.microsoft.com/office/word/2012/wordml" xmlns:w16cex="http://schemas.microsoft.com/office/word/2018/wordml/cex" xmlns:w16cid="http://schemas.microsoft.com/office/word/2016/wordml/cid" xmlns:w16="http://schemas.microsoft.com/office/word/2018/wordml" xmlns:w16sdtdh="http://schemas.microsoft.com/office/word/2020/wordml/sdtdatahash" xmlns:w16se="http://schemas.microsoft.com/office/word/2015/wordml/symex" mc:Ignorable="w14 w15 w16se w16cid w16 w16cex w16sdtdh">
+<w:styles xmlns:mc="http://schemas.openxmlformats.org/markup-compatibility/2006" xmlns:r="http://schemas.openxmlformats.org/officeDocument/2006/relationships" xmlns:w="http://schemas.openxmlformats.org/wordprocessingml/2006/main" xmlns:w14="http://schemas.microsoft.com/office/word/2010/wordml" xmlns:w15="http://schemas.microsoft.com/office/word/2012/wordml" xmlns:w16cex="http://schemas.microsoft.com/office/word/2018/wordml/cex" xmlns:w16cid="http://schemas.microsoft.com/office/word/2016/wordml/cid" xmlns:w16="http://schemas.microsoft.com/office/word/2018/wordml" xmlns:w16du="http://schemas.microsoft.com/office/word/2023/wordml/word16du" xmlns:w16sdtdh="http://schemas.microsoft.com/office/word/2020/wordml/sdtdatahash" xmlns:w16sdtfl="http://schemas.microsoft.com/office/word/2024/wordml/sdtformatlock" xmlns:w16se="http://schemas.microsoft.com/office/word/2015/wordml/symex" mc:Ignorable="w14 w15 w16se w16cid w16 w16cex w16sdtdh w16sdtfl w16du">
   <w:docDefaults>
     <w:rPrDefault>
       <w:rPr>

</xml_diff>